<commit_message>
fix(p6): rebuild IBR blinded docx with k=238/K=288 corrections and PRISMA fixes
Docx was stale — predated commits b560ded (remove fabricated PRISMA numbers),
0372e73 (K=385→285), 0f66d1a/a95ed29 (k=235→238, K=288). Rebuilt with
--resource-path pointing to p6/figures so all 5 figures render correctly.

https://claude.ai/code/session_01GMFmEtt6FYiJ4MKzBNCLqb
</commit_message>
<xml_diff>
--- a/p6/submission/ibr_package/01_manuscript_blinded.docx
+++ b/p6/submission/ibr_package/01_manuscript_blinded.docx
@@ -2,7 +2,7 @@
 <file path=word/document.xml><?xml version="1.0" encoding="utf-8"?>
 <w:document xmlns:w="http://schemas.openxmlformats.org/wordprocessingml/2006/main" xmlns:m="http://schemas.openxmlformats.org/officeDocument/2006/math" xmlns:r="http://schemas.openxmlformats.org/officeDocument/2006/relationships" xmlns:o="urn:schemas-microsoft-com:office:office" xmlns:v="urn:schemas-microsoft-com:vml" xmlns:w10="urn:schemas-microsoft-com:office:word" xmlns:a="http://schemas.openxmlformats.org/drawingml/2006/main" xmlns:pic="http://schemas.openxmlformats.org/drawingml/2006/picture" xmlns:wp="http://schemas.openxmlformats.org/drawingml/2006/wordprocessingDrawing">
   <w:body>
-    <w:bookmarkStart w:id="77" w:name="X0c6e4d0da10b64d0e26e4f46cdf4d61de6495dd"/>
+    <w:bookmarkStart w:id="75" w:name="X0c6e4d0da10b64d0e26e4f46cdf4d61de6495dd"/>
     <w:p>
       <w:pPr>
         <w:pStyle w:val="Heading1"/>
@@ -17,22 +17,14 @@
       </w:pPr>
       <w:r>
         <w:rPr>
-          <w:bCs/>
-          <w:b/>
-        </w:rPr>
-        <w:t xml:space="preserve">Phan Anh Tú</w:t>
-      </w:r>
-      <w:r>
-        <w:t xml:space="preserve"> </w:t>
-      </w:r>
-      <w:r>
-        <w:t xml:space="preserve">· Can Tho University</w:t>
-      </w:r>
-    </w:p>
-    <w:p>
-      <w:pPr>
-        <w:pStyle w:val="BodyText"/>
-      </w:pPr>
+          <w:iCs/>
+          <w:i/>
+        </w:rPr>
+        <w:t xml:space="preserve">Manuscript prepared for: International Business Review (IBR, Elsevier, IF ≈ 5.5, ABS-3)</w:t>
+      </w:r>
+      <w:r>
+        <w:t xml:space="preserve"> </w:t>
+      </w:r>
       <w:r>
         <w:rPr>
           <w:iCs/>
@@ -104,7 +96,23 @@
         <w:t xml:space="preserve"> </w:t>
       </w:r>
       <w:r>
-        <w:t xml:space="preserve">= 235 studies with approximately 385 effect sizes. Three-level MARA (Cheung, 2014; Van den Noortgate et al., 2013) decomposes heterogeneity into within-study (</w:t>
+        <w:t xml:space="preserve">= 238 studies with</w:t>
+      </w:r>
+      <w:r>
+        <w:t xml:space="preserve"> </w:t>
+      </w:r>
+      <w:r>
+        <w:rPr>
+          <w:iCs/>
+          <w:i/>
+        </w:rPr>
+        <w:t xml:space="preserve">K</w:t>
+      </w:r>
+      <w:r>
+        <w:t xml:space="preserve"> </w:t>
+      </w:r>
+      <w:r>
+        <w:t xml:space="preserve">= 288 effect sizes. Three-level MARA (Cheung, 2014; Van den Noortgate et al., 2013) decomposes heterogeneity into within-study (</w:t>
       </w:r>
       <w:r>
         <w:rPr>
@@ -582,7 +590,7 @@
         <w:t xml:space="preserve"> </w:t>
       </w:r>
       <w:r>
-        <w:t xml:space="preserve">= 235, combined with three-level MARA that decomposes heterogeneity beyond what random-effects models allow.</w:t>
+        <w:t xml:space="preserve">= 238, combined with three-level MARA that decomposes heterogeneity beyond what random-effects models allow.</w:t>
       </w:r>
     </w:p>
     <w:p>
@@ -1679,7 +1687,7 @@
         <w:t xml:space="preserve"> </w:t>
       </w:r>
       <w:r>
-        <w:t xml:space="preserve">Solid arrows represent the primary meta-analytic effect (baseline I→P pooled effect, k = 235, K = 285 effects, r̄ = 0.075, 95% CI [0.061, 0.089]). Dashed arrows represent hypothesised moderating relationships. Three study-level constructs moderate the pooled I→P effect: (1) ICRV Regime (H1) — five-regime gradient (Advanced I through Frontier V) grounded in Capability–Institution Mismatch Theory (CIMT); predicts Advanced &gt; Emerging &gt; Frontier gradient in Q_M(ICRV). (2) cDAI — Country Digital Adoption Index (H3) — continuous meta-regression moderator; predicts cDAI amplifies I→P (β &gt; 0). (3) DPL Phase (H2) — Digital Paradox Lifecycle classification (Precede/Span/Follow, inflection ≈ 2009); predicts Follow &gt; Span &gt; Precede ordering. The three-level model nests K = 285 effects within k = 235 studies (σ²_within = 0.00878, I²_(2) = 54.1%) within between-study heterogeneity (σ²_between = 0.00136, I²_(3) = 8.4%); total I² = 62.5%. Publication bias (H4) is tested via Egger's regression, trim-and-fill, and PET-PEESE — shown as a downstream diagnostic, not a moderator. (+) indicates hypothesised positive association; (−) indicates hypothesised negative association. Abbreviations: ICRV = Innovation–Capability–Resource–Vulnerability; cDAI = country-level Digital Adoption Index; DPL = Digital Paradox Lifecycle; MARA = Meta-Analytic Regression Analysis. Target journal:</w:t>
+        <w:t xml:space="preserve">Solid arrows represent the primary meta-analytic effect (baseline I→P pooled effect, k = 238, K = 288 effects, r̄ = 0.075, 95% CI [0.061, 0.089]; pre-formal-search simulation estimates). Dashed arrows represent hypothesised moderating relationships. Three study-level constructs moderate the pooled I→P effect: (1) ICRV Regime (H1) — six-regime gradient (Advanced I through Frontier V) grounded in Capability–Institution Mismatch Theory (CIMT); predicts Advanced &gt; Emerging &gt; Frontier gradient in Q_M(ICRV). (2) cDAI — Country Digital Adoption Index (H3) — continuous meta-regression moderator; predicts cDAI amplifies I→P (β &gt; 0). (3) DPL Phase (H2) — Digital Paradox Lifecycle classification (Precede/Span/Follow, inflection ≈ 2009); predicts Follow &gt; Span &gt; Precede ordering. The three-level model nests K = 288 effects within k = 238 studies (σ²_within = 0.00878, I²_(2) = 54.1%) within between-study heterogeneity (σ²_between = 0.00136, I²_(3) = 8.4%); total I² = 62.5%. Publication bias (H4) is tested via Egger's regression, trim-and-fill, and PET-PEESE — shown as a downstream diagnostic, not a moderator. (+) indicates hypothesised positive association; (−) indicates hypothesised negative association. Abbreviations: ICRV = Innovation–Capability–Resource–Vulnerability; cDAI = country-level Digital Adoption Index; DPL = Digital Paradox Lifecycle; MARA = Meta-Analytic Regression Analysis. Target journal:</w:t>
       </w:r>
       <w:r>
         <w:t xml:space="preserve"> </w:t>
@@ -1707,7 +1715,7 @@
     </w:p>
     <w:bookmarkEnd w:id="30"/>
     <w:bookmarkEnd w:id="31"/>
-    <w:bookmarkStart w:id="42" w:name="Xeae2dc85413e447d2c08d145b986cffc1f454f7"/>
+    <w:bookmarkStart w:id="41" w:name="Xeae2dc85413e447d2c08d145b986cffc1f454f7"/>
     <w:p>
       <w:pPr>
         <w:pStyle w:val="Heading2"/>
@@ -2336,11 +2344,121 @@
         <w:t xml:space="preserve"> </w:t>
       </w:r>
       <w:r>
-        <w:t xml:space="preserve">Records identified (WoS + Scopus): 4,812 → After automated deduplication (Endnote X21): 3,104 → Title/abstract screen (two coders; κ = 0.79): 892 retained → Full-text assessment: 312 retained → Effect size extractable: 235 studies (≈ 385 effects). Detailed exclusion reasons at the full-text stage are reported in Appendix A.</w:t>
+        <w:t xml:space="preserve">Records identified from electronic databases (WoS + Scopus): [</w:t>
+      </w:r>
+      <w:r>
+        <w:rPr>
+          <w:iCs/>
+          <w:i/>
+        </w:rPr>
+        <w:t xml:space="preserve">n</w:t>
+      </w:r>
+      <w:r>
+        <w:t xml:space="preserve"> </w:t>
+      </w:r>
+      <w:r>
+        <w:t xml:space="preserve">= TBD] → After automated deduplication: [</w:t>
+      </w:r>
+      <w:r>
+        <w:rPr>
+          <w:iCs/>
+          <w:i/>
+        </w:rPr>
+        <w:t xml:space="preserve">n</w:t>
+      </w:r>
+      <w:r>
+        <w:t xml:space="preserve"> </w:t>
+      </w:r>
+      <w:r>
+        <w:t xml:space="preserve">= TBD] → Title/abstract screen (two independent coders): [</w:t>
+      </w:r>
+      <w:r>
+        <w:rPr>
+          <w:iCs/>
+          <w:i/>
+        </w:rPr>
+        <w:t xml:space="preserve">n</w:t>
+      </w:r>
+      <w:r>
+        <w:t xml:space="preserve"> </w:t>
+      </w:r>
+      <w:r>
+        <w:t xml:space="preserve">= TBD] retained → Full-text eligibility assessment: [</w:t>
+      </w:r>
+      <w:r>
+        <w:rPr>
+          <w:iCs/>
+          <w:i/>
+        </w:rPr>
+        <w:t xml:space="preserve">n</w:t>
+      </w:r>
+      <w:r>
+        <w:t xml:space="preserve"> </w:t>
+      </w:r>
+      <w:r>
+        <w:t xml:space="preserve">= TBD] assessed → Effect size extractable and meeting all eligibility criteria: [</w:t>
+      </w:r>
+      <w:r>
+        <w:rPr>
+          <w:iCs/>
+          <w:i/>
+        </w:rPr>
+        <w:t xml:space="preserve">k</w:t>
+      </w:r>
+      <w:r>
+        <w:t xml:space="preserve"> </w:t>
+      </w:r>
+      <w:r>
+        <w:t xml:space="preserve">= TBD studies;</w:t>
+      </w:r>
+      <w:r>
+        <w:t xml:space="preserve"> </w:t>
+      </w:r>
+      <w:r>
+        <w:rPr>
+          <w:iCs/>
+          <w:i/>
+        </w:rPr>
+        <w:t xml:space="preserve">K</w:t>
+      </w:r>
+      <w:r>
+        <w:t xml:space="preserve"> </w:t>
+      </w:r>
+      <w:r>
+        <w:t xml:space="preserve">= TBD effect sizes]. Detailed exclusion reasons at each screening stage are reported in Appendix A (PRISMA 2020 flow diagram). The current working database (</w:t>
+      </w:r>
+      <w:r>
+        <w:rPr>
+          <w:iCs/>
+          <w:i/>
+        </w:rPr>
+        <w:t xml:space="preserve">k</w:t>
+      </w:r>
+      <w:r>
+        <w:t xml:space="preserve"> </w:t>
+      </w:r>
+      <w:r>
+        <w:t xml:space="preserve">= 238 coded studies;</w:t>
+      </w:r>
+      <w:r>
+        <w:t xml:space="preserve"> </w:t>
+      </w:r>
+      <w:r>
+        <w:rPr>
+          <w:iCs/>
+          <w:i/>
+        </w:rPr>
+        <w:t xml:space="preserve">K</w:t>
+      </w:r>
+      <w:r>
+        <w:t xml:space="preserve"> </w:t>
+      </w:r>
+      <w:r>
+        <w:t xml:space="preserve">= 288 effect sizes) was assembled from backward citation screening and hand-search prior to the formal database search; all counts will be updated to confirmed figures after the formal WoS/Scopus search is completed.</w:t>
       </w:r>
     </w:p>
     <w:bookmarkEnd w:id="33"/>
-    <w:bookmarkStart w:id="37" w:name="X1d41e663e785934d4feadbd21b81f03c51339a8"/>
+    <w:bookmarkStart w:id="36" w:name="X1d41e663e785934d4feadbd21b81f03c51339a8"/>
     <w:p>
       <w:pPr>
         <w:pStyle w:val="Heading3"/>
@@ -2349,13 +2467,13 @@
         <w:t xml:space="preserve">3.3 Data Extraction and Quality Assurance</w:t>
       </w:r>
     </w:p>
-    <w:bookmarkStart w:id="34" w:name="Xd58ca61430dc174d9f4cb9b3d2a6ad9bf93e040"/>
+    <w:bookmarkStart w:id="34" w:name="X08ffec85c6ae73d1d7d5bae8230a193cc0c32b0"/>
     <w:p>
       <w:pPr>
         <w:pStyle w:val="Heading4"/>
       </w:pPr>
       <w:r>
-        <w:t xml:space="preserve">3.3.1 Automated Statistical Extraction (M-AIDA v7.0)</w:t>
+        <w:t xml:space="preserve">3.3.1 Effect-Size Extraction Protocol</w:t>
       </w:r>
     </w:p>
     <w:p>
@@ -2363,7 +2481,7 @@
         <w:pStyle w:val="FirstParagraph"/>
       </w:pPr>
       <w:r>
-        <w:t xml:space="preserve">Statistical parameters were extracted using M-AIDA v7.0 (Meta-Analysis Intelligent Data Assistant; Do, 2025), a purpose-built semi-automated extraction system developed for IB meta-analysis. M-AIDA v7.0 integrates a large language model (LLM) inference engine with a domain-specific prompt architecture calibrated to the statistical reporting conventions of leading IB journals (JIBS, JWB, IBR, MIR). The system accepts PDF input and returns structured parameter objects containing: sample size (</w:t>
+        <w:t xml:space="preserve">Statistical parameters were extracted manually from the full text of each eligible study by the primary coder (PI: [Author]), using the standardized coding form specified in Appendix B. For each study, the following parameters were recorded: sample size (</w:t>
       </w:r>
       <w:r>
         <w:rPr>
@@ -2373,7 +2491,7 @@
         <w:t xml:space="preserve">N</w:t>
       </w:r>
       <w:r>
-        <w:t xml:space="preserve">), Pearson's</w:t>
+        <w:t xml:space="preserve">), the focal I→P effect size (Pearson's</w:t>
       </w:r>
       <w:r>
         <w:t xml:space="preserve"> </w:t>
@@ -2389,7 +2507,57 @@
         <w:t xml:space="preserve"> </w:t>
       </w:r>
       <w:r>
-        <w:t xml:space="preserve">(direct or converted),</w:t>
+        <w:t xml:space="preserve">or the convertible statistic), study data-year range, country or region, DOI operationalization, performance operationalization, and any study-specific features relevant to moderator coding.</w:t>
+      </w:r>
+    </w:p>
+    <w:p>
+      <w:pPr>
+        <w:pStyle w:val="BodyText"/>
+      </w:pPr>
+      <w:r>
+        <w:rPr>
+          <w:bCs/>
+          <w:b/>
+        </w:rPr>
+        <w:t xml:space="preserve">Effect-size conversion hierarchy.</w:t>
+      </w:r>
+      <w:r>
+        <w:t xml:space="preserve"> </w:t>
+      </w:r>
+      <w:r>
+        <w:t xml:space="preserve">When Pearson's</w:t>
+      </w:r>
+      <w:r>
+        <w:t xml:space="preserve"> </w:t>
+      </w:r>
+      <w:r>
+        <w:rPr>
+          <w:iCs/>
+          <w:i/>
+        </w:rPr>
+        <w:t xml:space="preserve">r</w:t>
+      </w:r>
+      <w:r>
+        <w:t xml:space="preserve"> </w:t>
+      </w:r>
+      <w:r>
+        <w:t xml:space="preserve">was not reported directly, the following conversion sequence was applied in order of statistical precision: (i)</w:t>
+      </w:r>
+      <w:r>
+        <w:t xml:space="preserve"> </w:t>
+      </w:r>
+      <w:r>
+        <w:rPr>
+          <w:iCs/>
+          <w:i/>
+        </w:rPr>
+        <w:t xml:space="preserve">r</w:t>
+      </w:r>
+      <w:r>
+        <w:t xml:space="preserve"> </w:t>
+      </w:r>
+      <w:r>
+        <w:t xml:space="preserve">from</w:t>
       </w:r>
       <w:r>
         <w:t xml:space="preserve"> </w:t>
@@ -2402,7 +2570,145 @@
         <w:t xml:space="preserve">t</w:t>
       </w:r>
       <w:r>
-        <w:t xml:space="preserve">-statistic, regression coefficient (β), degrees of freedom (</w:t>
+        <w:t xml:space="preserve">-statistic:</w:t>
+      </w:r>
+      <w:r>
+        <w:t xml:space="preserve"> </w:t>
+      </w:r>
+      <m:oMath>
+        <m:r>
+          <m:t>r</m:t>
+        </m:r>
+        <m:r>
+          <m:rPr>
+            <m:sty m:val="p"/>
+          </m:rPr>
+          <m:t>=</m:t>
+        </m:r>
+        <m:rad>
+          <m:radPr>
+            <m:degHide m:val="on"/>
+          </m:radPr>
+          <m:deg/>
+          <m:e>
+            <m:sSup>
+              <m:e>
+                <m:r>
+                  <m:t>t</m:t>
+                </m:r>
+              </m:e>
+              <m:sup>
+                <m:r>
+                  <m:t>2</m:t>
+                </m:r>
+              </m:sup>
+            </m:sSup>
+            <m:r>
+              <m:rPr>
+                <m:sty m:val="p"/>
+              </m:rPr>
+              <m:t>/</m:t>
+            </m:r>
+            <m:d>
+              <m:dPr>
+                <m:begChr m:val="("/>
+                <m:endChr m:val=")"/>
+                <m:sepChr m:val=""/>
+                <m:grow/>
+              </m:dPr>
+              <m:e>
+                <m:sSup>
+                  <m:e>
+                    <m:r>
+                      <m:t>t</m:t>
+                    </m:r>
+                  </m:e>
+                  <m:sup>
+                    <m:r>
+                      <m:t>2</m:t>
+                    </m:r>
+                  </m:sup>
+                </m:sSup>
+                <m:r>
+                  <m:rPr>
+                    <m:sty m:val="p"/>
+                  </m:rPr>
+                  <m:t>+</m:t>
+                </m:r>
+                <m:r>
+                  <m:t>d</m:t>
+                </m:r>
+                <m:r>
+                  <m:t>f</m:t>
+                </m:r>
+              </m:e>
+            </m:d>
+          </m:e>
+        </m:rad>
+      </m:oMath>
+      <w:r>
+        <w:t xml:space="preserve"> </w:t>
+      </w:r>
+      <w:r>
+        <w:t xml:space="preserve">(Cohen, 1988); (ii)</w:t>
+      </w:r>
+      <w:r>
+        <w:t xml:space="preserve"> </w:t>
+      </w:r>
+      <w:r>
+        <w:rPr>
+          <w:iCs/>
+          <w:i/>
+        </w:rPr>
+        <w:t xml:space="preserve">r</w:t>
+      </w:r>
+      <w:r>
+        <w:t xml:space="preserve">_partial from standardized regression β:</w:t>
+      </w:r>
+      <w:r>
+        <w:t xml:space="preserve"> </w:t>
+      </w:r>
+      <w:r>
+        <w:rPr>
+          <w:iCs/>
+          <w:i/>
+        </w:rPr>
+        <w:t xml:space="preserve">r</w:t>
+      </w:r>
+      <w:r>
+        <w:t xml:space="preserve">_partial = β × 0.98 (Peterson &amp; Brown, 2005); (iii)</w:t>
+      </w:r>
+      <w:r>
+        <w:t xml:space="preserve"> </w:t>
+      </w:r>
+      <w:r>
+        <w:rPr>
+          <w:iCs/>
+          <w:i/>
+        </w:rPr>
+        <w:t xml:space="preserve">r</w:t>
+      </w:r>
+      <w:r>
+        <w:t xml:space="preserve"> </w:t>
+      </w:r>
+      <w:r>
+        <w:t xml:space="preserve">from</w:t>
+      </w:r>
+      <w:r>
+        <w:t xml:space="preserve"> </w:t>
+      </w:r>
+      <w:r>
+        <w:rPr>
+          <w:iCs/>
+          <w:i/>
+        </w:rPr>
+        <w:t xml:space="preserve">F</w:t>
+      </w:r>
+      <w:r>
+        <w:t xml:space="preserve">-statistic with</w:t>
+      </w:r>
+      <w:r>
+        <w:t xml:space="preserve"> </w:t>
       </w:r>
       <w:r>
         <w:rPr>
@@ -2412,7 +2718,107 @@
         <w:t xml:space="preserve">df</w:t>
       </w:r>
       <w:r>
-        <w:t xml:space="preserve">),</w:t>
+        <w:t xml:space="preserve">₁ = 1:</w:t>
+      </w:r>
+      <w:r>
+        <w:t xml:space="preserve"> </w:t>
+      </w:r>
+      <m:oMath>
+        <m:r>
+          <m:t>r</m:t>
+        </m:r>
+        <m:r>
+          <m:rPr>
+            <m:sty m:val="p"/>
+          </m:rPr>
+          <m:t>=</m:t>
+        </m:r>
+        <m:rad>
+          <m:radPr>
+            <m:degHide m:val="on"/>
+          </m:radPr>
+          <m:deg/>
+          <m:e>
+            <m:r>
+              <m:t>F</m:t>
+            </m:r>
+            <m:r>
+              <m:rPr>
+                <m:sty m:val="p"/>
+              </m:rPr>
+              <m:t>/</m:t>
+            </m:r>
+            <m:d>
+              <m:dPr>
+                <m:begChr m:val="("/>
+                <m:endChr m:val=")"/>
+                <m:sepChr m:val=""/>
+                <m:grow/>
+              </m:dPr>
+              <m:e>
+                <m:r>
+                  <m:t>F</m:t>
+                </m:r>
+                <m:r>
+                  <m:rPr>
+                    <m:sty m:val="p"/>
+                  </m:rPr>
+                  <m:t>+</m:t>
+                </m:r>
+                <m:r>
+                  <m:t>d</m:t>
+                </m:r>
+                <m:sSub>
+                  <m:e>
+                    <m:r>
+                      <m:t>f</m:t>
+                    </m:r>
+                  </m:e>
+                  <m:sub>
+                    <m:r>
+                      <m:t>2</m:t>
+                    </m:r>
+                  </m:sub>
+                </m:sSub>
+              </m:e>
+            </m:d>
+          </m:e>
+        </m:rad>
+      </m:oMath>
+      <w:r>
+        <w:t xml:space="preserve"> </w:t>
+      </w:r>
+      <w:r>
+        <w:t xml:space="preserve">(Rosenthal, 1994). Studies reporting only unstandardized β without an associated</w:t>
+      </w:r>
+      <w:r>
+        <w:t xml:space="preserve"> </w:t>
+      </w:r>
+      <w:r>
+        <w:rPr>
+          <w:iCs/>
+          <w:i/>
+        </w:rPr>
+        <w:t xml:space="preserve">t</w:t>
+      </w:r>
+      <w:r>
+        <w:t xml:space="preserve">-statistic and</w:t>
+      </w:r>
+      <w:r>
+        <w:t xml:space="preserve"> </w:t>
+      </w:r>
+      <w:r>
+        <w:rPr>
+          <w:iCs/>
+          <w:i/>
+        </w:rPr>
+        <w:t xml:space="preserve">df</w:t>
+      </w:r>
+      <w:r>
+        <w:t xml:space="preserve"> </w:t>
+      </w:r>
+      <w:r>
+        <w:t xml:space="preserve">were excluded from the meta-analytic sample unless the</w:t>
       </w:r>
       <w:r>
         <w:t xml:space="preserve"> </w:t>
@@ -2425,7 +2831,7 @@
         <w:t xml:space="preserve">p</w:t>
       </w:r>
       <w:r>
-        <w:t xml:space="preserve">-value, and asymmetric confidence interval bounds when reported.</w:t>
+        <w:t xml:space="preserve">-value allowed at minimum a directional classification.</w:t>
       </w:r>
     </w:p>
     <w:p>
@@ -2433,7 +2839,167 @@
         <w:pStyle w:val="BodyText"/>
       </w:pPr>
       <w:r>
-        <w:t xml:space="preserve">The extraction workflow comprises four sequential stages:</w:t>
+        <w:rPr>
+          <w:bCs/>
+          <w:b/>
+        </w:rPr>
+        <w:t xml:space="preserve">Multiple effects per study.</w:t>
+      </w:r>
+      <w:r>
+        <w:t xml:space="preserve"> </w:t>
+      </w:r>
+      <w:r>
+        <w:t xml:space="preserve">When a study reported separate estimates for distinct subsamples (e.g., different countries, two time periods, or mutually exclusive industry subgroups), each estimate was coded as an independent effect size with a unique effect ID, while sharing study-level identifiers. When a study reported multiple model specifications for the same sample, the most fully controlled specification (i.e., the model with the largest set of covariates) was retained to minimize omitted-variable confounding in the pooled estimate; the other specifications were logged but not entered into the analysis database.</w:t>
+      </w:r>
+    </w:p>
+    <w:p>
+      <w:pPr>
+        <w:pStyle w:val="BodyText"/>
+      </w:pPr>
+      <w:r>
+        <w:rPr>
+          <w:bCs/>
+          <w:b/>
+        </w:rPr>
+        <w:t xml:space="preserve">Moderator coding.</w:t>
+      </w:r>
+      <w:r>
+        <w:t xml:space="preserve"> </w:t>
+      </w:r>
+      <w:r>
+        <w:t xml:space="preserve">Following effect-size extraction, each record was coded for the seven moderators defined in §3.4. ICRV regime was assigned from the study's reported country using the World Bank WGI Rule of Law lookup table (2023 vintage); DPL phase from the median data year; cDAI from the World Bank Digital Adoption Index 2016 vintage or the ITU Digital Development Index (linearly rescaled to the same 0–1 range) for country-years not covered by the World Bank composite. All moderator assignments were documented with source references to enable independent verification.</w:t>
+      </w:r>
+    </w:p>
+    <w:p>
+      <w:pPr>
+        <w:pStyle w:val="BodyText"/>
+      </w:pPr>
+      <w:r>
+        <w:t xml:space="preserve">All extracted and coded records were entered into the permanent study database and subject to double-entry verification as part of the inter-coder reliability protocol described in §3.3.2.</w:t>
+      </w:r>
+    </w:p>
+    <w:bookmarkEnd w:id="34"/>
+    <w:bookmarkStart w:id="35" w:name="X8e0743bf85a4a1c5fca32f939ca3f33e412fd3d"/>
+    <w:p>
+      <w:pPr>
+        <w:pStyle w:val="Heading4"/>
+      </w:pPr>
+      <w:r>
+        <w:t xml:space="preserve">3.3.2 Inter-Coder Reliability Assessment</w:t>
+      </w:r>
+    </w:p>
+    <w:p>
+      <w:pPr>
+        <w:pStyle w:val="FirstParagraph"/>
+      </w:pPr>
+      <w:r>
+        <w:t xml:space="preserve">The inter-coder reliability (ICR) protocol followed a three-stage design. In</w:t>
+      </w:r>
+      <w:r>
+        <w:t xml:space="preserve"> </w:t>
+      </w:r>
+      <w:r>
+        <w:rPr>
+          <w:bCs/>
+          <w:b/>
+        </w:rPr>
+        <w:t xml:space="preserve">Stage 1</w:t>
+      </w:r>
+      <w:r>
+        <w:t xml:space="preserve"> </w:t>
+      </w:r>
+      <w:r>
+        <w:t xml:space="preserve">(calibration), both coders independently coded a pilot set of 10 studies using the full Appendix B coding protocol; discrepancies were discussed and the protocol was refined before proceeding. In</w:t>
+      </w:r>
+      <w:r>
+        <w:t xml:space="preserve"> </w:t>
+      </w:r>
+      <w:r>
+        <w:rPr>
+          <w:bCs/>
+          <w:b/>
+        </w:rPr>
+        <w:t xml:space="preserve">Stage 2</w:t>
+      </w:r>
+      <w:r>
+        <w:t xml:space="preserve"> </w:t>
+      </w:r>
+      <w:r>
+        <w:t xml:space="preserve">(independent coding), both coders independently coded a 20% stratified random subsample of the final study corpus (</w:t>
+      </w:r>
+      <w:r>
+        <w:rPr>
+          <w:iCs/>
+          <w:i/>
+        </w:rPr>
+        <w:t xml:space="preserve">k</w:t>
+      </w:r>
+      <w:r>
+        <w:t xml:space="preserve"> </w:t>
+      </w:r>
+      <w:r>
+        <w:t xml:space="preserve">= 47 studies), sampled to ensure representation across ICRV regime, DPL phase, and DOI measure type. In</w:t>
+      </w:r>
+      <w:r>
+        <w:t xml:space="preserve"> </w:t>
+      </w:r>
+      <w:r>
+        <w:rPr>
+          <w:bCs/>
+          <w:b/>
+        </w:rPr>
+        <w:t xml:space="preserve">Stage 3</w:t>
+      </w:r>
+      <w:r>
+        <w:t xml:space="preserve"> </w:t>
+      </w:r>
+      <w:r>
+        <w:t xml:space="preserve">(adjudication), discrepancies were resolved by the PI following a predetermined rule: for categorical moderators, the adjudicator's decision was final; for continuous cDAI scores, the mean of the two coders' values was used when ICC(2,1) ≥ 0.80, and the PI's direct lookup was used otherwise.</w:t>
+      </w:r>
+    </w:p>
+    <w:p>
+      <w:pPr>
+        <w:pStyle w:val="BodyText"/>
+      </w:pPr>
+      <w:r>
+        <w:t xml:space="preserve">ICR was assessed using Cohen's κ for categorical variables (ICRV regime, DPL phase, industry sector, DOI measure type, performance measure type) and the two-way random-effects ICC(2,1) for continuous cDAI scores. The target threshold of κ ≥ 0.70 follows Landis and Koch's (1977) "substantial agreement" criterion, which represents the minimum acceptable level for meta-analytic coding in IB research (Aguinis et al., 2011). ICR statistics are reported in Table 3.1 (see Results, §4.1); all targets were met prior to commencing coding of the remaining 80% of the corpus.</w:t>
+      </w:r>
+    </w:p>
+    <w:bookmarkEnd w:id="35"/>
+    <w:bookmarkEnd w:id="36"/>
+    <w:bookmarkStart w:id="37" w:name="X601957e051aebf49785be7eb6f4c3dde13d76da"/>
+    <w:p>
+      <w:pPr>
+        <w:pStyle w:val="Heading3"/>
+      </w:pPr>
+      <w:r>
+        <w:t xml:space="preserve">3.4 Moderator Coding Protocol</w:t>
+      </w:r>
+    </w:p>
+    <w:p>
+      <w:pPr>
+        <w:pStyle w:val="FirstParagraph"/>
+      </w:pPr>
+      <w:r>
+        <w:t xml:space="preserve">Seven moderators were coded for each effect size: four standard moderators replicated from prior I→P meta-analyses (Marano et al., 2016) and three novel moderators introduced in the present study.</w:t>
+      </w:r>
+    </w:p>
+    <w:p>
+      <w:pPr>
+        <w:pStyle w:val="BodyText"/>
+      </w:pPr>
+      <w:r>
+        <w:rPr>
+          <w:bCs/>
+          <w:b/>
+        </w:rPr>
+        <w:t xml:space="preserve">Standard moderators</w:t>
+      </w:r>
+      <w:r>
+        <w:t xml:space="preserve"> </w:t>
+      </w:r>
+      <w:r>
+        <w:t xml:space="preserve">(4):</w:t>
       </w:r>
     </w:p>
     <w:p>
@@ -2442,19 +3008,20 @@
           <w:ilvl w:val="0"/>
           <w:numId w:val="1002"/>
         </w:numPr>
-      </w:pPr>
-      <w:r>
-        <w:rPr>
-          <w:bCs/>
-          <w:b/>
-        </w:rPr>
-        <w:t xml:space="preserve">Document parsing.</w:t>
-      </w:r>
-      <w:r>
-        <w:t xml:space="preserve"> </w:t>
-      </w:r>
-      <w:r>
-        <w:t xml:space="preserve">PDF text is extracted using MuPDF and segmented into statistical reporting regions (tables, regression output blocks, footnotes) using heuristic layout analysis. Segmentation preserves table row–column correspondence to prevent coefficient–standard-error misalignment.</w:t>
+        <w:pStyle w:val="Compact"/>
+      </w:pPr>
+      <w:r>
+        <w:rPr>
+          <w:iCs/>
+          <w:i/>
+        </w:rPr>
+        <w:t xml:space="preserve">Country of origin</w:t>
+      </w:r>
+      <w:r>
+        <w:t xml:space="preserve"> </w:t>
+      </w:r>
+      <w:r>
+        <w:t xml:space="preserve">— ISO 3166-1 alpha-3 code; multi-country studies coded as "pooled" with ICRV regime assigned to the modal country if one country contributes ≥ 60% of the sample, otherwise coded as "cross-regime"</w:t>
       </w:r>
     </w:p>
     <w:p>
@@ -2463,19 +3030,20 @@
           <w:ilvl w:val="0"/>
           <w:numId w:val="1002"/>
         </w:numPr>
-      </w:pPr>
-      <w:r>
-        <w:rPr>
-          <w:bCs/>
-          <w:b/>
-        </w:rPr>
-        <w:t xml:space="preserve">LLM-based parameter identification.</w:t>
-      </w:r>
-      <w:r>
-        <w:t xml:space="preserve"> </w:t>
-      </w:r>
-      <w:r>
-        <w:t xml:space="preserve">The parsed text is submitted to the LLM with a structured extraction prompt that (a) identifies the focal internationalization–performance regression or correlation, (b) distinguishes the I→P estimate from moderator interactions and control variable coefficients, and (c) flags multi-study papers (e.g., two samples or two time periods) for separate effect-size entries.</w:t>
+        <w:pStyle w:val="Compact"/>
+      </w:pPr>
+      <w:r>
+        <w:rPr>
+          <w:iCs/>
+          <w:i/>
+        </w:rPr>
+        <w:t xml:space="preserve">Industry sector</w:t>
+      </w:r>
+      <w:r>
+        <w:t xml:space="preserve"> </w:t>
+      </w:r>
+      <w:r>
+        <w:t xml:space="preserve">— SIC broad division: manufacturing (SIC 20–39), services (SIC 40–89), or mixed/unspecified</w:t>
       </w:r>
     </w:p>
     <w:p>
@@ -2484,282 +3052,20 @@
           <w:ilvl w:val="0"/>
           <w:numId w:val="1002"/>
         </w:numPr>
-      </w:pPr>
-      <w:r>
-        <w:rPr>
-          <w:bCs/>
-          <w:b/>
-        </w:rPr>
-        <w:t xml:space="preserve">Effect-size conversion.</w:t>
-      </w:r>
-      <w:r>
-        <w:t xml:space="preserve"> </w:t>
-      </w:r>
-      <w:r>
-        <w:t xml:space="preserve">When direct</w:t>
-      </w:r>
-      <w:r>
-        <w:t xml:space="preserve"> </w:t>
-      </w:r>
-      <w:r>
-        <w:rPr>
-          <w:iCs/>
-          <w:i/>
-        </w:rPr>
-        <w:t xml:space="preserve">r</w:t>
-      </w:r>
-      <w:r>
-        <w:t xml:space="preserve"> </w:t>
-      </w:r>
-      <w:r>
-        <w:t xml:space="preserve">is unavailable, M-AIDA applies the following hierarchy of conversion formulae: (i)</w:t>
-      </w:r>
-      <w:r>
-        <w:t xml:space="preserve"> </w:t>
-      </w:r>
-      <w:r>
-        <w:rPr>
-          <w:iCs/>
-          <w:i/>
-        </w:rPr>
-        <w:t xml:space="preserve">r</w:t>
-      </w:r>
-      <w:r>
-        <w:t xml:space="preserve"> </w:t>
-      </w:r>
-      <w:r>
-        <w:t xml:space="preserve">from</w:t>
-      </w:r>
-      <w:r>
-        <w:t xml:space="preserve"> </w:t>
-      </w:r>
-      <w:r>
-        <w:rPr>
-          <w:iCs/>
-          <w:i/>
-        </w:rPr>
-        <w:t xml:space="preserve">t</w:t>
-      </w:r>
-      <w:r>
-        <w:t xml:space="preserve">-statistic:</w:t>
-      </w:r>
-      <w:r>
-        <w:t xml:space="preserve"> </w:t>
-      </w:r>
-      <w:r>
-        <w:rPr>
-          <w:iCs/>
-          <w:i/>
-        </w:rPr>
-        <w:t xml:space="preserve">r</w:t>
-      </w:r>
-      <w:r>
-        <w:t xml:space="preserve"> </w:t>
-      </w:r>
-      <w:r>
-        <w:t xml:space="preserve">= √[</w:t>
-      </w:r>
-      <w:r>
-        <w:rPr>
-          <w:iCs/>
-          <w:i/>
-        </w:rPr>
-        <w:t xml:space="preserve">t</w:t>
-      </w:r>
-      <w:r>
-        <w:t xml:space="preserve">²/(</w:t>
-      </w:r>
-      <w:r>
-        <w:rPr>
-          <w:iCs/>
-          <w:i/>
-        </w:rPr>
-        <w:t xml:space="preserve">t</w:t>
-      </w:r>
-      <w:r>
-        <w:t xml:space="preserve">²+</w:t>
-      </w:r>
-      <w:r>
-        <w:rPr>
-          <w:iCs/>
-          <w:i/>
-        </w:rPr>
-        <w:t xml:space="preserve">df</w:t>
-      </w:r>
-      <w:r>
-        <w:t xml:space="preserve">)] (Cohen, 1988); (ii)</w:t>
-      </w:r>
-      <w:r>
-        <w:t xml:space="preserve"> </w:t>
-      </w:r>
-      <w:r>
-        <w:rPr>
-          <w:iCs/>
-          <w:i/>
-        </w:rPr>
-        <w:t xml:space="preserve">r</w:t>
-      </w:r>
-      <w:r>
-        <w:t xml:space="preserve">_partial from β:</w:t>
-      </w:r>
-      <w:r>
-        <w:t xml:space="preserve"> </w:t>
-      </w:r>
-      <w:r>
-        <w:rPr>
-          <w:iCs/>
-          <w:i/>
-        </w:rPr>
-        <w:t xml:space="preserve">r</w:t>
-      </w:r>
-      <w:r>
-        <w:t xml:space="preserve">_partial = β × 0.98 (Peterson &amp; Brown, 2005); (iii)</w:t>
-      </w:r>
-      <w:r>
-        <w:t xml:space="preserve"> </w:t>
-      </w:r>
-      <w:r>
-        <w:rPr>
-          <w:iCs/>
-          <w:i/>
-        </w:rPr>
-        <w:t xml:space="preserve">r</w:t>
-      </w:r>
-      <w:r>
-        <w:t xml:space="preserve"> </w:t>
-      </w:r>
-      <w:r>
-        <w:t xml:space="preserve">from</w:t>
-      </w:r>
-      <w:r>
-        <w:t xml:space="preserve"> </w:t>
-      </w:r>
-      <w:r>
-        <w:rPr>
-          <w:iCs/>
-          <w:i/>
-        </w:rPr>
-        <w:t xml:space="preserve">F</w:t>
-      </w:r>
-      <w:r>
-        <w:t xml:space="preserve"> </w:t>
-      </w:r>
-      <w:r>
-        <w:t xml:space="preserve">with</w:t>
-      </w:r>
-      <w:r>
-        <w:t xml:space="preserve"> </w:t>
-      </w:r>
-      <w:r>
-        <w:rPr>
-          <w:iCs/>
-          <w:i/>
-        </w:rPr>
-        <w:t xml:space="preserve">df</w:t>
-      </w:r>
-      <w:r>
-        <w:t xml:space="preserve">₁ = 1:</w:t>
-      </w:r>
-      <w:r>
-        <w:t xml:space="preserve"> </w:t>
-      </w:r>
-      <w:r>
-        <w:rPr>
-          <w:iCs/>
-          <w:i/>
-        </w:rPr>
-        <w:t xml:space="preserve">r</w:t>
-      </w:r>
-      <w:r>
-        <w:t xml:space="preserve"> </w:t>
-      </w:r>
-      <w:r>
-        <w:t xml:space="preserve">= √[</w:t>
-      </w:r>
-      <w:r>
-        <w:rPr>
-          <w:iCs/>
-          <w:i/>
-        </w:rPr>
-        <w:t xml:space="preserve">F</w:t>
-      </w:r>
-      <w:r>
-        <w:t xml:space="preserve">/(</w:t>
-      </w:r>
-      <w:r>
-        <w:rPr>
-          <w:iCs/>
-          <w:i/>
-        </w:rPr>
-        <w:t xml:space="preserve">F</w:t>
-      </w:r>
-      <w:r>
-        <w:t xml:space="preserve">+</w:t>
-      </w:r>
-      <w:r>
-        <w:rPr>
-          <w:iCs/>
-          <w:i/>
-        </w:rPr>
-        <w:t xml:space="preserve">df</w:t>
-      </w:r>
-      <w:r>
-        <w:t xml:space="preserve">₂)] (Rosenthal, 1994). Each converted estimate is flagged with a confidence score: 1.00 for direct</w:t>
-      </w:r>
-      <w:r>
-        <w:t xml:space="preserve"> </w:t>
-      </w:r>
-      <w:r>
-        <w:rPr>
-          <w:iCs/>
-          <w:i/>
-        </w:rPr>
-        <w:t xml:space="preserve">r</w:t>
-      </w:r>
-      <w:r>
-        <w:t xml:space="preserve">; 0.85 for</w:t>
-      </w:r>
-      <w:r>
-        <w:t xml:space="preserve"> </w:t>
-      </w:r>
-      <w:r>
-        <w:rPr>
-          <w:iCs/>
-          <w:i/>
-        </w:rPr>
-        <w:t xml:space="preserve">r</w:t>
-      </w:r>
-      <w:r>
-        <w:t xml:space="preserve"> </w:t>
-      </w:r>
-      <w:r>
-        <w:t xml:space="preserve">from</w:t>
-      </w:r>
-      <w:r>
-        <w:t xml:space="preserve"> </w:t>
-      </w:r>
-      <w:r>
-        <w:rPr>
-          <w:iCs/>
-          <w:i/>
-        </w:rPr>
-        <w:t xml:space="preserve">t</w:t>
-      </w:r>
-      <w:r>
-        <w:t xml:space="preserve">; 0.65 for</w:t>
-      </w:r>
-      <w:r>
-        <w:t xml:space="preserve"> </w:t>
-      </w:r>
-      <w:r>
-        <w:rPr>
-          <w:iCs/>
-          <w:i/>
-        </w:rPr>
-        <w:t xml:space="preserve">r</w:t>
-      </w:r>
-      <w:r>
-        <w:t xml:space="preserve">_partial from β. Estimates with confidence &lt; 0.70 are automatically routed to the human verification queue.</w:t>
+        <w:pStyle w:val="Compact"/>
+      </w:pPr>
+      <w:r>
+        <w:rPr>
+          <w:iCs/>
+          <w:i/>
+        </w:rPr>
+        <w:t xml:space="preserve">DOI operationalization</w:t>
+      </w:r>
+      <w:r>
+        <w:t xml:space="preserve"> </w:t>
+      </w:r>
+      <w:r>
+        <w:t xml:space="preserve">— FSTS (foreign sales ÷ total sales); entropy index (Jacquemin &amp; Berry, 1979); count of foreign markets or subsidiaries; transnationality index (UNCTAD composite)</w:t>
       </w:r>
     </w:p>
     <w:p>
@@ -2768,361 +3074,108 @@
           <w:ilvl w:val="0"/>
           <w:numId w:val="1002"/>
         </w:numPr>
+        <w:pStyle w:val="Compact"/>
+      </w:pPr>
+      <w:r>
+        <w:rPr>
+          <w:iCs/>
+          <w:i/>
+        </w:rPr>
+        <w:t xml:space="preserve">Performance operationalization</w:t>
+      </w:r>
+      <w:r>
+        <w:t xml:space="preserve"> </w:t>
+      </w:r>
+      <w:r>
+        <w:t xml:space="preserve">— accounting-based (ROA, ROE, ROS); market-based (Tobin's Q, stock return); productivity-based (labor productivity, TFP); composite (mixed)</w:t>
+      </w:r>
+    </w:p>
+    <w:p>
+      <w:pPr>
+        <w:pStyle w:val="FirstParagraph"/>
       </w:pPr>
       <w:r>
         <w:rPr>
           <w:bCs/>
           <w:b/>
         </w:rPr>
-        <w:t xml:space="preserve">Moderator pre-coding.</w:t>
-      </w:r>
-      <w:r>
-        <w:t xml:space="preserve"> </w:t>
-      </w:r>
-      <w:r>
-        <w:t xml:space="preserve">M-AIDA pre-populates ICRV regime (from country name and World Bank WGI Rule of Law scores), DPL phase (from the study's data-year range), and cDAI score (from ITU country-year lookup table), which human coders then verify rather than enter from scratch.</w:t>
-      </w:r>
-    </w:p>
-    <w:p>
-      <w:pPr>
-        <w:pStyle w:val="FirstParagraph"/>
-      </w:pPr>
-      <w:r>
-        <w:t xml:space="preserve">M-AIDA v7.0 achieves this workflow without writing extracted estimates to the permanent study database until explicit PI authorization is granted (see §3.3.2). All intermediate extraction outputs are retained in audit-trail logs for reproducibility verification.</w:t>
-      </w:r>
-    </w:p>
-    <w:bookmarkEnd w:id="34"/>
-    <w:bookmarkStart w:id="35" w:name="X74b89673e7a1c1b3e57d768d3e5c9868450e6c4"/>
-    <w:p>
-      <w:pPr>
-        <w:pStyle w:val="Heading4"/>
-      </w:pPr>
-      <w:r>
-        <w:t xml:space="preserve">3.3.2 Human Verification and PI Data Lock Protocol</w:t>
-      </w:r>
-    </w:p>
-    <w:p>
-      <w:pPr>
-        <w:pStyle w:val="FirstParagraph"/>
-      </w:pPr>
-      <w:r>
-        <w:t xml:space="preserve">Every M-AIDA-extracted record passes through a structured human verification stage before it is admitted to the analysis database. The verification interface presents the extracted parameter alongside the source text excerpt (highlighted in the original PDF) and the pre-coded moderator values. The PI reviews each field, applies overrides where the LLM extraction is incorrect or ambiguous, and enters a brief verification note. Verification is mandatory for all records with confidence score &lt; 0.70; it is recommended but optional for records with confidence ≥ 0.85.</w:t>
-      </w:r>
-    </w:p>
-    <w:p>
-      <w:pPr>
-        <w:pStyle w:val="BodyText"/>
-      </w:pPr>
-      <w:r>
-        <w:t xml:space="preserve">Upon PI approval, records are committed to the permanent study database via a PI data lock operation that is cryptographically timestamped and irreversible. Locked records constitute the analysis sample and cannot be modified; any correction requires documentation of the original error, the corrected value, and the PI's approval note in a versioned audit log. This protocol satisfies the reproducibility standards proposed by Lakens et al. (2020) for pre-registered meta-analyses and ensures that the analysis sample is immutably traceable to source documents.</w:t>
-      </w:r>
-    </w:p>
-    <w:p>
-      <w:pPr>
-        <w:pStyle w:val="BodyText"/>
-      </w:pPr>
-      <w:r>
-        <w:t xml:space="preserve">The M-AIDA extraction architecture — LLM-assisted parsing, automated conversion, staged human verification, and immutable data lock — constitutes a methodological contribution of the present study: it provides a replicable, partially automatable alternative to fully manual extraction for the IB meta-analysis domain, where effect-size extraction is particularly demanding due to heterogeneous reporting conventions across journals (Borenstein et al., 2021).</w:t>
-      </w:r>
-    </w:p>
-    <w:bookmarkEnd w:id="35"/>
-    <w:bookmarkStart w:id="36" w:name="X53d7a102e1079f9a0a3d8daa38852762d7bab5a"/>
-    <w:p>
-      <w:pPr>
-        <w:pStyle w:val="Heading4"/>
-      </w:pPr>
-      <w:r>
-        <w:t xml:space="preserve">3.3.3 Inter-Coder Reliability Assessment</w:t>
-      </w:r>
-    </w:p>
-    <w:p>
-      <w:pPr>
-        <w:pStyle w:val="FirstParagraph"/>
-      </w:pPr>
-      <w:r>
-        <w:t xml:space="preserve">The inter-coder reliability (ICR) protocol followed a three-stage design. In</w:t>
-      </w:r>
-      <w:r>
-        <w:t xml:space="preserve"> </w:t>
-      </w:r>
-      <w:r>
-        <w:rPr>
-          <w:bCs/>
-          <w:b/>
-        </w:rPr>
-        <w:t xml:space="preserve">Stage 1</w:t>
-      </w:r>
-      <w:r>
-        <w:t xml:space="preserve"> </w:t>
-      </w:r>
-      <w:r>
-        <w:t xml:space="preserve">(calibration), both coders independently coded a pilot set of 10 studies using the full Appendix B coding protocol; discrepancies were discussed and the protocol was refined before proceeding. In</w:t>
-      </w:r>
-      <w:r>
-        <w:t xml:space="preserve"> </w:t>
-      </w:r>
-      <w:r>
-        <w:rPr>
-          <w:bCs/>
-          <w:b/>
-        </w:rPr>
-        <w:t xml:space="preserve">Stage 2</w:t>
-      </w:r>
-      <w:r>
-        <w:t xml:space="preserve"> </w:t>
-      </w:r>
-      <w:r>
-        <w:t xml:space="preserve">(independent coding), both coders independently coded a 20% stratified random subsample of the final study corpus (</w:t>
-      </w:r>
-      <w:r>
-        <w:rPr>
-          <w:iCs/>
-          <w:i/>
-        </w:rPr>
-        <w:t xml:space="preserve">k</w:t>
-      </w:r>
-      <w:r>
-        <w:t xml:space="preserve"> </w:t>
-      </w:r>
-      <w:r>
-        <w:t xml:space="preserve">= 47 studies), sampled to ensure representation across ICRV regime, DPL phase, and DOI measure type. In</w:t>
-      </w:r>
-      <w:r>
-        <w:t xml:space="preserve"> </w:t>
-      </w:r>
-      <w:r>
-        <w:rPr>
-          <w:bCs/>
-          <w:b/>
-        </w:rPr>
-        <w:t xml:space="preserve">Stage 3</w:t>
-      </w:r>
-      <w:r>
-        <w:t xml:space="preserve"> </w:t>
-      </w:r>
-      <w:r>
-        <w:t xml:space="preserve">(adjudication), discrepancies were resolved by the PI following a predetermined rule: for categorical moderators, the adjudicator's decision was final; for continuous cDAI scores, the mean of the two coders' values was used when ICC(2,1) ≥ 0.80, and the PI's direct lookup was used otherwise.</w:t>
-      </w:r>
-    </w:p>
-    <w:p>
-      <w:pPr>
-        <w:pStyle w:val="BodyText"/>
-      </w:pPr>
-      <w:r>
-        <w:t xml:space="preserve">ICR was assessed using Cohen's κ for categorical variables (ICRV regime, DPL phase, industry sector, DOI measure type, performance measure type) and the two-way random-effects ICC(2,1) for continuous cDAI scores. The target threshold of κ ≥ 0.70 follows Landis and Koch's (1977) "substantial agreement" criterion, which represents the minimum acceptable level for meta-analytic coding in IB research (Aguinis et al., 2011). ICR statistics are reported in Table 3.1 (see Results, §4.1); all targets were met prior to commencing coding of the remaining 80% of the corpus.</w:t>
-      </w:r>
-    </w:p>
-    <w:bookmarkEnd w:id="36"/>
+        <w:t xml:space="preserve">Novel moderators</w:t>
+      </w:r>
+      <w:r>
+        <w:t xml:space="preserve"> </w:t>
+      </w:r>
+      <w:r>
+        <w:t xml:space="preserve">(3):</w:t>
+      </w:r>
+      <w:r>
+        <w:t xml:space="preserve"> </w:t>
+      </w:r>
+      <w:r>
+        <w:t xml:space="preserve">5.</w:t>
+      </w:r>
+      <w:r>
+        <w:t xml:space="preserve"> </w:t>
+      </w:r>
+      <w:r>
+        <w:rPr>
+          <w:iCs/>
+          <w:i/>
+        </w:rPr>
+        <w:t xml:space="preserve">ICRV regime</w:t>
+      </w:r>
+      <w:r>
+        <w:t xml:space="preserve"> </w:t>
+      </w:r>
+      <w:r>
+        <w:t xml:space="preserve">— Six-code classification based on World Bank WGI Rule of Law score (2023 vintage), validated against IMF World Economic Outlook country classification: Code I: Advanced-Innovation (WGI &gt; +0.80; e.g., Singapore, Hong Kong, South Korea, Japan, Taiwan, Australia); Code II: Upper-Middle (0 &lt; WGI ≤ +0.80; e.g., China, Malaysia, Thailand); Code III: Emerging (−0.50 &lt; WGI ≤ 0; e.g., Vietnam, India, Philippines); Code FR: Frontier/SIDS (WGI ≤ −0.50 or small island developing state, e.g., Bangladesh, Myanmar, Fiji, Pacific island economies); Code MX: Multi-country pooled samples spanning two or more ICRV regimes (no single modal-country regime ≥ 60% of sample)</w:t>
+      </w:r>
+      <w:r>
+        <w:t xml:space="preserve"> </w:t>
+      </w:r>
+      <w:r>
+        <w:t xml:space="preserve">6.</w:t>
+      </w:r>
+      <w:r>
+        <w:t xml:space="preserve"> </w:t>
+      </w:r>
+      <w:r>
+        <w:rPr>
+          <w:iCs/>
+          <w:i/>
+        </w:rPr>
+        <w:t xml:space="preserve">cDAI</w:t>
+      </w:r>
+      <w:r>
+        <w:t xml:space="preserve"> </w:t>
+      </w:r>
+      <w:r>
+        <w:t xml:space="preserve">— Country-year digital adoption composite (0–1 scale): primary source, World Bank Digital Adoption Index (2016 vintage, Sahay et al., 2020); secondary source, ITU Digital Development Index (DDI, 2017–2026, linear-rescaled to 0–1). Country-year assignment follows the median year of the study's data collection period. For multi-country samples, cDAI is the sample-weighted average of country-year scores. Studies lacking country-year DAI data are assigned ITU ICT Development Index values with a −0.05 adjustment for known downward bias relative to the World Bank composite (Katz &amp; Callorda, 2018).</w:t>
+      </w:r>
+      <w:r>
+        <w:t xml:space="preserve"> </w:t>
+      </w:r>
+      <w:r>
+        <w:t xml:space="preserve">7.</w:t>
+      </w:r>
+      <w:r>
+        <w:t xml:space="preserve"> </w:t>
+      </w:r>
+      <w:r>
+        <w:rPr>
+          <w:iCs/>
+          <w:i/>
+        </w:rPr>
+        <w:t xml:space="preserve">DPL phase</w:t>
+      </w:r>
+      <w:r>
+        <w:t xml:space="preserve"> </w:t>
+      </w:r>
+      <w:r>
+        <w:t xml:space="preserve">— "Precede": data collection predominantly prior to 2009 (median data year &lt; 2009); "Span": data collection spans 2005–2014 or cannot be classified as predominantly Precede or Follow; "Follow": data collection predominantly post-2014 (median data year ≥ 2015). Studies where data years cannot be determined from the paper are coded as "Span" by default and flagged.</w:t>
+      </w:r>
+    </w:p>
     <w:bookmarkEnd w:id="37"/>
-    <w:bookmarkStart w:id="38" w:name="X601957e051aebf49785be7eb6f4c3dde13d76da"/>
-    <w:p>
-      <w:pPr>
-        <w:pStyle w:val="Heading3"/>
-      </w:pPr>
-      <w:r>
-        <w:t xml:space="preserve">3.4 Moderator Coding Protocol</w:t>
-      </w:r>
-    </w:p>
-    <w:p>
-      <w:pPr>
-        <w:pStyle w:val="FirstParagraph"/>
-      </w:pPr>
-      <w:r>
-        <w:t xml:space="preserve">Seven moderators were coded for each effect size: four standard moderators replicated from prior I→P meta-analyses (Marano et al., 2016) and three novel moderators introduced in the present study.</w:t>
-      </w:r>
-    </w:p>
-    <w:p>
-      <w:pPr>
-        <w:pStyle w:val="BodyText"/>
-      </w:pPr>
-      <w:r>
-        <w:rPr>
-          <w:bCs/>
-          <w:b/>
-        </w:rPr>
-        <w:t xml:space="preserve">Standard moderators</w:t>
-      </w:r>
-      <w:r>
-        <w:t xml:space="preserve"> </w:t>
-      </w:r>
-      <w:r>
-        <w:t xml:space="preserve">(4):</w:t>
-      </w:r>
-    </w:p>
-    <w:p>
-      <w:pPr>
-        <w:numPr>
-          <w:ilvl w:val="0"/>
-          <w:numId w:val="1003"/>
-        </w:numPr>
-        <w:pStyle w:val="Compact"/>
-      </w:pPr>
-      <w:r>
-        <w:rPr>
-          <w:iCs/>
-          <w:i/>
-        </w:rPr>
-        <w:t xml:space="preserve">Country of origin</w:t>
-      </w:r>
-      <w:r>
-        <w:t xml:space="preserve"> </w:t>
-      </w:r>
-      <w:r>
-        <w:t xml:space="preserve">— ISO 3166-1 alpha-3 code; multi-country studies coded as "pooled" with ICRV regime assigned to the modal country if one country contributes ≥ 60% of the sample, otherwise coded as "cross-regime"</w:t>
-      </w:r>
-    </w:p>
-    <w:p>
-      <w:pPr>
-        <w:numPr>
-          <w:ilvl w:val="0"/>
-          <w:numId w:val="1003"/>
-        </w:numPr>
-        <w:pStyle w:val="Compact"/>
-      </w:pPr>
-      <w:r>
-        <w:rPr>
-          <w:iCs/>
-          <w:i/>
-        </w:rPr>
-        <w:t xml:space="preserve">Industry sector</w:t>
-      </w:r>
-      <w:r>
-        <w:t xml:space="preserve"> </w:t>
-      </w:r>
-      <w:r>
-        <w:t xml:space="preserve">— SIC broad division: manufacturing (SIC 20–39), services (SIC 40–89), or mixed/unspecified</w:t>
-      </w:r>
-    </w:p>
-    <w:p>
-      <w:pPr>
-        <w:numPr>
-          <w:ilvl w:val="0"/>
-          <w:numId w:val="1003"/>
-        </w:numPr>
-        <w:pStyle w:val="Compact"/>
-      </w:pPr>
-      <w:r>
-        <w:rPr>
-          <w:iCs/>
-          <w:i/>
-        </w:rPr>
-        <w:t xml:space="preserve">DOI operationalization</w:t>
-      </w:r>
-      <w:r>
-        <w:t xml:space="preserve"> </w:t>
-      </w:r>
-      <w:r>
-        <w:t xml:space="preserve">— FSTS (foreign sales ÷ total sales); entropy index (Jacquemin &amp; Berry, 1979); count of foreign markets or subsidiaries; transnationality index (UNCTAD composite)</w:t>
-      </w:r>
-    </w:p>
-    <w:p>
-      <w:pPr>
-        <w:numPr>
-          <w:ilvl w:val="0"/>
-          <w:numId w:val="1003"/>
-        </w:numPr>
-        <w:pStyle w:val="Compact"/>
-      </w:pPr>
-      <w:r>
-        <w:rPr>
-          <w:iCs/>
-          <w:i/>
-        </w:rPr>
-        <w:t xml:space="preserve">Performance operationalization</w:t>
-      </w:r>
-      <w:r>
-        <w:t xml:space="preserve"> </w:t>
-      </w:r>
-      <w:r>
-        <w:t xml:space="preserve">— accounting-based (ROA, ROE, ROS); market-based (Tobin's Q, stock return); productivity-based (labor productivity, TFP); composite (mixed)</w:t>
-      </w:r>
-    </w:p>
-    <w:p>
-      <w:pPr>
-        <w:pStyle w:val="FirstParagraph"/>
-      </w:pPr>
-      <w:r>
-        <w:rPr>
-          <w:bCs/>
-          <w:b/>
-        </w:rPr>
-        <w:t xml:space="preserve">Novel moderators</w:t>
-      </w:r>
-      <w:r>
-        <w:t xml:space="preserve"> </w:t>
-      </w:r>
-      <w:r>
-        <w:t xml:space="preserve">(3):</w:t>
-      </w:r>
-      <w:r>
-        <w:t xml:space="preserve"> </w:t>
-      </w:r>
-      <w:r>
-        <w:t xml:space="preserve">5.</w:t>
-      </w:r>
-      <w:r>
-        <w:t xml:space="preserve"> </w:t>
-      </w:r>
-      <w:r>
-        <w:rPr>
-          <w:iCs/>
-          <w:i/>
-        </w:rPr>
-        <w:t xml:space="preserve">ICRV regime</w:t>
-      </w:r>
-      <w:r>
-        <w:t xml:space="preserve"> </w:t>
-      </w:r>
-      <w:r>
-        <w:t xml:space="preserve">— Five-regime classification based on World Bank WGI Rule of Law score (2023 vintage), validated against IMF World Economic Outlook country classification: Regime I: Advanced-Innovation (WGI &gt; +0.80; e.g., Singapore, Hong Kong, South Korea, Japan, Australia); Regime II: Upper-Middle (0 &lt; WGI ≤ +0.80; e.g., China, Malaysia, Thailand); Regime III: Emerging (−0.50 &lt; WGI ≤ 0; e.g., Vietnam, India, Philippines); Regime IV: SIDS (small island developing states with WGI boundary; e.g., Fiji, PNG, Pacific island economies); Regime V: Frontier (WGI ≤ −0.50; e.g., Bangladesh, Myanmar, Cambodia)</w:t>
-      </w:r>
-      <w:r>
-        <w:t xml:space="preserve"> </w:t>
-      </w:r>
-      <w:r>
-        <w:t xml:space="preserve">6.</w:t>
-      </w:r>
-      <w:r>
-        <w:t xml:space="preserve"> </w:t>
-      </w:r>
-      <w:r>
-        <w:rPr>
-          <w:iCs/>
-          <w:i/>
-        </w:rPr>
-        <w:t xml:space="preserve">cDAI</w:t>
-      </w:r>
-      <w:r>
-        <w:t xml:space="preserve"> </w:t>
-      </w:r>
-      <w:r>
-        <w:t xml:space="preserve">— Country-year digital adoption composite (0–1 scale): primary source, World Bank Digital Adoption Index (2016 vintage, Sahay et al., 2020); secondary source, ITU Digital Development Index (DDI, 2017–2026, linear-rescaled to 0–1). Country-year assignment follows the median year of the study's data collection period. For multi-country samples, cDAI is the sample-weighted average of country-year scores. Studies lacking country-year DAI data are assigned ITU ICT Development Index values with a −0.05 adjustment for known downward bias relative to the World Bank composite (Katz &amp; Callorda, 2018).</w:t>
-      </w:r>
-      <w:r>
-        <w:t xml:space="preserve"> </w:t>
-      </w:r>
-      <w:r>
-        <w:t xml:space="preserve">7.</w:t>
-      </w:r>
-      <w:r>
-        <w:t xml:space="preserve"> </w:t>
-      </w:r>
-      <w:r>
-        <w:rPr>
-          <w:iCs/>
-          <w:i/>
-        </w:rPr>
-        <w:t xml:space="preserve">DPL phase</w:t>
-      </w:r>
-      <w:r>
-        <w:t xml:space="preserve"> </w:t>
-      </w:r>
-      <w:r>
-        <w:t xml:space="preserve">— "Precede": data collection predominantly prior to 2009 (median data year &lt; 2009); "Span": data collection spans 2005–2014 or cannot be classified as predominantly Precede or Follow; "Follow": data collection predominantly post-2014 (median data year ≥ 2015). Studies where data years cannot be determined from the paper are coded as "Span" by default and flagged.</w:t>
-      </w:r>
-    </w:p>
-    <w:bookmarkEnd w:id="38"/>
-    <w:bookmarkStart w:id="39" w:name="X39398803b6212107b1d34889a3ed87f1d2a89f2"/>
+    <w:bookmarkStart w:id="38" w:name="X39398803b6212107b1d34889a3ed87f1d2a89f2"/>
     <w:p>
       <w:pPr>
         <w:pStyle w:val="Heading3"/>
@@ -4698,8 +4751,8 @@
         <w:t xml:space="preserve">-test.</w:t>
       </w:r>
     </w:p>
-    <w:bookmarkEnd w:id="39"/>
-    <w:bookmarkStart w:id="40" w:name="X2f1abb1755f8cc5892d8e5725c0dbd361d50806"/>
+    <w:bookmarkEnd w:id="38"/>
+    <w:bookmarkStart w:id="39" w:name="X2f1abb1755f8cc5892d8e5725c0dbd361d50806"/>
     <w:p>
       <w:pPr>
         <w:pStyle w:val="Heading3"/>
@@ -4894,8 +4947,8 @@
         <w:t xml:space="preserve">(Stanley &amp; Doucouliagos, 2014) is applied as a model-based publication bias correction: the precision-effect test (PET) regresses effect sizes on their standard errors; if significant, the precision-effect estimate with standard error (PEESE) substitutes the standard error squared as the regressor, providing an estimate of the true effect after correcting for small-study bias.</w:t>
       </w:r>
     </w:p>
-    <w:bookmarkEnd w:id="40"/>
-    <w:bookmarkStart w:id="41" w:name="Xe36430cf7d8e0a8c6df93020e9507d5e203e939"/>
+    <w:bookmarkEnd w:id="39"/>
+    <w:bookmarkStart w:id="40" w:name="Xe36430cf7d8e0a8c6df93020e9507d5e203e939"/>
     <w:p>
       <w:pPr>
         <w:pStyle w:val="Heading3"/>
@@ -4916,7 +4969,7 @@
       <w:pPr>
         <w:numPr>
           <w:ilvl w:val="0"/>
-          <w:numId w:val="1004"/>
+          <w:numId w:val="1003"/>
         </w:numPr>
         <w:pStyle w:val="Compact"/>
       </w:pPr>
@@ -4967,7 +5020,7 @@
       <w:pPr>
         <w:numPr>
           <w:ilvl w:val="0"/>
-          <w:numId w:val="1004"/>
+          <w:numId w:val="1003"/>
         </w:numPr>
         <w:pStyle w:val="Compact"/>
       </w:pPr>
@@ -5015,7 +5068,7 @@
       <w:pPr>
         <w:numPr>
           <w:ilvl w:val="0"/>
-          <w:numId w:val="1004"/>
+          <w:numId w:val="1003"/>
         </w:numPr>
         <w:pStyle w:val="Compact"/>
       </w:pPr>
@@ -5037,7 +5090,7 @@
       <w:pPr>
         <w:numPr>
           <w:ilvl w:val="0"/>
-          <w:numId w:val="1004"/>
+          <w:numId w:val="1003"/>
         </w:numPr>
         <w:pStyle w:val="Compact"/>
       </w:pPr>
@@ -5059,7 +5112,7 @@
       <w:pPr>
         <w:numPr>
           <w:ilvl w:val="0"/>
-          <w:numId w:val="1004"/>
+          <w:numId w:val="1003"/>
         </w:numPr>
         <w:pStyle w:val="Compact"/>
       </w:pPr>
@@ -5097,9 +5150,9 @@
         </w:pict>
       </w:r>
     </w:p>
+    <w:bookmarkEnd w:id="40"/>
     <w:bookmarkEnd w:id="41"/>
-    <w:bookmarkEnd w:id="42"/>
-    <w:bookmarkStart w:id="62" w:name="X121719332867ee227f0a04b486098cee978c6e6"/>
+    <w:bookmarkStart w:id="61" w:name="X121719332867ee227f0a04b486098cee978c6e6"/>
     <w:p>
       <w:pPr>
         <w:pStyle w:val="Heading2"/>
@@ -5108,7 +5161,7 @@
         <w:t xml:space="preserve">4. Results</w:t>
       </w:r>
     </w:p>
-    <w:bookmarkStart w:id="43" w:name="X404e116a6fc5d40bc82ca2b5ca0e91216768dfb"/>
+    <w:bookmarkStart w:id="42" w:name="X404e116a6fc5d40bc82ca2b5ca0e91216768dfb"/>
     <w:p>
       <w:pPr>
         <w:pStyle w:val="Heading3"/>
@@ -5132,7 +5185,23 @@
         <w:t xml:space="preserve"> </w:t>
       </w:r>
       <w:r>
-        <w:t xml:space="preserve">= 235 studies, approximately 385 effect sizes.</w:t>
+        <w:t xml:space="preserve">= 238 studies (coded),</w:t>
+      </w:r>
+      <w:r>
+        <w:t xml:space="preserve"> </w:t>
+      </w:r>
+      <w:r>
+        <w:rPr>
+          <w:iCs/>
+          <w:i/>
+        </w:rPr>
+        <w:t xml:space="preserve">K</w:t>
+      </w:r>
+      <w:r>
+        <w:t xml:space="preserve"> </w:t>
+      </w:r>
+      <w:r>
+        <w:t xml:space="preserve">= 288 effect sizes (working database, pre-formal-search).</w:t>
       </w:r>
     </w:p>
     <w:p>
@@ -5154,7 +5223,7 @@
           <w:iCs/>
           <w:i/>
         </w:rPr>
-        <w:t xml:space="preserve">(20% double-coded subsample, k = 47 studies)</w:t>
+        <w:t xml:space="preserve">(20% double-coded subsample, k = [TBD] studies; to be completed post-formal-search)</w:t>
       </w:r>
     </w:p>
     <w:tbl>
@@ -5270,7 +5339,7 @@
               <w:jc w:val="left"/>
             </w:pPr>
             <w:r>
-              <w:t xml:space="preserve">Categorical (5)</w:t>
+              <w:t xml:space="preserve">Categorical (6)</w:t>
             </w:r>
           </w:p>
         </w:tc>
@@ -5294,7 +5363,7 @@
               <w:jc w:val="left"/>
             </w:pPr>
             <w:r>
-              <w:t xml:space="preserve">0.79</w:t>
+              <w:t xml:space="preserve">[TBD]</w:t>
             </w:r>
           </w:p>
         </w:tc>
@@ -5318,7 +5387,7 @@
               <w:jc w:val="left"/>
             </w:pPr>
             <w:r>
-              <w:t xml:space="preserve">✓</w:t>
+              <w:t xml:space="preserve">[TBD]</w:t>
             </w:r>
           </w:p>
         </w:tc>
@@ -5368,7 +5437,7 @@
               <w:jc w:val="left"/>
             </w:pPr>
             <w:r>
-              <w:t xml:space="preserve">0.81</w:t>
+              <w:t xml:space="preserve">[TBD]</w:t>
             </w:r>
           </w:p>
         </w:tc>
@@ -5392,7 +5461,7 @@
               <w:jc w:val="left"/>
             </w:pPr>
             <w:r>
-              <w:t xml:space="preserve">✓</w:t>
+              <w:t xml:space="preserve">[TBD]</w:t>
             </w:r>
           </w:p>
         </w:tc>
@@ -5442,7 +5511,7 @@
               <w:jc w:val="left"/>
             </w:pPr>
             <w:r>
-              <w:t xml:space="preserve">0.87</w:t>
+              <w:t xml:space="preserve">[TBD]</w:t>
             </w:r>
           </w:p>
         </w:tc>
@@ -5466,7 +5535,7 @@
               <w:jc w:val="left"/>
             </w:pPr>
             <w:r>
-              <w:t xml:space="preserve">✓</w:t>
+              <w:t xml:space="preserve">[TBD]</w:t>
             </w:r>
           </w:p>
         </w:tc>
@@ -5516,7 +5585,7 @@
               <w:jc w:val="left"/>
             </w:pPr>
             <w:r>
-              <w:t xml:space="preserve">0.83</w:t>
+              <w:t xml:space="preserve">[TBD]</w:t>
             </w:r>
           </w:p>
         </w:tc>
@@ -5540,7 +5609,7 @@
               <w:jc w:val="left"/>
             </w:pPr>
             <w:r>
-              <w:t xml:space="preserve">✓</w:t>
+              <w:t xml:space="preserve">[TBD]</w:t>
             </w:r>
           </w:p>
         </w:tc>
@@ -5590,7 +5659,7 @@
               <w:jc w:val="left"/>
             </w:pPr>
             <w:r>
-              <w:t xml:space="preserve">0.76</w:t>
+              <w:t xml:space="preserve">[TBD]</w:t>
             </w:r>
           </w:p>
         </w:tc>
@@ -5614,7 +5683,7 @@
               <w:jc w:val="left"/>
             </w:pPr>
             <w:r>
-              <w:t xml:space="preserve">✓</w:t>
+              <w:t xml:space="preserve">[TBD]</w:t>
             </w:r>
           </w:p>
         </w:tc>
@@ -5664,7 +5733,7 @@
               <w:jc w:val="left"/>
             </w:pPr>
             <w:r>
-              <w:t xml:space="preserve">0.92</w:t>
+              <w:t xml:space="preserve">[TBD]</w:t>
             </w:r>
           </w:p>
         </w:tc>
@@ -5688,7 +5757,7 @@
               <w:jc w:val="left"/>
             </w:pPr>
             <w:r>
-              <w:t xml:space="preserve">✓</w:t>
+              <w:t xml:space="preserve">[TBD]</w:t>
             </w:r>
           </w:p>
         </w:tc>
@@ -5709,7 +5778,59 @@
         <w:t xml:space="preserve"> </w:t>
       </w:r>
       <w:r>
-        <w:t xml:space="preserve">All thresholds met prior to independent coding of the remaining 80% of the corpus. The lowest κ (ICRV regime, 0.79) reflects legitimate disagreement on Regime II/III boundary cases, resolved by PI lookup of WGI Rule of Law vintages.</w:t>
+        <w:t xml:space="preserve">Target threshold: κ ≥ 0.70 (Landis &amp; Koch, 1977) for all categorical moderators and ICC(2,1) ≥ 0.80 for cDAI. Final values to be reported after the 20% random subsample coding is complete. Protocol for resolving Regime II/III boundary disagreements: PI lookup of WGI Rule of Law vintage scores.</w:t>
+      </w:r>
+    </w:p>
+    <w:p>
+      <w:pPr>
+        <w:pStyle w:val="BodyText"/>
+      </w:pPr>
+      <w:r>
+        <w:rPr>
+          <w:bCs/>
+          <w:b/>
+        </w:rPr>
+        <w:t xml:space="preserve">Table 4.1 — Working-database sample composition</w:t>
+      </w:r>
+      <w:r>
+        <w:t xml:space="preserve"> </w:t>
+      </w:r>
+      <w:r>
+        <w:rPr>
+          <w:iCs/>
+          <w:i/>
+        </w:rPr>
+        <w:t xml:space="preserve">(pre-formal-search;</w:t>
+      </w:r>
+      <w:r>
+        <w:rPr>
+          <w:iCs/>
+          <w:i/>
+        </w:rPr>
+        <w:t xml:space="preserve"> </w:t>
+      </w:r>
+      <w:r>
+        <w:rPr>
+          <w:iCs/>
+          <w:i/>
+          <w:iCs/>
+          <w:i/>
+        </w:rPr>
+        <w:t xml:space="preserve">K</w:t>
+      </w:r>
+      <w:r>
+        <w:rPr>
+          <w:iCs/>
+          <w:i/>
+        </w:rPr>
+        <w:t xml:space="preserve"> </w:t>
+      </w:r>
+      <w:r>
+        <w:rPr>
+          <w:iCs/>
+          <w:i/>
+        </w:rPr>
+        <w:t xml:space="preserve">= 288 effect sizes, k = 238 coded studies)</w:t>
       </w:r>
     </w:p>
     <w:tbl>
@@ -5720,8 +5841,9 @@
         <w:jc w:val="start"/>
       </w:tblPr>
       <w:tblGrid>
-        <w:gridCol w:w="3960"/>
-        <w:gridCol w:w="3960"/>
+        <w:gridCol w:w="2640"/>
+        <w:gridCol w:w="2640"/>
+        <w:gridCol w:w="2640"/>
       </w:tblGrid>
       <w:tr>
         <w:trPr>
@@ -5751,7 +5873,35 @@
                 <w:iCs/>
                 <w:i/>
               </w:rPr>
+              <w:t xml:space="preserve">K</w:t>
+            </w:r>
+            <w:r>
+              <w:t xml:space="preserve"> </w:t>
+            </w:r>
+            <w:r>
+              <w:t xml:space="preserve">effects</w:t>
+            </w:r>
+          </w:p>
+        </w:tc>
+        <w:tc>
+          <w:tcPr/>
+          <w:p>
+            <w:pPr>
+              <w:pStyle w:val="Compact"/>
+              <w:jc w:val="left"/>
+            </w:pPr>
+            <w:r>
+              <w:rPr>
+                <w:iCs/>
+                <w:i/>
+              </w:rPr>
               <w:t xml:space="preserve">k</w:t>
+            </w:r>
+            <w:r>
+              <w:t xml:space="preserve"> </w:t>
+            </w:r>
+            <w:r>
+              <w:t xml:space="preserve">studies</w:t>
             </w:r>
           </w:p>
         </w:tc>
@@ -5765,19 +5915,31 @@
               <w:jc w:val="left"/>
             </w:pPr>
             <w:r>
-              <w:t xml:space="preserve">ICRV Regime I — Advanced</w:t>
-            </w:r>
-          </w:p>
-        </w:tc>
-        <w:tc>
-          <w:tcPr/>
-          <w:p>
-            <w:pPr>
-              <w:pStyle w:val="Compact"/>
-              <w:jc w:val="left"/>
-            </w:pPr>
-            <w:r>
-              <w:t xml:space="preserve">~18</w:t>
+              <w:t xml:space="preserve">ICRV Regime I — Advanced (e.g., Korea, Japan, Singapore, HK, Australia)</w:t>
+            </w:r>
+          </w:p>
+        </w:tc>
+        <w:tc>
+          <w:tcPr/>
+          <w:p>
+            <w:pPr>
+              <w:pStyle w:val="Compact"/>
+              <w:jc w:val="left"/>
+            </w:pPr>
+            <w:r>
+              <w:t xml:space="preserve">140</w:t>
+            </w:r>
+          </w:p>
+        </w:tc>
+        <w:tc>
+          <w:tcPr/>
+          <w:p>
+            <w:pPr>
+              <w:pStyle w:val="Compact"/>
+              <w:jc w:val="left"/>
+            </w:pPr>
+            <w:r>
+              <w:t xml:space="preserve">108</w:t>
             </w:r>
           </w:p>
         </w:tc>
@@ -5791,19 +5953,31 @@
               <w:jc w:val="left"/>
             </w:pPr>
             <w:r>
-              <w:t xml:space="preserve">ICRV Regime II — Upper-middle</w:t>
-            </w:r>
-          </w:p>
-        </w:tc>
-        <w:tc>
-          <w:tcPr/>
-          <w:p>
-            <w:pPr>
-              <w:pStyle w:val="Compact"/>
-              <w:jc w:val="left"/>
-            </w:pPr>
-            <w:r>
-              <w:t xml:space="preserve">~42</w:t>
+              <w:t xml:space="preserve">ICRV Regime II — Upper-middle (e.g., China, Malaysia, Thailand)</w:t>
+            </w:r>
+          </w:p>
+        </w:tc>
+        <w:tc>
+          <w:tcPr/>
+          <w:p>
+            <w:pPr>
+              <w:pStyle w:val="Compact"/>
+              <w:jc w:val="left"/>
+            </w:pPr>
+            <w:r>
+              <w:t xml:space="preserve">25</w:t>
+            </w:r>
+          </w:p>
+        </w:tc>
+        <w:tc>
+          <w:tcPr/>
+          <w:p>
+            <w:pPr>
+              <w:pStyle w:val="Compact"/>
+              <w:jc w:val="left"/>
+            </w:pPr>
+            <w:r>
+              <w:t xml:space="preserve">21</w:t>
             </w:r>
           </w:p>
         </w:tc>
@@ -5817,19 +5991,31 @@
               <w:jc w:val="left"/>
             </w:pPr>
             <w:r>
-              <w:t xml:space="preserve">ICRV Regime III — Emerging</w:t>
-            </w:r>
-          </w:p>
-        </w:tc>
-        <w:tc>
-          <w:tcPr/>
-          <w:p>
-            <w:pPr>
-              <w:pStyle w:val="Compact"/>
-              <w:jc w:val="left"/>
-            </w:pPr>
-            <w:r>
-              <w:t xml:space="preserve">~35</w:t>
+              <w:t xml:space="preserve">ICRV Regime III — Emerging (e.g., Vietnam, India, Philippines)</w:t>
+            </w:r>
+          </w:p>
+        </w:tc>
+        <w:tc>
+          <w:tcPr/>
+          <w:p>
+            <w:pPr>
+              <w:pStyle w:val="Compact"/>
+              <w:jc w:val="left"/>
+            </w:pPr>
+            <w:r>
+              <w:t xml:space="preserve">90</w:t>
+            </w:r>
+          </w:p>
+        </w:tc>
+        <w:tc>
+          <w:tcPr/>
+          <w:p>
+            <w:pPr>
+              <w:pStyle w:val="Compact"/>
+              <w:jc w:val="left"/>
+            </w:pPr>
+            <w:r>
+              <w:t xml:space="preserve">78</w:t>
             </w:r>
           </w:p>
         </w:tc>
@@ -5843,19 +6029,31 @@
               <w:jc w:val="left"/>
             </w:pPr>
             <w:r>
-              <w:t xml:space="preserve">ICRV SIDS</w:t>
-            </w:r>
-          </w:p>
-        </w:tc>
-        <w:tc>
-          <w:tcPr/>
-          <w:p>
-            <w:pPr>
-              <w:pStyle w:val="Compact"/>
-              <w:jc w:val="left"/>
-            </w:pPr>
-            <w:r>
-              <w:t xml:space="preserve">~5</w:t>
+              <w:t xml:space="preserve">ICRV Frontier / SIDS (FR)</w:t>
+            </w:r>
+          </w:p>
+        </w:tc>
+        <w:tc>
+          <w:tcPr/>
+          <w:p>
+            <w:pPr>
+              <w:pStyle w:val="Compact"/>
+              <w:jc w:val="left"/>
+            </w:pPr>
+            <w:r>
+              <w:t xml:space="preserve">3</w:t>
+            </w:r>
+          </w:p>
+        </w:tc>
+        <w:tc>
+          <w:tcPr/>
+          <w:p>
+            <w:pPr>
+              <w:pStyle w:val="Compact"/>
+              <w:jc w:val="left"/>
+            </w:pPr>
+            <w:r>
+              <w:t xml:space="preserve">3</w:t>
             </w:r>
           </w:p>
         </w:tc>
@@ -5869,19 +6067,31 @@
               <w:jc w:val="left"/>
             </w:pPr>
             <w:r>
-              <w:t xml:space="preserve">ICRV Frontier</w:t>
-            </w:r>
-          </w:p>
-        </w:tc>
-        <w:tc>
-          <w:tcPr/>
-          <w:p>
-            <w:pPr>
-              <w:pStyle w:val="Compact"/>
-              <w:jc w:val="left"/>
-            </w:pPr>
-            <w:r>
-              <w:t xml:space="preserve">~10</w:t>
+              <w:t xml:space="preserve">Cross-regime / multi-country (MX)</w:t>
+            </w:r>
+          </w:p>
+        </w:tc>
+        <w:tc>
+          <w:tcPr/>
+          <w:p>
+            <w:pPr>
+              <w:pStyle w:val="Compact"/>
+              <w:jc w:val="left"/>
+            </w:pPr>
+            <w:r>
+              <w:t xml:space="preserve">30</w:t>
+            </w:r>
+          </w:p>
+        </w:tc>
+        <w:tc>
+          <w:tcPr/>
+          <w:p>
+            <w:pPr>
+              <w:pStyle w:val="Compact"/>
+              <w:jc w:val="left"/>
+            </w:pPr>
+            <w:r>
+              <w:t xml:space="preserve">28</w:t>
             </w:r>
           </w:p>
         </w:tc>
@@ -5895,19 +6105,89 @@
               <w:jc w:val="left"/>
             </w:pPr>
             <w:r>
-              <w:t xml:space="preserve">Cross-regime / multi-country</w:t>
-            </w:r>
-          </w:p>
-        </w:tc>
-        <w:tc>
-          <w:tcPr/>
-          <w:p>
-            <w:pPr>
-              <w:pStyle w:val="Compact"/>
-              <w:jc w:val="left"/>
-            </w:pPr>
-            <w:r>
-              <w:t xml:space="preserve">~125</w:t>
+              <w:rPr>
+                <w:iCs/>
+                <w:i/>
+                <w:bCs/>
+                <w:b/>
+              </w:rPr>
+              <w:t xml:space="preserve">K</w:t>
+            </w:r>
+            <w:r>
+              <w:rPr>
+                <w:bCs/>
+                <w:b/>
+              </w:rPr>
+              <w:t xml:space="preserve"> </w:t>
+            </w:r>
+            <w:r>
+              <w:rPr>
+                <w:bCs/>
+                <w:b/>
+              </w:rPr>
+              <w:t xml:space="preserve">/</w:t>
+            </w:r>
+            <w:r>
+              <w:rPr>
+                <w:bCs/>
+                <w:b/>
+              </w:rPr>
+              <w:t xml:space="preserve"> </w:t>
+            </w:r>
+            <w:r>
+              <w:rPr>
+                <w:iCs/>
+                <w:i/>
+                <w:bCs/>
+                <w:b/>
+              </w:rPr>
+              <w:t xml:space="preserve">k</w:t>
+            </w:r>
+            <w:r>
+              <w:rPr>
+                <w:bCs/>
+                <w:b/>
+              </w:rPr>
+              <w:t xml:space="preserve"> </w:t>
+            </w:r>
+            <w:r>
+              <w:rPr>
+                <w:bCs/>
+                <w:b/>
+              </w:rPr>
+              <w:t xml:space="preserve">total</w:t>
+            </w:r>
+          </w:p>
+        </w:tc>
+        <w:tc>
+          <w:tcPr/>
+          <w:p>
+            <w:pPr>
+              <w:pStyle w:val="Compact"/>
+              <w:jc w:val="left"/>
+            </w:pPr>
+            <w:r>
+              <w:rPr>
+                <w:bCs/>
+                <w:b/>
+              </w:rPr>
+              <w:t xml:space="preserve">288</w:t>
+            </w:r>
+          </w:p>
+        </w:tc>
+        <w:tc>
+          <w:tcPr/>
+          <w:p>
+            <w:pPr>
+              <w:pStyle w:val="Compact"/>
+              <w:jc w:val="left"/>
+            </w:pPr>
+            <w:r>
+              <w:rPr>
+                <w:bCs/>
+                <w:b/>
+              </w:rPr>
+              <w:t xml:space="preserve">238</w:t>
             </w:r>
           </w:p>
         </w:tc>
@@ -5921,19 +6201,31 @@
               <w:jc w:val="left"/>
             </w:pPr>
             <w:r>
-              <w:t xml:space="preserve">cDAI High (Q4)</w:t>
-            </w:r>
-          </w:p>
-        </w:tc>
-        <w:tc>
-          <w:tcPr/>
-          <w:p>
-            <w:pPr>
-              <w:pStyle w:val="Compact"/>
-              <w:jc w:val="left"/>
-            </w:pPr>
-            <w:r>
-              <w:t xml:space="preserve">~33</w:t>
+              <w:t xml:space="preserve">cDAI High (H)</w:t>
+            </w:r>
+          </w:p>
+        </w:tc>
+        <w:tc>
+          <w:tcPr/>
+          <w:p>
+            <w:pPr>
+              <w:pStyle w:val="Compact"/>
+              <w:jc w:val="left"/>
+            </w:pPr>
+            <w:r>
+              <w:t xml:space="preserve">38</w:t>
+            </w:r>
+          </w:p>
+        </w:tc>
+        <w:tc>
+          <w:tcPr/>
+          <w:p>
+            <w:pPr>
+              <w:pStyle w:val="Compact"/>
+              <w:jc w:val="left"/>
+            </w:pPr>
+            <w:r>
+              <w:t xml:space="preserve">—</w:t>
             </w:r>
           </w:p>
         </w:tc>
@@ -5947,19 +6239,31 @@
               <w:jc w:val="left"/>
             </w:pPr>
             <w:r>
-              <w:t xml:space="preserve">cDAI Medium (Q2–Q3)</w:t>
-            </w:r>
-          </w:p>
-        </w:tc>
-        <w:tc>
-          <w:tcPr/>
-          <w:p>
-            <w:pPr>
-              <w:pStyle w:val="Compact"/>
-              <w:jc w:val="left"/>
-            </w:pPr>
-            <w:r>
-              <w:t xml:space="preserve">~65</w:t>
+              <w:t xml:space="preserve">cDAI Medium (M)</w:t>
+            </w:r>
+          </w:p>
+        </w:tc>
+        <w:tc>
+          <w:tcPr/>
+          <w:p>
+            <w:pPr>
+              <w:pStyle w:val="Compact"/>
+              <w:jc w:val="left"/>
+            </w:pPr>
+            <w:r>
+              <w:t xml:space="preserve">76</w:t>
+            </w:r>
+          </w:p>
+        </w:tc>
+        <w:tc>
+          <w:tcPr/>
+          <w:p>
+            <w:pPr>
+              <w:pStyle w:val="Compact"/>
+              <w:jc w:val="left"/>
+            </w:pPr>
+            <w:r>
+              <w:t xml:space="preserve">—</w:t>
             </w:r>
           </w:p>
         </w:tc>
@@ -5973,19 +6277,31 @@
               <w:jc w:val="left"/>
             </w:pPr>
             <w:r>
-              <w:t xml:space="preserve">cDAI Low (Q1)</w:t>
-            </w:r>
-          </w:p>
-        </w:tc>
-        <w:tc>
-          <w:tcPr/>
-          <w:p>
-            <w:pPr>
-              <w:pStyle w:val="Compact"/>
-              <w:jc w:val="left"/>
-            </w:pPr>
-            <w:r>
-              <w:t xml:space="preserve">~32</w:t>
+              <w:t xml:space="preserve">cDAI Low (L)</w:t>
+            </w:r>
+          </w:p>
+        </w:tc>
+        <w:tc>
+          <w:tcPr/>
+          <w:p>
+            <w:pPr>
+              <w:pStyle w:val="Compact"/>
+              <w:jc w:val="left"/>
+            </w:pPr>
+            <w:r>
+              <w:t xml:space="preserve">174</w:t>
+            </w:r>
+          </w:p>
+        </w:tc>
+        <w:tc>
+          <w:tcPr/>
+          <w:p>
+            <w:pPr>
+              <w:pStyle w:val="Compact"/>
+              <w:jc w:val="left"/>
+            </w:pPr>
+            <w:r>
+              <w:t xml:space="preserve">—</w:t>
             </w:r>
           </w:p>
         </w:tc>
@@ -5999,19 +6315,31 @@
               <w:jc w:val="left"/>
             </w:pPr>
             <w:r>
-              <w:t xml:space="preserve">DPL Precede</w:t>
-            </w:r>
-          </w:p>
-        </w:tc>
-        <w:tc>
-          <w:tcPr/>
-          <w:p>
-            <w:pPr>
-              <w:pStyle w:val="Compact"/>
-              <w:jc w:val="left"/>
-            </w:pPr>
-            <w:r>
-              <w:t xml:space="preserve">~38</w:t>
+              <w:t xml:space="preserve">DPL Precede (PRE, ≤2008)</w:t>
+            </w:r>
+          </w:p>
+        </w:tc>
+        <w:tc>
+          <w:tcPr/>
+          <w:p>
+            <w:pPr>
+              <w:pStyle w:val="Compact"/>
+              <w:jc w:val="left"/>
+            </w:pPr>
+            <w:r>
+              <w:t xml:space="preserve">100</w:t>
+            </w:r>
+          </w:p>
+        </w:tc>
+        <w:tc>
+          <w:tcPr/>
+          <w:p>
+            <w:pPr>
+              <w:pStyle w:val="Compact"/>
+              <w:jc w:val="left"/>
+            </w:pPr>
+            <w:r>
+              <w:t xml:space="preserve">—</w:t>
             </w:r>
           </w:p>
         </w:tc>
@@ -6025,19 +6353,31 @@
               <w:jc w:val="left"/>
             </w:pPr>
             <w:r>
-              <w:t xml:space="preserve">DPL Span</w:t>
-            </w:r>
-          </w:p>
-        </w:tc>
-        <w:tc>
-          <w:tcPr/>
-          <w:p>
-            <w:pPr>
-              <w:pStyle w:val="Compact"/>
-              <w:jc w:val="left"/>
-            </w:pPr>
-            <w:r>
-              <w:t xml:space="preserve">~52</w:t>
+              <w:t xml:space="preserve">DPL Span (SPN, 2009–2013)</w:t>
+            </w:r>
+          </w:p>
+        </w:tc>
+        <w:tc>
+          <w:tcPr/>
+          <w:p>
+            <w:pPr>
+              <w:pStyle w:val="Compact"/>
+              <w:jc w:val="left"/>
+            </w:pPr>
+            <w:r>
+              <w:t xml:space="preserve">108</w:t>
+            </w:r>
+          </w:p>
+        </w:tc>
+        <w:tc>
+          <w:tcPr/>
+          <w:p>
+            <w:pPr>
+              <w:pStyle w:val="Compact"/>
+              <w:jc w:val="left"/>
+            </w:pPr>
+            <w:r>
+              <w:t xml:space="preserve">—</w:t>
             </w:r>
           </w:p>
         </w:tc>
@@ -6051,19 +6391,335 @@
               <w:jc w:val="left"/>
             </w:pPr>
             <w:r>
-              <w:t xml:space="preserve">DPL Follow</w:t>
-            </w:r>
-          </w:p>
-        </w:tc>
-        <w:tc>
-          <w:tcPr/>
-          <w:p>
-            <w:pPr>
-              <w:pStyle w:val="Compact"/>
-              <w:jc w:val="left"/>
-            </w:pPr>
-            <w:r>
-              <w:t xml:space="preserve">~40</w:t>
+              <w:t xml:space="preserve">DPL Follow (FOL, ≥2014)</w:t>
+            </w:r>
+          </w:p>
+        </w:tc>
+        <w:tc>
+          <w:tcPr/>
+          <w:p>
+            <w:pPr>
+              <w:pStyle w:val="Compact"/>
+              <w:jc w:val="left"/>
+            </w:pPr>
+            <w:r>
+              <w:t xml:space="preserve">80</w:t>
+            </w:r>
+          </w:p>
+        </w:tc>
+        <w:tc>
+          <w:tcPr/>
+          <w:p>
+            <w:pPr>
+              <w:pStyle w:val="Compact"/>
+              <w:jc w:val="left"/>
+            </w:pPr>
+            <w:r>
+              <w:t xml:space="preserve">—</w:t>
+            </w:r>
+          </w:p>
+        </w:tc>
+      </w:tr>
+      <w:tr>
+        <w:tc>
+          <w:tcPr/>
+          <w:p>
+            <w:pPr>
+              <w:pStyle w:val="Compact"/>
+              <w:jc w:val="left"/>
+            </w:pPr>
+            <w:r>
+              <w:t xml:space="preserve">By DOI type: FSTS</w:t>
+            </w:r>
+          </w:p>
+        </w:tc>
+        <w:tc>
+          <w:tcPr/>
+          <w:p>
+            <w:pPr>
+              <w:pStyle w:val="Compact"/>
+              <w:jc w:val="left"/>
+            </w:pPr>
+            <w:r>
+              <w:t xml:space="preserve">138</w:t>
+            </w:r>
+          </w:p>
+        </w:tc>
+        <w:tc>
+          <w:tcPr/>
+          <w:p>
+            <w:pPr>
+              <w:pStyle w:val="Compact"/>
+              <w:jc w:val="left"/>
+            </w:pPr>
+            <w:r>
+              <w:t xml:space="preserve">—</w:t>
+            </w:r>
+          </w:p>
+        </w:tc>
+      </w:tr>
+      <w:tr>
+        <w:tc>
+          <w:tcPr/>
+          <w:p>
+            <w:pPr>
+              <w:pStyle w:val="Compact"/>
+              <w:jc w:val="left"/>
+            </w:pPr>
+            <w:r>
+              <w:t xml:space="preserve">By DOI type: GEO</w:t>
+            </w:r>
+          </w:p>
+        </w:tc>
+        <w:tc>
+          <w:tcPr/>
+          <w:p>
+            <w:pPr>
+              <w:pStyle w:val="Compact"/>
+              <w:jc w:val="left"/>
+            </w:pPr>
+            <w:r>
+              <w:t xml:space="preserve">50</w:t>
+            </w:r>
+          </w:p>
+        </w:tc>
+        <w:tc>
+          <w:tcPr/>
+          <w:p>
+            <w:pPr>
+              <w:pStyle w:val="Compact"/>
+              <w:jc w:val="left"/>
+            </w:pPr>
+            <w:r>
+              <w:t xml:space="preserve">—</w:t>
+            </w:r>
+          </w:p>
+        </w:tc>
+      </w:tr>
+      <w:tr>
+        <w:tc>
+          <w:tcPr/>
+          <w:p>
+            <w:pPr>
+              <w:pStyle w:val="Compact"/>
+              <w:jc w:val="left"/>
+            </w:pPr>
+            <w:r>
+              <w:t xml:space="preserve">By DOI type: EXP</w:t>
+            </w:r>
+          </w:p>
+        </w:tc>
+        <w:tc>
+          <w:tcPr/>
+          <w:p>
+            <w:pPr>
+              <w:pStyle w:val="Compact"/>
+              <w:jc w:val="left"/>
+            </w:pPr>
+            <w:r>
+              <w:t xml:space="preserve">65</w:t>
+            </w:r>
+          </w:p>
+        </w:tc>
+        <w:tc>
+          <w:tcPr/>
+          <w:p>
+            <w:pPr>
+              <w:pStyle w:val="Compact"/>
+              <w:jc w:val="left"/>
+            </w:pPr>
+            <w:r>
+              <w:t xml:space="preserve">—</w:t>
+            </w:r>
+          </w:p>
+        </w:tc>
+      </w:tr>
+      <w:tr>
+        <w:tc>
+          <w:tcPr/>
+          <w:p>
+            <w:pPr>
+              <w:pStyle w:val="Compact"/>
+              <w:jc w:val="left"/>
+            </w:pPr>
+            <w:r>
+              <w:t xml:space="preserve">By DOI type: COMP</w:t>
+            </w:r>
+          </w:p>
+        </w:tc>
+        <w:tc>
+          <w:tcPr/>
+          <w:p>
+            <w:pPr>
+              <w:pStyle w:val="Compact"/>
+              <w:jc w:val="left"/>
+            </w:pPr>
+            <w:r>
+              <w:t xml:space="preserve">31</w:t>
+            </w:r>
+          </w:p>
+        </w:tc>
+        <w:tc>
+          <w:tcPr/>
+          <w:p>
+            <w:pPr>
+              <w:pStyle w:val="Compact"/>
+              <w:jc w:val="left"/>
+            </w:pPr>
+            <w:r>
+              <w:t xml:space="preserve">—</w:t>
+            </w:r>
+          </w:p>
+        </w:tc>
+      </w:tr>
+      <w:tr>
+        <w:tc>
+          <w:tcPr/>
+          <w:p>
+            <w:pPr>
+              <w:pStyle w:val="Compact"/>
+              <w:jc w:val="left"/>
+            </w:pPr>
+            <w:r>
+              <w:t xml:space="preserve">By FP type: ACC (accounting)</w:t>
+            </w:r>
+          </w:p>
+        </w:tc>
+        <w:tc>
+          <w:tcPr/>
+          <w:p>
+            <w:pPr>
+              <w:pStyle w:val="Compact"/>
+              <w:jc w:val="left"/>
+            </w:pPr>
+            <w:r>
+              <w:t xml:space="preserve">246</w:t>
+            </w:r>
+          </w:p>
+        </w:tc>
+        <w:tc>
+          <w:tcPr/>
+          <w:p>
+            <w:pPr>
+              <w:pStyle w:val="Compact"/>
+              <w:jc w:val="left"/>
+            </w:pPr>
+            <w:r>
+              <w:t xml:space="preserve">—</w:t>
+            </w:r>
+          </w:p>
+        </w:tc>
+      </w:tr>
+      <w:tr>
+        <w:tc>
+          <w:tcPr/>
+          <w:p>
+            <w:pPr>
+              <w:pStyle w:val="Compact"/>
+              <w:jc w:val="left"/>
+            </w:pPr>
+            <w:r>
+              <w:t xml:space="preserve">By FP type: MKT (market-based)</w:t>
+            </w:r>
+          </w:p>
+        </w:tc>
+        <w:tc>
+          <w:tcPr/>
+          <w:p>
+            <w:pPr>
+              <w:pStyle w:val="Compact"/>
+              <w:jc w:val="left"/>
+            </w:pPr>
+            <w:r>
+              <w:t xml:space="preserve">16</w:t>
+            </w:r>
+          </w:p>
+        </w:tc>
+        <w:tc>
+          <w:tcPr/>
+          <w:p>
+            <w:pPr>
+              <w:pStyle w:val="Compact"/>
+              <w:jc w:val="left"/>
+            </w:pPr>
+            <w:r>
+              <w:t xml:space="preserve">—</w:t>
+            </w:r>
+          </w:p>
+        </w:tc>
+      </w:tr>
+      <w:tr>
+        <w:tc>
+          <w:tcPr/>
+          <w:p>
+            <w:pPr>
+              <w:pStyle w:val="Compact"/>
+              <w:jc w:val="left"/>
+            </w:pPr>
+            <w:r>
+              <w:t xml:space="preserve">By FP type: LAB (labour productivity)</w:t>
+            </w:r>
+          </w:p>
+        </w:tc>
+        <w:tc>
+          <w:tcPr/>
+          <w:p>
+            <w:pPr>
+              <w:pStyle w:val="Compact"/>
+              <w:jc w:val="left"/>
+            </w:pPr>
+            <w:r>
+              <w:t xml:space="preserve">12</w:t>
+            </w:r>
+          </w:p>
+        </w:tc>
+        <w:tc>
+          <w:tcPr/>
+          <w:p>
+            <w:pPr>
+              <w:pStyle w:val="Compact"/>
+              <w:jc w:val="left"/>
+            </w:pPr>
+            <w:r>
+              <w:t xml:space="preserve">—</w:t>
+            </w:r>
+          </w:p>
+        </w:tc>
+      </w:tr>
+      <w:tr>
+        <w:tc>
+          <w:tcPr/>
+          <w:p>
+            <w:pPr>
+              <w:pStyle w:val="Compact"/>
+              <w:jc w:val="left"/>
+            </w:pPr>
+            <w:r>
+              <w:t xml:space="preserve">By FP type: MIX</w:t>
+            </w:r>
+          </w:p>
+        </w:tc>
+        <w:tc>
+          <w:tcPr/>
+          <w:p>
+            <w:pPr>
+              <w:pStyle w:val="Compact"/>
+              <w:jc w:val="left"/>
+            </w:pPr>
+            <w:r>
+              <w:t xml:space="preserve">14</w:t>
+            </w:r>
+          </w:p>
+        </w:tc>
+        <w:tc>
+          <w:tcPr/>
+          <w:p>
+            <w:pPr>
+              <w:pStyle w:val="Compact"/>
+              <w:jc w:val="left"/>
+            </w:pPr>
+            <w:r>
+              <w:t xml:space="preserve">—</w:t>
             </w:r>
           </w:p>
         </w:tc>
@@ -6084,7 +6740,16 @@
         <w:t xml:space="preserve"> </w:t>
       </w:r>
       <w:r>
-        <w:t xml:space="preserve">Row totals exceed</w:t>
+        <w:t xml:space="preserve">Counts from working database (</w:t>
+      </w:r>
+      <w:r>
+        <w:rPr>
+          <w:rStyle w:val="VerbatimChar"/>
+        </w:rPr>
+        <w:t xml:space="preserve">p6/results/forest_data.csv</w:t>
+      </w:r>
+      <w:r>
+        <w:t xml:space="preserve">, K=288 rows, k=238 unique study IDs, updated 15/05/2026). ICRV</w:t>
       </w:r>
       <w:r>
         <w:t xml:space="preserve"> </w:t>
@@ -6100,11 +6765,37 @@
         <w:t xml:space="preserve"> </w:t>
       </w:r>
       <w:r>
-        <w:t xml:space="preserve">= 235 because cross-regime studies contribute to multiple subgroups. Publication year median: 2016 (IQR: 2009–2021).</w:t>
-      </w:r>
-    </w:p>
-    <w:bookmarkEnd w:id="43"/>
-    <w:bookmarkStart w:id="44" w:name="X484949e7994e09bd70500137e9d7c8f884b58c1"/>
+        <w:t xml:space="preserve">and</w:t>
+      </w:r>
+      <w:r>
+        <w:t xml:space="preserve"> </w:t>
+      </w:r>
+      <w:r>
+        <w:rPr>
+          <w:iCs/>
+          <w:i/>
+        </w:rPr>
+        <w:t xml:space="preserve">K</w:t>
+      </w:r>
+      <w:r>
+        <w:t xml:space="preserve"> </w:t>
+      </w:r>
+      <w:r>
+        <w:t xml:space="preserve">counts sum to &gt; total because MX studies may span multiple regimes. cDAI and DPL counts are pre-formal-search; final values will be updated after formal WoS/Scopus search and complete coding. Study (</w:t>
+      </w:r>
+      <w:r>
+        <w:rPr>
+          <w:iCs/>
+          <w:i/>
+        </w:rPr>
+        <w:t xml:space="preserve">k</w:t>
+      </w:r>
+      <w:r>
+        <w:t xml:space="preserve">) counts by cDAI/DPL will be reported after multi-effect deduplication.</w:t>
+      </w:r>
+    </w:p>
+    <w:bookmarkEnd w:id="42"/>
+    <w:bookmarkStart w:id="43" w:name="X484949e7994e09bd70500137e9d7c8f884b58c1"/>
     <w:p>
       <w:pPr>
         <w:pStyle w:val="Heading3"/>
@@ -6435,7 +7126,7 @@
         <w:t xml:space="preserve"> </w:t>
       </w:r>
       <w:r>
-        <w:t xml:space="preserve">(metafor REML, k = 235 studies, K = 285 effects):</w:t>
+        <w:t xml:space="preserve">(metafor REML, pre-formal-search simulation; k = 238 studies, K = 288 effects):</w:t>
       </w:r>
     </w:p>
     <w:tbl>
@@ -6817,8 +7508,8 @@
         <w:t xml:space="preserve">²_(3) = 8.4%) captures the country-context differences that ICRV, cDAI, and DPL phase are designed to explain. Total I² = 62.5%, indicating substantial heterogeneity beyond sampling error — the motivation for moderator analysis.</w:t>
       </w:r>
     </w:p>
-    <w:bookmarkEnd w:id="44"/>
-    <w:bookmarkStart w:id="48" w:name="Xa97dc1af7f7d522b04ad4b6d2a4fed8000451ef"/>
+    <w:bookmarkEnd w:id="43"/>
+    <w:bookmarkStart w:id="47" w:name="Xa97dc1af7f7d522b04ad4b6d2a4fed8000451ef"/>
     <w:p>
       <w:pPr>
         <w:pStyle w:val="Heading3"/>
@@ -7297,18 +7988,18 @@
           <wp:inline>
             <wp:extent cx="5753100" cy="3502261"/>
             <wp:effectExtent b="0" l="0" r="0" t="0"/>
-            <wp:docPr descr="Figure 2: ICRV 5-regime forest plot — subgroup pooled effects with 95% CI" title="" id="46" name="Picture"/>
+            <wp:docPr descr="Figure 2: ICRV 5-regime forest plot — subgroup pooled effects with 95% CI" title="" id="45" name="Picture"/>
             <a:graphic>
               <a:graphicData uri="http://schemas.openxmlformats.org/drawingml/2006/picture">
                 <pic:pic>
                   <pic:nvPicPr>
-                    <pic:cNvPr descr="figures/figure2_icrv_forest.png" id="47" name="Picture"/>
+                    <pic:cNvPr descr="figures/figure2_icrv_forest.png" id="46" name="Picture"/>
                     <pic:cNvPicPr>
                       <a:picLocks noChangeArrowheads="1" noChangeAspect="1"/>
                     </pic:cNvPicPr>
                   </pic:nvPicPr>
                   <pic:blipFill>
-                    <a:blip r:embed="rId45"/>
+                    <a:blip r:embed="rId44"/>
                     <a:stretch>
                       <a:fillRect/>
                     </a:stretch>
@@ -7446,8 +8137,8 @@
         <w:t xml:space="preserve">= 0.21 vs. pooled 0.07). This is consistent with the institutional complementarity argument: in high-quality institutional environments, firms can sustain productive export intensification well beyond levels viable in Emerging or Frontier contexts, where coordination costs accumulate faster (Khanna &amp; Palepu, 2010).</w:t>
       </w:r>
     </w:p>
-    <w:bookmarkEnd w:id="48"/>
-    <w:bookmarkStart w:id="49" w:name="X541c92fe8ae9c523bbb1875dcc9c5525c218523"/>
+    <w:bookmarkEnd w:id="47"/>
+    <w:bookmarkStart w:id="48" w:name="X541c92fe8ae9c523bbb1875dcc9c5525c218523"/>
     <w:p>
       <w:pPr>
         <w:pStyle w:val="Heading3"/>
@@ -7770,8 +8461,8 @@
         <w:t xml:space="preserve">= .61). This confirms the CDCM: national digital infrastructure amplifies I→P only after digital platforms reach maturity sufficient to compress coordination costs — i.e., in the DPL Follow phase (post-2014).</w:t>
       </w:r>
     </w:p>
-    <w:bookmarkEnd w:id="49"/>
-    <w:bookmarkStart w:id="53" w:name="X0f13fb15b20194b37c5b9d050ad7a7079c0644a"/>
+    <w:bookmarkEnd w:id="48"/>
+    <w:bookmarkStart w:id="52" w:name="X0f13fb15b20194b37c5b9d050ad7a7079c0644a"/>
     <w:p>
       <w:pPr>
         <w:pStyle w:val="Heading3"/>
@@ -8214,18 +8905,18 @@
           <wp:inline>
             <wp:extent cx="5753100" cy="4394853"/>
             <wp:effectExtent b="0" l="0" r="0" t="0"/>
-            <wp:docPr descr="Figure 3: DPL phase moderation — pooled I→P effect by digital adoption epoch" title="" id="51" name="Picture"/>
+            <wp:docPr descr="Figure 3: DPL phase moderation — pooled I→P effect by digital adoption epoch" title="" id="50" name="Picture"/>
             <a:graphic>
               <a:graphicData uri="http://schemas.openxmlformats.org/drawingml/2006/picture">
                 <pic:pic>
                   <pic:nvPicPr>
-                    <pic:cNvPr descr="figures/figure3_dpl_phase.png" id="52" name="Picture"/>
+                    <pic:cNvPr descr="figures/figure3_dpl_phase.png" id="51" name="Picture"/>
                     <pic:cNvPicPr>
                       <a:picLocks noChangeArrowheads="1" noChangeAspect="1"/>
                     </pic:cNvPicPr>
                   </pic:nvPicPr>
                   <pic:blipFill>
-                    <a:blip r:embed="rId50"/>
+                    <a:blip r:embed="rId49"/>
                     <a:stretch>
                       <a:fillRect/>
                     </a:stretch>
@@ -8270,8 +8961,8 @@
         <w:t xml:space="preserve">DPL phase subgroup results. Pooled effect sizes by Precede / Span / Follow epoch, with 95% CI. The J-curve pattern (monotonic increase from Precede to Follow) is consistent with H2.</w:t>
       </w:r>
     </w:p>
-    <w:bookmarkEnd w:id="53"/>
-    <w:bookmarkStart w:id="57" w:name="X19c46ecf699f27e790e5a8fa6520cb51f104e4a"/>
+    <w:bookmarkEnd w:id="52"/>
+    <w:bookmarkStart w:id="56" w:name="X19c46ecf699f27e790e5a8fa6520cb51f104e4a"/>
     <w:p>
       <w:pPr>
         <w:pStyle w:val="Heading3"/>
@@ -8387,18 +9078,18 @@
           <wp:inline>
             <wp:extent cx="5753100" cy="4596268"/>
             <wp:effectExtent b="0" l="0" r="0" t="0"/>
-            <wp:docPr descr="Figure 5: Funnel plot with trim-and-fill imputed studies" title="" id="55" name="Picture"/>
+            <wp:docPr descr="Figure 5: Funnel plot with trim-and-fill imputed studies" title="" id="54" name="Picture"/>
             <a:graphic>
               <a:graphicData uri="http://schemas.openxmlformats.org/drawingml/2006/picture">
                 <pic:pic>
                   <pic:nvPicPr>
-                    <pic:cNvPr descr="figures/figure5_funnel_plot.png" id="56" name="Picture"/>
+                    <pic:cNvPr descr="figures/figure5_funnel_plot.png" id="55" name="Picture"/>
                     <pic:cNvPicPr>
                       <a:picLocks noChangeArrowheads="1" noChangeAspect="1"/>
                     </pic:cNvPicPr>
                   </pic:nvPicPr>
                   <pic:blipFill>
-                    <a:blip r:embed="rId54"/>
+                    <a:blip r:embed="rId53"/>
                     <a:stretch>
                       <a:fillRect/>
                     </a:stretch>
@@ -8456,8 +9147,8 @@
         <w:t xml:space="preserve">= 8). Mild left-side asymmetry is visible but does not reverse the positive pooled effect.</w:t>
       </w:r>
     </w:p>
-    <w:bookmarkEnd w:id="57"/>
-    <w:bookmarkStart w:id="61" w:name="X2944bef6cd2d25cd29d80b35f2bf895bc8ca4c2"/>
+    <w:bookmarkEnd w:id="56"/>
+    <w:bookmarkStart w:id="60" w:name="X2944bef6cd2d25cd29d80b35f2bf895bc8ca4c2"/>
     <w:p>
       <w:pPr>
         <w:pStyle w:val="Heading3"/>
@@ -8727,18 +9418,18 @@
           <wp:inline>
             <wp:extent cx="5753100" cy="2528007"/>
             <wp:effectExtent b="0" l="0" r="0" t="0"/>
-            <wp:docPr descr="Figure 4: Leave-one-out sensitivity — pooled r̄ range across leave-one-out iterations" title="" id="59" name="Picture"/>
+            <wp:docPr descr="Figure 4: Leave-one-out sensitivity — pooled r̄ range across leave-one-out iterations" title="" id="58" name="Picture"/>
             <a:graphic>
               <a:graphicData uri="http://schemas.openxmlformats.org/drawingml/2006/picture">
                 <pic:pic>
                   <pic:nvPicPr>
-                    <pic:cNvPr descr="figures/figure4_sensitivity.png" id="60" name="Picture"/>
+                    <pic:cNvPr descr="figures/figure4_sensitivity.png" id="59" name="Picture"/>
                     <pic:cNvPicPr>
                       <a:picLocks noChangeArrowheads="1" noChangeAspect="1"/>
                     </pic:cNvPicPr>
                   </pic:nvPicPr>
                   <pic:blipFill>
-                    <a:blip r:embed="rId58"/>
+                    <a:blip r:embed="rId57"/>
                     <a:stretch>
                       <a:fillRect/>
                     </a:stretch>
@@ -8806,9 +9497,9 @@
         </w:pict>
       </w:r>
     </w:p>
+    <w:bookmarkEnd w:id="60"/>
     <w:bookmarkEnd w:id="61"/>
-    <w:bookmarkEnd w:id="62"/>
-    <w:bookmarkStart w:id="67" w:name="X735612638e4e736e4693e459c258977262c0dfc"/>
+    <w:bookmarkStart w:id="66" w:name="X735612638e4e736e4693e459c258977262c0dfc"/>
     <w:p>
       <w:pPr>
         <w:pStyle w:val="Heading2"/>
@@ -8817,7 +9508,7 @@
         <w:t xml:space="preserve">5. Discussion</w:t>
       </w:r>
     </w:p>
-    <w:bookmarkStart w:id="63" w:name="X358d8a6bfbc612aa554abb1739dd28765579392"/>
+    <w:bookmarkStart w:id="62" w:name="X358d8a6bfbc612aa554abb1739dd28765579392"/>
     <w:p>
       <w:pPr>
         <w:pStyle w:val="Heading3"/>
@@ -9038,8 +9729,8 @@
         <w:t xml:space="preserve">: its amplification effect depends on the institutional quality of the operating environment. The pattern is consistent with the broader Asia-Pacific evidence base (Do &amp; Phan, 2024) and advances the CIMT framework by providing systematic cross-study validation of the regime-contingent I→P mechanism.</w:t>
       </w:r>
     </w:p>
-    <w:bookmarkEnd w:id="63"/>
-    <w:bookmarkStart w:id="64" w:name="X688563909f8febb75275ad832e560c448093230"/>
+    <w:bookmarkEnd w:id="62"/>
+    <w:bookmarkStart w:id="63" w:name="X688563909f8febb75275ad832e560c448093230"/>
     <w:p>
       <w:pPr>
         <w:pStyle w:val="Heading3"/>
@@ -9167,8 +9858,8 @@
         <w:t xml:space="preserve">= .024), concentrated in DPL Follow (post-2014), shows that national digital infrastructure is a contextual amplifier of firm-level internationalization benefits. The result advances Stallkamp and Schotter's (2021) platform-based IB theory by providing the first meta-analytic causal identification.</w:t>
       </w:r>
     </w:p>
-    <w:bookmarkEnd w:id="64"/>
-    <w:bookmarkStart w:id="65" w:name="Xb1fcf2c8d5f0b973be8539a5c4cf4005bf85f3d"/>
+    <w:bookmarkEnd w:id="63"/>
+    <w:bookmarkStart w:id="64" w:name="Xb1fcf2c8d5f0b973be8539a5c4cf4005bf85f3d"/>
     <w:p>
       <w:pPr>
         <w:pStyle w:val="Heading3"/>
@@ -9270,8 +9961,8 @@
         <w:t xml:space="preserve">= 0.21 vs. −0.02) confirms that institutional quality and digital infrastructure investment are prerequisites for export-led productivity growth. Policies targeting both simultaneously — strengthening regulatory quality alongside national digital infrastructure investment — are more likely to shift the turning point outward than either intervention alone.</w:t>
       </w:r>
     </w:p>
-    <w:bookmarkEnd w:id="65"/>
-    <w:bookmarkStart w:id="66" w:name="X0f6e89d87400594fb1abd2d07a881153acd68bb"/>
+    <w:bookmarkEnd w:id="64"/>
+    <w:bookmarkStart w:id="65" w:name="X0f6e89d87400594fb1abd2d07a881153acd68bb"/>
     <w:p>
       <w:pPr>
         <w:pStyle w:val="Heading3"/>
@@ -9375,9 +10066,9 @@
         </w:pict>
       </w:r>
     </w:p>
+    <w:bookmarkEnd w:id="65"/>
     <w:bookmarkEnd w:id="66"/>
-    <w:bookmarkEnd w:id="67"/>
-    <w:bookmarkStart w:id="68" w:name="X6b297cc947e0db5526be369b1f0f4ddc67b2415"/>
+    <w:bookmarkStart w:id="67" w:name="X6b297cc947e0db5526be369b1f0f4ddc67b2415"/>
     <w:p>
       <w:pPr>
         <w:pStyle w:val="Heading2"/>
@@ -9423,7 +10114,7 @@
         <w:t xml:space="preserve"> </w:t>
       </w:r>
       <w:r>
-        <w:t xml:space="preserve">= 235 (K = 285 effects) and introducing three novel moderators: ICRV institutional regime, country-level digital adoption (cDAI), and Digital Paradox Lifecycle phase. The three-level pooled effect (</w:t>
+        <w:t xml:space="preserve">= 238 (K = 288 effects; pre-formal-search) and introducing three novel moderators: ICRV institutional regime, country-level digital adoption (cDAI), and Digital Paradox Lifecycle phase. The three-level pooled effect (</w:t>
       </w:r>
       <w:r>
         <w:rPr>
@@ -9641,7 +10332,7 @@
         <w:t xml:space="preserve"> </w:t>
       </w:r>
       <w:r>
-        <w:t xml:space="preserve">= 235 corpus is Asia-Pacific-weighted, reflecting that region's concentration of WBES-based and emerging-market I→P studies; European and North American studies — where institutional quality is uniformly high and ICRV variation is compressed — are underrepresented, potentially inflating the apparent institutional gradient. Third, the cDAI construct is computed from WBES Tier-1 and Tier-2 adoption items (website presence, digital transaction enabling), capturing foundational digital infrastructure rather than Tier-3 integration or Tier-4 dynamic capability. If advanced digital capability is the true amplifier of I→P, the effects reported here represent a lower bound on the full digitalization–performance moderation.</w:t>
+        <w:t xml:space="preserve">= 238 corpus is Asia-Pacific-weighted, reflecting that region's concentration of WBES-based and emerging-market I→P studies; European and North American studies — where institutional quality is uniformly high and ICRV variation is compressed — are underrepresented, potentially inflating the apparent institutional gradient. Third, the cDAI construct is computed from WBES Tier-1 and Tier-2 adoption items (website presence, digital transaction enabling), capturing foundational digital infrastructure rather than Tier-3 integration or Tier-4 dynamic capability. If advanced digital capability is the true amplifier of I→P, the effects reported here represent a lower bound on the full digitalization–performance moderation.</w:t>
       </w:r>
     </w:p>
     <w:p>
@@ -9687,8 +10378,8 @@
         </w:pict>
       </w:r>
     </w:p>
-    <w:bookmarkEnd w:id="68"/>
-    <w:bookmarkStart w:id="73" w:name="references"/>
+    <w:bookmarkEnd w:id="67"/>
+    <w:bookmarkStart w:id="71" w:name="references"/>
     <w:p>
       <w:pPr>
         <w:pStyle w:val="Heading2"/>
@@ -9984,65 +10675,30 @@
         <w:pStyle w:val="BodyText"/>
       </w:pPr>
       <w:r>
-        <w:t xml:space="preserve">Do, T. H. (2025).</w:t>
-      </w:r>
-      <w:r>
-        <w:t xml:space="preserve"> </w:t>
-      </w:r>
-      <w:r>
-        <w:rPr>
-          <w:iCs/>
-          <w:i/>
-        </w:rPr>
-        <w:t xml:space="preserve">M-AIDA v7.0: Meta-Analysis Intelligent Data Assistant</w:t>
-      </w:r>
-      <w:r>
-        <w:t xml:space="preserve"> </w:t>
-      </w:r>
-      <w:r>
-        <w:t xml:space="preserve">[Software]. Can Tho University.</w:t>
-      </w:r>
-      <w:r>
-        <w:t xml:space="preserve"> </w:t>
-      </w:r>
-      <w:hyperlink r:id="rId69">
-        <w:r>
-          <w:rPr>
-            <w:rStyle w:val="Hyperlink"/>
-          </w:rPr>
-          <w:t xml:space="preserve">https://github.com/thuyhuongctu-cell/maida-core</w:t>
-        </w:r>
-      </w:hyperlink>
+        <w:t xml:space="preserve">Do, T. H., &amp; Phan, A. T. (2024, December).</w:t>
+      </w:r>
+      <w:r>
+        <w:t xml:space="preserve"> </w:t>
+      </w:r>
+      <w:r>
+        <w:rPr>
+          <w:iCs/>
+          <w:i/>
+        </w:rPr>
+        <w:t xml:space="preserve">Internationalization and firm performance: A meta-analysis review</w:t>
+      </w:r>
+      <w:r>
+        <w:t xml:space="preserve"> </w:t>
+      </w:r>
+      <w:r>
+        <w:t xml:space="preserve">[Paper presentation]. The Sixth International Conference on Sustainable Development in Economics, Business, and Finance (ICBEF).</w:t>
+      </w:r>
     </w:p>
     <w:p>
       <w:pPr>
         <w:pStyle w:val="BodyText"/>
       </w:pPr>
       <w:r>
-        <w:t xml:space="preserve">Do, T. H., &amp; Phan, A. T. (2024, December).</w:t>
-      </w:r>
-      <w:r>
-        <w:t xml:space="preserve"> </w:t>
-      </w:r>
-      <w:r>
-        <w:rPr>
-          <w:iCs/>
-          <w:i/>
-        </w:rPr>
-        <w:t xml:space="preserve">Internationalization and firm performance: A meta-analysis review</w:t>
-      </w:r>
-      <w:r>
-        <w:t xml:space="preserve"> </w:t>
-      </w:r>
-      <w:r>
-        <w:t xml:space="preserve">[Paper presentation]. The Sixth International Conference on Sustainable Development in Economics, Business, and Finance (ICBEF).</w:t>
-      </w:r>
-    </w:p>
-    <w:p>
-      <w:pPr>
-        <w:pStyle w:val="BodyText"/>
-      </w:pPr>
-      <w:r>
         <w:t xml:space="preserve">Do, T. H., &amp; Phan, A. T. (2025). Internationalization and firm performance of firms in India: The role of top management. In M. Bartekova (Ed.),</w:t>
       </w:r>
       <w:r>
@@ -10061,7 +10717,7 @@
       <w:r>
         <w:t xml:space="preserve"> </w:t>
       </w:r>
-      <w:hyperlink r:id="rId70">
+      <w:hyperlink r:id="rId68">
         <w:r>
           <w:rPr>
             <w:rStyle w:val="Hyperlink"/>
@@ -10450,7 +11106,7 @@
       <w:r>
         <w:t xml:space="preserve"> </w:t>
       </w:r>
-      <w:hyperlink r:id="rId71">
+      <w:hyperlink r:id="rId69">
         <w:r>
           <w:rPr>
             <w:rStyle w:val="Hyperlink"/>
@@ -10806,7 +11462,7 @@
       <w:r>
         <w:t xml:space="preserve"> </w:t>
       </w:r>
-      <w:hyperlink r:id="rId72">
+      <w:hyperlink r:id="rId70">
         <w:r>
           <w:rPr>
             <w:rStyle w:val="Hyperlink"/>
@@ -10864,8 +11520,8 @@
         </w:pict>
       </w:r>
     </w:p>
-    <w:bookmarkEnd w:id="73"/>
-    <w:bookmarkStart w:id="74" w:name="appendix-a--prisma-2020-flow-diagram"/>
+    <w:bookmarkEnd w:id="71"/>
+    <w:bookmarkStart w:id="72" w:name="appendix-a--prisma-2020-flow-diagram"/>
     <w:p>
       <w:pPr>
         <w:pStyle w:val="Heading2"/>
@@ -10876,13 +11532,31 @@
     </w:p>
     <w:p>
       <w:pPr>
+        <w:pStyle w:val="BlockText"/>
+      </w:pPr>
+      <w:r>
+        <w:rPr>
+          <w:bCs/>
+          <w:b/>
+        </w:rPr>
+        <w:t xml:space="preserve">⚠️ All counts marked [TBD] will be confirmed after formal WoS + Scopus search.</w:t>
+      </w:r>
+      <w:r>
+        <w:t xml:space="preserve"> </w:t>
+      </w:r>
+      <w:r>
+        <w:t xml:space="preserve">The diagram below follows PRISMA 2020 (Page et al., 2021).</w:t>
+      </w:r>
+    </w:p>
+    <w:p>
+      <w:pPr>
         <w:pStyle w:val="SourceCode"/>
       </w:pPr>
       <w:r>
         <w:rPr>
           <w:rStyle w:val="VerbatimChar"/>
         </w:rPr>
-        <w:t xml:space="preserve">Records identified (WoS + Scopus): 4,812</w:t>
+        <w:t xml:space="preserve">IDENTIFICATION</w:t>
       </w:r>
       <w:r>
         <w:br/>
@@ -10891,7 +11565,7 @@
         <w:rPr>
           <w:rStyle w:val="VerbatimChar"/>
         </w:rPr>
-        <w:t xml:space="preserve">├── Duplicates removed: 1,708</w:t>
+        <w:t xml:space="preserve">─────────────────────────────────────────────────────────────────</w:t>
       </w:r>
       <w:r>
         <w:br/>
@@ -10900,7 +11574,7 @@
         <w:rPr>
           <w:rStyle w:val="VerbatimChar"/>
         </w:rPr>
-        <w:t xml:space="preserve">└── Unique records: 3,104</w:t>
+        <w:t xml:space="preserve">Records from electronic databases (WoS Core Collection + Scopus):</w:t>
       </w:r>
       <w:r>
         <w:br/>
@@ -10909,7 +11583,7 @@
         <w:rPr>
           <w:rStyle w:val="VerbatimChar"/>
         </w:rPr>
-        <w:t xml:space="preserve">    ├── Title/abstract excluded: 2,212</w:t>
+        <w:t xml:space="preserve">  [n = TBD]</w:t>
       </w:r>
       <w:r>
         <w:br/>
@@ -10918,7 +11592,7 @@
         <w:rPr>
           <w:rStyle w:val="VerbatimChar"/>
         </w:rPr>
-        <w:t xml:space="preserve">    └── Full-text assessed: 892</w:t>
+        <w:t xml:space="preserve">Records from supplementary methods</w:t>
       </w:r>
       <w:r>
         <w:br/>
@@ -10927,7 +11601,7 @@
         <w:rPr>
           <w:rStyle w:val="VerbatimChar"/>
         </w:rPr>
-        <w:t xml:space="preserve">        ├── Excluded (no convertible ES): 580</w:t>
+        <w:t xml:space="preserve">  Backward citation scan (5 anchor meta-analyses): [n = TBD]</w:t>
       </w:r>
       <w:r>
         <w:br/>
@@ -10936,7 +11610,7 @@
         <w:rPr>
           <w:rStyle w:val="VerbatimChar"/>
         </w:rPr>
-        <w:t xml:space="preserve">        └── Included: 312</w:t>
+        <w:t xml:space="preserve">  Hand-search (author's corpus, 2020–2026): n = 19</w:t>
       </w:r>
       <w:r>
         <w:br/>
@@ -10945,7 +11619,7 @@
         <w:rPr>
           <w:rStyle w:val="VerbatimChar"/>
         </w:rPr>
-        <w:t xml:space="preserve">            ├── Effect size extraction failed: 77</w:t>
+        <w:t xml:space="preserve">  ──────────────────────────────────────</w:t>
       </w:r>
       <w:r>
         <w:br/>
@@ -10954,7 +11628,232 @@
         <w:rPr>
           <w:rStyle w:val="VerbatimChar"/>
         </w:rPr>
-        <w:t xml:space="preserve">            └── Final sample: k = 235 studies (≈385 effect sizes)</w:t>
+        <w:t xml:space="preserve">  Total identified: [N = TBD]</w:t>
+      </w:r>
+      <w:r>
+        <w:br/>
+      </w:r>
+      <w:r>
+        <w:br/>
+      </w:r>
+      <w:r>
+        <w:rPr>
+          <w:rStyle w:val="VerbatimChar"/>
+        </w:rPr>
+        <w:t xml:space="preserve">SCREENING — Level 1 (Title / Abstract)</w:t>
+      </w:r>
+      <w:r>
+        <w:br/>
+      </w:r>
+      <w:r>
+        <w:rPr>
+          <w:rStyle w:val="VerbatimChar"/>
+        </w:rPr>
+        <w:t xml:space="preserve">─────────────────────────────────────────────────────────────────</w:t>
+      </w:r>
+      <w:r>
+        <w:br/>
+      </w:r>
+      <w:r>
+        <w:rPr>
+          <w:rStyle w:val="VerbatimChar"/>
+        </w:rPr>
+        <w:t xml:space="preserve">After deduplication: [n = TBD]</w:t>
+      </w:r>
+      <w:r>
+        <w:br/>
+      </w:r>
+      <w:r>
+        <w:rPr>
+          <w:rStyle w:val="VerbatimChar"/>
+        </w:rPr>
+        <w:t xml:space="preserve">  Excluded (title/abstract screen): [n = TBD]</w:t>
+      </w:r>
+      <w:r>
+        <w:br/>
+      </w:r>
+      <w:r>
+        <w:rPr>
+          <w:rStyle w:val="VerbatimChar"/>
+        </w:rPr>
+        <w:t xml:space="preserve">    - Does not examine I→P relationship: [n = TBD]</w:t>
+      </w:r>
+      <w:r>
+        <w:br/>
+      </w:r>
+      <w:r>
+        <w:rPr>
+          <w:rStyle w:val="VerbatimChar"/>
+        </w:rPr>
+        <w:t xml:space="preserve">    - Not firm-level analysis: [n = TBD]</w:t>
+      </w:r>
+      <w:r>
+        <w:br/>
+      </w:r>
+      <w:r>
+        <w:rPr>
+          <w:rStyle w:val="VerbatimChar"/>
+        </w:rPr>
+        <w:t xml:space="preserve">    - Non-English, no convertible ES in abstract: [n = TBD]</w:t>
+      </w:r>
+      <w:r>
+        <w:br/>
+      </w:r>
+      <w:r>
+        <w:rPr>
+          <w:rStyle w:val="VerbatimChar"/>
+        </w:rPr>
+        <w:t xml:space="preserve">    - Qualitative / conceptual only: [n = TBD]</w:t>
+      </w:r>
+      <w:r>
+        <w:br/>
+      </w:r>
+      <w:r>
+        <w:rPr>
+          <w:rStyle w:val="VerbatimChar"/>
+        </w:rPr>
+        <w:t xml:space="preserve">  Retained for full-text review: [n = TBD]</w:t>
+      </w:r>
+      <w:r>
+        <w:br/>
+      </w:r>
+      <w:r>
+        <w:br/>
+      </w:r>
+      <w:r>
+        <w:rPr>
+          <w:rStyle w:val="VerbatimChar"/>
+        </w:rPr>
+        <w:t xml:space="preserve">ELIGIBILITY — Level 2 (Full Text)</w:t>
+      </w:r>
+      <w:r>
+        <w:br/>
+      </w:r>
+      <w:r>
+        <w:rPr>
+          <w:rStyle w:val="VerbatimChar"/>
+        </w:rPr>
+        <w:t xml:space="preserve">─────────────────────────────────────────────────────────────────</w:t>
+      </w:r>
+      <w:r>
+        <w:br/>
+      </w:r>
+      <w:r>
+        <w:rPr>
+          <w:rStyle w:val="VerbatimChar"/>
+        </w:rPr>
+        <w:t xml:space="preserve">Full texts assessed: [n = TBD]</w:t>
+      </w:r>
+      <w:r>
+        <w:br/>
+      </w:r>
+      <w:r>
+        <w:rPr>
+          <w:rStyle w:val="VerbatimChar"/>
+        </w:rPr>
+        <w:t xml:space="preserve">  Excluded: [n = TBD]</w:t>
+      </w:r>
+      <w:r>
+        <w:br/>
+      </w:r>
+      <w:r>
+        <w:rPr>
+          <w:rStyle w:val="VerbatimChar"/>
+        </w:rPr>
+        <w:t xml:space="preserve">    - No effect size convertible to r: [n = TBD]</w:t>
+      </w:r>
+      <w:r>
+        <w:br/>
+      </w:r>
+      <w:r>
+        <w:rPr>
+          <w:rStyle w:val="VerbatimChar"/>
+        </w:rPr>
+        <w:t xml:space="preserve">    - No DOI measure meeting PICO I criterion: [n = TBD]</w:t>
+      </w:r>
+      <w:r>
+        <w:br/>
+      </w:r>
+      <w:r>
+        <w:rPr>
+          <w:rStyle w:val="VerbatimChar"/>
+        </w:rPr>
+        <w:t xml:space="preserve">    - State-owned enterprise / government-controlled sample: [n = TBD]</w:t>
+      </w:r>
+      <w:r>
+        <w:br/>
+      </w:r>
+      <w:r>
+        <w:rPr>
+          <w:rStyle w:val="VerbatimChar"/>
+        </w:rPr>
+        <w:t xml:space="preserve">    - Duplicate sample (smaller/older retained for exclusion): [n = TBD]</w:t>
+      </w:r>
+      <w:r>
+        <w:br/>
+      </w:r>
+      <w:r>
+        <w:rPr>
+          <w:rStyle w:val="VerbatimChar"/>
+        </w:rPr>
+        <w:t xml:space="preserve">    - Meta-analysis or review (not primary study): [n = TBD]</w:t>
+      </w:r>
+      <w:r>
+        <w:br/>
+      </w:r>
+      <w:r>
+        <w:rPr>
+          <w:rStyle w:val="VerbatimChar"/>
+        </w:rPr>
+        <w:t xml:space="preserve">    - Conference paper / thesis / working paper: [n = TBD]</w:t>
+      </w:r>
+      <w:r>
+        <w:br/>
+      </w:r>
+      <w:r>
+        <w:br/>
+      </w:r>
+      <w:r>
+        <w:rPr>
+          <w:rStyle w:val="VerbatimChar"/>
+        </w:rPr>
+        <w:t xml:space="preserve">INCLUDED</w:t>
+      </w:r>
+      <w:r>
+        <w:br/>
+      </w:r>
+      <w:r>
+        <w:rPr>
+          <w:rStyle w:val="VerbatimChar"/>
+        </w:rPr>
+        <w:t xml:space="preserve">─────────────────────────────────────────────────────────────────</w:t>
+      </w:r>
+      <w:r>
+        <w:br/>
+      </w:r>
+      <w:r>
+        <w:rPr>
+          <w:rStyle w:val="VerbatimChar"/>
+        </w:rPr>
+        <w:t xml:space="preserve">Studies included in meta-analysis: k = [TBD]</w:t>
+      </w:r>
+      <w:r>
+        <w:br/>
+      </w:r>
+      <w:r>
+        <w:rPr>
+          <w:rStyle w:val="VerbatimChar"/>
+        </w:rPr>
+        <w:t xml:space="preserve">Effect sizes coded: K = [TBD]</w:t>
+      </w:r>
+      <w:r>
+        <w:br/>
+      </w:r>
+      <w:r>
+        <w:rPr>
+          <w:rStyle w:val="VerbatimChar"/>
+        </w:rPr>
+        <w:t xml:space="preserve">  (Current working database prior to formal search: k = 238, K = 288)</w:t>
       </w:r>
     </w:p>
     <w:p>
@@ -10966,29 +11865,7 @@
           <w:iCs/>
           <w:i/>
         </w:rPr>
-        <w:t xml:space="preserve">Reasons for full-text exclusion (top 3):</w:t>
-      </w:r>
-      <w:r>
-        <w:t xml:space="preserve"> </w:t>
-      </w:r>
-      <w:r>
-        <w:t xml:space="preserve">(1) No effect size convertible to</w:t>
-      </w:r>
-      <w:r>
-        <w:t xml:space="preserve"> </w:t>
-      </w:r>
-      <w:r>
-        <w:rPr>
-          <w:iCs/>
-          <w:i/>
-        </w:rPr>
-        <w:t xml:space="preserve">r</w:t>
-      </w:r>
-      <w:r>
-        <w:t xml:space="preserve"> </w:t>
-      </w:r>
-      <w:r>
-        <w:t xml:space="preserve">(n = 324); (2) No IB internationalization measure (n = 189); (3) State-owned enterprise sample only (n = 67).</w:t>
+        <w:t xml:space="preserve">The PRISMA checklist (Page et al., 2021) is available from the corresponding author.</w:t>
       </w:r>
     </w:p>
     <w:p>
@@ -10998,8 +11875,8 @@
         </w:pict>
       </w:r>
     </w:p>
-    <w:bookmarkEnd w:id="74"/>
-    <w:bookmarkStart w:id="75" w:name="appendix-b--coding-protocol-7-moderators"/>
+    <w:bookmarkEnd w:id="72"/>
+    <w:bookmarkStart w:id="73" w:name="appendix-b--coding-protocol-7-moderators"/>
     <w:p>
       <w:pPr>
         <w:pStyle w:val="Heading2"/>
@@ -11082,7 +11959,7 @@
               <w:jc w:val="left"/>
             </w:pPr>
             <w:r>
-              <w:t xml:space="preserve">Categorical (5)</w:t>
+              <w:t xml:space="preserve">Categorical (6 codes)</w:t>
             </w:r>
           </w:p>
         </w:tc>
@@ -11335,8 +12212,8 @@
         </w:pict>
       </w:r>
     </w:p>
-    <w:bookmarkEnd w:id="75"/>
-    <w:bookmarkStart w:id="76" w:name="X268400b3423c0b4852b72f307f2ef855f61e7ea"/>
+    <w:bookmarkEnd w:id="73"/>
+    <w:bookmarkStart w:id="74" w:name="X268400b3423c0b4852b72f307f2ef855f61e7ea"/>
     <w:p>
       <w:pPr>
         <w:pStyle w:val="Heading2"/>
@@ -11402,7 +12279,7 @@
               <w:jc w:val="left"/>
             </w:pPr>
             <w:r>
-              <w:t xml:space="preserve">metafor REML (3-level, k=235)</w:t>
+              <w:t xml:space="preserve">metafor REML (3-level, k=238)</w:t>
             </w:r>
           </w:p>
         </w:tc>
@@ -11671,7 +12548,7 @@
               <w:jc w:val="left"/>
             </w:pPr>
             <w:r>
-              <w:t xml:space="preserve">235</w:t>
+              <w:t xml:space="preserve">238</w:t>
             </w:r>
           </w:p>
         </w:tc>
@@ -11719,7 +12596,7 @@
               <w:jc w:val="left"/>
             </w:pPr>
             <w:r>
-              <w:t xml:space="preserve">285</w:t>
+              <w:t xml:space="preserve">288 (pre-formal-search)</w:t>
             </w:r>
           </w:p>
         </w:tc>
@@ -11854,7 +12731,7 @@
         <w:t xml:space="preserve"> </w:t>
       </w:r>
       <w:r>
-        <w:t xml:space="preserve">Lower total I² in the three-level model (62.5% vs. 87.92%) reflects the expanded k = 235 sample where the additional studies reduce unexplained heterogeneity and the three-level structure partitions it correctly. The narrower 95% CI in the three-level model reflects the precision gain from 235 vs. 113 studies. The three-level model is theoretically preferred as it accounts for multiple effect sizes nested within studies.</w:t>
+        <w:t xml:space="preserve">Lower total I² in the three-level model (62.5% vs. 87.92%) reflects the expanded k = 238 sample where the additional studies reduce unexplained heterogeneity and the three-level structure partitions it correctly. The narrower 95% CI in the three-level model reflects the precision gain from 238 vs. 113 studies. The three-level model is theoretically preferred as it accounts for multiple effect sizes nested within studies.</w:t>
       </w:r>
     </w:p>
     <w:p>
@@ -11883,11 +12760,11 @@
           <w:iCs/>
           <w:i/>
         </w:rPr>
-        <w:t xml:space="preserve">Target journal: Asia Pacific Journal of Management (APJM, Springer, IF ≈ 4.5, ABDC-B). APJM requires 7,000–9,000 words for empirical articles; the manuscript is within range after the §3 expansion. Results §4.3–4.5 will be expanded with confirmed metafor output once formal effect-size extraction from p6_study_database_coded.md is complete using M-AIDA v7.0 (Do, 2025). IBR was considered but APJM is better suited given the explicit Asia-Pacific institutional focus and the ICRV taxonomy.</w:t>
-      </w:r>
-    </w:p>
-    <w:bookmarkEnd w:id="76"/>
-    <w:bookmarkEnd w:id="77"/>
+        <w:t xml:space="preserve">Target journal: International Business Review (IBR, Elsevier, IF ≈ 5.5, ABS-3). IBR requires 8,000–10,000 words for empirical articles; the manuscript will reach range after §3–§4 expansion with confirmed metafor output once formal effect-size extraction from p6_study_database_coded.md is complete using the standardized coding protocol (Appendix B).</w:t>
+      </w:r>
+    </w:p>
+    <w:bookmarkEnd w:id="74"/>
+    <w:bookmarkEnd w:id="75"/>
     <w:sectPr>
       <w:pgSz w:h="16838" w:w="11906"/>
       <w:pgMar w:bottom="1417" w:left="1417" w:right="1417" w:top="1417"/>
@@ -12195,36 +13072,6 @@
     </w:lvlOverride>
   </w:num>
   <w:num w:numId="1003">
-    <w:abstractNumId w:val="99411"/>
-    <w:lvlOverride w:ilvl="0">
-      <w:startOverride w:val="1"/>
-    </w:lvlOverride>
-    <w:lvlOverride w:ilvl="1">
-      <w:startOverride w:val="1"/>
-    </w:lvlOverride>
-    <w:lvlOverride w:ilvl="2">
-      <w:startOverride w:val="1"/>
-    </w:lvlOverride>
-    <w:lvlOverride w:ilvl="3">
-      <w:startOverride w:val="1"/>
-    </w:lvlOverride>
-    <w:lvlOverride w:ilvl="4">
-      <w:startOverride w:val="1"/>
-    </w:lvlOverride>
-    <w:lvlOverride w:ilvl="5">
-      <w:startOverride w:val="1"/>
-    </w:lvlOverride>
-    <w:lvlOverride w:ilvl="6">
-      <w:startOverride w:val="1"/>
-    </w:lvlOverride>
-    <w:lvlOverride w:ilvl="7">
-      <w:startOverride w:val="1"/>
-    </w:lvlOverride>
-    <w:lvlOverride w:ilvl="8">
-      <w:startOverride w:val="1"/>
-    </w:lvlOverride>
-  </w:num>
-  <w:num w:numId="1004">
     <w:abstractNumId w:val="99411"/>
     <w:lvlOverride w:ilvl="0">
       <w:startOverride w:val="1"/>

</xml_diff>

<commit_message>
refactor(p6): optimize included sample (k=278) + propagate to all outputs
Per inclusion-criteria optimization: (1) corrected an erroneous Gerpott
2005 effect (r=-0.61 -> 0.06; the full text reports a near-zero, ns
DOI-performance correlation, prior value was a bad auto-extraction);
(2) applied a-priori n>=30 minimum (dropped 2 low-precision effects).

Final analytic sample k=278, K=328. Re-ran MARA: r=0.076 [0.063,0.089],
I2=65.9% (within 57.1% >> between 8.8%). Consequential change: ICRV
omnibus now Q_M=9.46, p=.051 -> H1 reframed from "confirmed" to "not
supported (marginal)"; cDAI (Q_M=0.23) and DPL (Q_M=0.47) remain null.
Begg tau=-0.119 p=.001, Egger p=.059, trim-fill adj r=0.041.

Propagated to: EN manuscript (Results/Abstract/Intro/Discussion/Conclusion/
appendices), VI manuscript (v2.5), figures 2-5, and rebuilt blinded IBR DOCX.
</commit_message>
<xml_diff>
--- a/p6/submission/ibr_package/01_manuscript_blinded.docx
+++ b/p6/submission/ibr_package/01_manuscript_blinded.docx
@@ -74,7 +74,7 @@
         <w:t xml:space="preserve"> </w:t>
       </w:r>
       <w:r>
-        <w:t xml:space="preserve">= 280 studies with</w:t>
+        <w:t xml:space="preserve">= 278 studies with</w:t>
       </w:r>
       <w:r>
         <w:t xml:space="preserve"> </w:t>
@@ -90,7 +90,7 @@
         <w:t xml:space="preserve"> </w:t>
       </w:r>
       <w:r>
-        <w:t xml:space="preserve">= 330 effect sizes. Three-level MARA (Cheung, 2014; Van den Noortgate et al., 2013) decomposes heterogeneity into within-study (</w:t>
+        <w:t xml:space="preserve">= 328 effect sizes. Three-level MARA (Cheung, 2014; Van den Noortgate et al., 2013) decomposes heterogeneity into within-study (</w:t>
       </w:r>
       <w:r>
         <w:rPr>
@@ -142,7 +142,7 @@
         <w:t xml:space="preserve"> </w:t>
       </w:r>
       <w:r>
-        <w:t xml:space="preserve">= 0.075 (95% CI [0.062, 0.089],</w:t>
+        <w:t xml:space="preserve">= 0.076 (95% CI [0.063, 0.089],</w:t>
       </w:r>
       <w:r>
         <w:t xml:space="preserve"> </w:t>
@@ -171,7 +171,7 @@
         <w:t xml:space="preserve">I</w:t>
       </w:r>
       <w:r>
-        <w:t xml:space="preserve">² = 65.5%, of which the within-study level dominates (Level 2 = 56.6%; Level 3 = 8.9%), replicating and extending the ICBEF 2025 baseline (</w:t>
+        <w:t xml:space="preserve">² = 65.9%, of which the within-study level dominates (Level 2 = 57.1%; Level 3 = 8.8%), replicating and extending the ICBEF 2025 baseline (</w:t>
       </w:r>
       <w:r>
         <w:rPr>
@@ -200,7 +200,7 @@
         <w:t xml:space="preserve"> </w:t>
       </w:r>
       <w:r>
-        <w:t xml:space="preserve">= 113). The three hypothesized moderators show limited support: ICRV regime differences are statistically significant (</w:t>
+        <w:t xml:space="preserve">= 113). The three hypothesized moderators show limited support: ICRV regime differences fall just short of significance (</w:t>
       </w:r>
       <w:r>
         <w:rPr>
@@ -210,7 +210,7 @@
         <w:t xml:space="preserve">Q</w:t>
       </w:r>
       <w:r>
-        <w:t xml:space="preserve">_M = 9.81,</w:t>
+        <w:t xml:space="preserve">_M = 9.46,</w:t>
       </w:r>
       <w:r>
         <w:t xml:space="preserve"> </w:t>
@@ -242,7 +242,7 @@
         <w:t xml:space="preserve"> </w:t>
       </w:r>
       <w:r>
-        <w:t xml:space="preserve">= .044) but are driven by a small, high-effect Frontier cell (</w:t>
+        <w:t xml:space="preserve">= .051) and, where present, are driven by a small, high-effect Frontier cell (</w:t>
       </w:r>
       <w:r>
         <w:rPr>
@@ -265,7 +265,7 @@
         <w:t xml:space="preserve">Q</w:t>
       </w:r>
       <w:r>
-        <w:t xml:space="preserve">_M = 0.19,</w:t>
+        <w:t xml:space="preserve">_M = 0.23,</w:t>
       </w:r>
       <w:r>
         <w:t xml:space="preserve"> </w:t>
@@ -281,7 +281,7 @@
         <w:t xml:space="preserve"> </w:t>
       </w:r>
       <w:r>
-        <w:t xml:space="preserve">= .911 and</w:t>
+        <w:t xml:space="preserve">= .893 and</w:t>
       </w:r>
       <w:r>
         <w:t xml:space="preserve"> </w:t>
@@ -294,7 +294,7 @@
         <w:t xml:space="preserve">Q</w:t>
       </w:r>
       <w:r>
-        <w:t xml:space="preserve">_M = 0.80,</w:t>
+        <w:t xml:space="preserve">_M = 0.47,</w:t>
       </w:r>
       <w:r>
         <w:t xml:space="preserve"> </w:t>
@@ -310,7 +310,7 @@
         <w:t xml:space="preserve"> </w:t>
       </w:r>
       <w:r>
-        <w:t xml:space="preserve">= .671, respectively). Publication-bias evidence is mixed: Begg's test (τ = −0.116,</w:t>
+        <w:t xml:space="preserve">= .789, respectively). Publication-bias evidence is mixed: Begg's test (τ = −0.119,</w:t>
       </w:r>
       <w:r>
         <w:t xml:space="preserve"> </w:t>
@@ -326,7 +326,7 @@
         <w:t xml:space="preserve"> </w:t>
       </w:r>
       <w:r>
-        <w:t xml:space="preserve">= .002) and trim-and-fill (</w:t>
+        <w:t xml:space="preserve">= .001) and trim-and-fill (</w:t>
       </w:r>
       <w:r>
         <w:rPr>
@@ -352,7 +352,7 @@
         <w:t xml:space="preserve"> </w:t>
       </w:r>
       <w:r>
-        <w:t xml:space="preserve">= 0.040, 95% CI [0.029, 0.051]) indicate left-side asymmetry, while Egger's regression is only marginal (</w:t>
+        <w:t xml:space="preserve">= 0.041, 95% CI [0.030, 0.052]) indicate left-side asymmetry, while Egger's regression is only marginal (</w:t>
       </w:r>
       <w:r>
         <w:rPr>
@@ -365,7 +365,23 @@
         <w:t xml:space="preserve"> </w:t>
       </w:r>
       <w:r>
-        <w:t xml:space="preserve">= .069).</w:t>
+        <w:t xml:space="preserve">= .059). The adjusted</w:t>
+      </w:r>
+      <w:r>
+        <w:t xml:space="preserve"> </w:t>
+      </w:r>
+      <w:r>
+        <w:rPr>
+          <w:iCs/>
+          <w:i/>
+        </w:rPr>
+        <w:t xml:space="preserve">r̄</w:t>
+      </w:r>
+      <w:r>
+        <w:t xml:space="preserve"> </w:t>
+      </w:r>
+      <w:r>
+        <w:t xml:space="preserve">is 0.041 (95% CI [0.030, 0.052]).</w:t>
       </w:r>
       <w:r>
         <w:t xml:space="preserve"> </w:t>
@@ -397,7 +413,10 @@
         <w:t xml:space="preserve"> </w:t>
       </w:r>
       <w:r>
-        <w:t xml:space="preserve">= 280 studies from economies worldwide, and the first to formally test ICRV, cDAI, and DPL phase as moderators. H1 is confirmed (</w:t>
+        <w:t xml:space="preserve">= 278 studies from economies worldwide, and the first to formally test ICRV, cDAI, and DPL phase as moderators. None of the three hypothesised moderators is confirmed (ICRV</w:t>
+      </w:r>
+      <w:r>
+        <w:t xml:space="preserve"> </w:t>
       </w:r>
       <w:r>
         <w:rPr>
@@ -407,7 +426,7 @@
         <w:t xml:space="preserve">Q</w:t>
       </w:r>
       <w:r>
-        <w:t xml:space="preserve">_M = 9.81,</w:t>
+        <w:t xml:space="preserve">_M = 9.46,</w:t>
       </w:r>
       <w:r>
         <w:t xml:space="preserve"> </w:t>
@@ -423,7 +442,7 @@
         <w:t xml:space="preserve"> </w:t>
       </w:r>
       <w:r>
-        <w:t xml:space="preserve">= .044), while the directional gradient (E1a/E1b) and the cDAI and DPL hypotheses remain unconfirmed — a pattern that, combined with the dominance of within-study heterogeneity and modest publication bias, reframes the heterogeneity puzzle: unexplained variance in I→P arises chiefly from analytic choices</w:t>
+        <w:t xml:space="preserve">= .051, marginal; cDAI and DPL clearly null), and the directional gradient (E1a/E1b) is not supported — a pattern that, combined with the dominance of within-study heterogeneity and modest publication bias, reframes the heterogeneity puzzle: unexplained variance in I→P arises chiefly from analytic choices</w:t>
       </w:r>
       <w:r>
         <w:t xml:space="preserve"> </w:t>
@@ -663,7 +682,7 @@
         <w:t xml:space="preserve"> </w:t>
       </w:r>
       <w:r>
-        <w:t xml:space="preserve">= 280, combined with three-level MARA that decomposes heterogeneity beyond what random-effects models allow.</w:t>
+        <w:t xml:space="preserve">= 278, combined with three-level MARA that decomposes heterogeneity beyond what random-effects models allow.</w:t>
       </w:r>
     </w:p>
     <w:p>
@@ -736,7 +755,7 @@
         <w:t xml:space="preserve"> </w:t>
       </w:r>
       <w:r>
-        <w:t xml:space="preserve">= 280); (5) first formal test of cDAI as a national-level digital-infrastructure moderator of I→P; (6) first test of DPL phase as a temporal moderator using three-level MARA. The non-confirmation of E1a/E1b, H2, and H3, and the anomalous ICRV Frontier pattern, are themselves informative findings that bound the conditions under which these moderators could operate.</w:t>
+        <w:t xml:space="preserve">= 278); (5) first formal test of cDAI as a national-level digital-infrastructure moderator of I→P; (6) first test of DPL phase as a temporal moderator using three-level MARA. The non-confirmation of E1a/E1b, H2, and H3, and the anomalous ICRV Frontier pattern, are themselves informative findings that bound the conditions under which these moderators could operate.</w:t>
       </w:r>
     </w:p>
     <w:p>
@@ -767,7 +786,7 @@
         <w:t xml:space="preserve"> </w:t>
       </w:r>
       <w:r>
-        <w:t xml:space="preserve">= 0.075,</w:t>
+        <w:t xml:space="preserve">= 0.076,</w:t>
       </w:r>
       <w:r>
         <w:t xml:space="preserve"> </w:t>
@@ -783,7 +802,7 @@
         <w:t xml:space="preserve"> </w:t>
       </w:r>
       <w:r>
-        <w:t xml:space="preserve">= 280,</w:t>
+        <w:t xml:space="preserve">= 278,</w:t>
       </w:r>
       <w:r>
         <w:t xml:space="preserve"> </w:t>
@@ -799,7 +818,7 @@
         <w:t xml:space="preserve"> </w:t>
       </w:r>
       <w:r>
-        <w:t xml:space="preserve">= 330) replicates and extends the ICBEF 2025 finding (</w:t>
+        <w:t xml:space="preserve">= 328) replicates and extends the ICBEF 2025 finding (</w:t>
       </w:r>
       <w:r>
         <w:rPr>
@@ -828,7 +847,23 @@
         <w:t xml:space="preserve"> </w:t>
       </w:r>
       <w:r>
-        <w:t xml:space="preserve">= 113), confirming a small but consistent positive I→P relationship globally. H1 (between-regime Q_M test) is confirmed (</w:t>
+        <w:t xml:space="preserve">= 113), confirming a small but consistent positive I→P relationship globally. H1 (between-regime Q_M test) is</w:t>
+      </w:r>
+      <w:r>
+        <w:t xml:space="preserve"> </w:t>
+      </w:r>
+      <w:r>
+        <w:rPr>
+          <w:bCs/>
+          <w:b/>
+        </w:rPr>
+        <w:t xml:space="preserve">not</w:t>
+      </w:r>
+      <w:r>
+        <w:t xml:space="preserve"> </w:t>
+      </w:r>
+      <w:r>
+        <w:t xml:space="preserve">confirmed — the omnibus is marginal (</w:t>
       </w:r>
       <w:r>
         <w:rPr>
@@ -838,7 +873,7 @@
         <w:t xml:space="preserve">Q</w:t>
       </w:r>
       <w:r>
-        <w:t xml:space="preserve">_M = 9.81,</w:t>
+        <w:t xml:space="preserve">_M = 9.46,</w:t>
       </w:r>
       <w:r>
         <w:t xml:space="preserve"> </w:t>
@@ -854,7 +889,7 @@
         <w:t xml:space="preserve"> </w:t>
       </w:r>
       <w:r>
-        <w:t xml:space="preserve">= .044); however, the directional Exploratory Propositions E1a (Advanced largest) and E1b (Frontier smallest) are not confirmed — the omnibus effect is driven by a small, high-effect Frontier cell (</w:t>
+        <w:t xml:space="preserve">= .051) and, where non-trivial, is driven by a small, high-effect Frontier cell (</w:t>
       </w:r>
       <w:r>
         <w:rPr>
@@ -867,7 +902,7 @@
         <w:t xml:space="preserve"> </w:t>
       </w:r>
       <w:r>
-        <w:t xml:space="preserve">= 4) rather than a monotone institutional gradient. cDAI (</w:t>
+        <w:t xml:space="preserve">= 4) rather than a monotone institutional gradient; the directional Exploratory Propositions E1a/E1b are likewise unsupported. cDAI (</w:t>
       </w:r>
       <w:r>
         <w:rPr>
@@ -877,7 +912,7 @@
         <w:t xml:space="preserve">Q</w:t>
       </w:r>
       <w:r>
-        <w:t xml:space="preserve">_M = 0.19,</w:t>
+        <w:t xml:space="preserve">_M = 0.23,</w:t>
       </w:r>
       <w:r>
         <w:t xml:space="preserve"> </w:t>
@@ -893,7 +928,7 @@
         <w:t xml:space="preserve"> </w:t>
       </w:r>
       <w:r>
-        <w:t xml:space="preserve">= .911) and DPL phase (</w:t>
+        <w:t xml:space="preserve">= .893) and DPL phase (</w:t>
       </w:r>
       <w:r>
         <w:rPr>
@@ -903,7 +938,7 @@
         <w:t xml:space="preserve">Q</w:t>
       </w:r>
       <w:r>
-        <w:t xml:space="preserve">_M = 0.80,</w:t>
+        <w:t xml:space="preserve">_M = 0.47,</w:t>
       </w:r>
       <w:r>
         <w:t xml:space="preserve"> </w:t>
@@ -919,7 +954,7 @@
         <w:t xml:space="preserve"> </w:t>
       </w:r>
       <w:r>
-        <w:t xml:space="preserve">= .671) are non-significant (H2, H3 not supported). Publication-bias diagnostics are mixed: Begg's test and trim-and-fill (</w:t>
+        <w:t xml:space="preserve">= .789) are clearly non-significant (H2, H3 not supported). Publication-bias diagnostics are mixed: Begg's test and trim-and-fill (</w:t>
       </w:r>
       <w:r>
         <w:rPr>
@@ -945,7 +980,7 @@
         <w:t xml:space="preserve"> </w:t>
       </w:r>
       <w:r>
-        <w:t xml:space="preserve">= 0.040) indicate left-side asymmetry, whereas Egger's regression is only marginal (</w:t>
+        <w:t xml:space="preserve">= 0.041) indicate left-side asymmetry, whereas Egger's regression is only marginal (</w:t>
       </w:r>
       <w:r>
         <w:rPr>
@@ -958,7 +993,7 @@
         <w:t xml:space="preserve"> </w:t>
       </w:r>
       <w:r>
-        <w:t xml:space="preserve">= .069). The heterogeneity puzzle (</w:t>
+        <w:t xml:space="preserve">= .059). The heterogeneity puzzle (</w:t>
       </w:r>
       <w:r>
         <w:rPr>
@@ -968,7 +1003,7 @@
         <w:t xml:space="preserve">I</w:t>
       </w:r>
       <w:r>
-        <w:t xml:space="preserve">² = 65.5%) remains unresolved by the tested moderators; critically, the variance decomposition shows that it is concentrated</w:t>
+        <w:t xml:space="preserve">² = 65.9%) remains unresolved by the tested moderators; critically, the variance decomposition shows that it is concentrated</w:t>
       </w:r>
       <w:r>
         <w:t xml:space="preserve"> </w:t>
@@ -984,7 +1019,7 @@
         <w:t xml:space="preserve"> </w:t>
       </w:r>
       <w:r>
-        <w:t xml:space="preserve">primary studies (Level 2, 56.6%) far more than between studies (Level 3, 8.9%), pointing future work toward within-study analytic moderators rather than additional country-level contingencies.</w:t>
+        <w:t xml:space="preserve">primary studies (Level 2, 57.1%) far more than between studies (Level 3, 8.8%), pointing future work toward within-study analytic moderators rather than additional country-level contingencies.</w:t>
       </w:r>
     </w:p>
     <w:p>
@@ -1054,7 +1089,7 @@
         <w:t xml:space="preserve"> </w:t>
       </w:r>
       <w:r>
-        <w:t xml:space="preserve">Barney (1991) establishes that sustainable competitive advantages derive from VRIN (valuable, rare, inimitable, non-substitutable) resources. In the I→P context, this predicts that firms with strong home-country resource endowments — including human capital, technological capability, and digital infrastructure access — will generate higher performance returns from international expansion than resource-constrained peers. Wernerfelt's (1984) resource bundling logic further predicts that national digital infrastructure provides a coordination-enabling environment that amplifies the returns to firm-level resources: in high-cDAI environments, firms can deploy their existing technological and organizational capabilities across borders at lower per-unit cost, raising the marginal productivity return to each additional unit of international expansion. It is important to note that cDAI (country-level) is analytically distinct from firm-level digital adoption (DAI) and from firm-level technological capability (TCI), which the companion primary studies (P3–P8) treat as separate constructs with distinct measurement bases and theoretical roles. In the present meta-analytic study, only cDAI is operationalized as a study-level moderator; DAI and TCI remain within-study variables in the primary-study designs and are not separately extractable at meta-analytic resolution from the k = 280 corpus. The resource-bundling prediction for P6 therefore concerns whether a richer national digital environment raises the aggregate I→P effect across studies — a between-study moderation claim at the country level, not a within-study claim about firm-level capability bundles.</w:t>
+        <w:t xml:space="preserve">Barney (1991) establishes that sustainable competitive advantages derive from VRIN (valuable, rare, inimitable, non-substitutable) resources. In the I→P context, this predicts that firms with strong home-country resource endowments — including human capital, technological capability, and digital infrastructure access — will generate higher performance returns from international expansion than resource-constrained peers. Wernerfelt's (1984) resource bundling logic further predicts that national digital infrastructure provides a coordination-enabling environment that amplifies the returns to firm-level resources: in high-cDAI environments, firms can deploy their existing technological and organizational capabilities across borders at lower per-unit cost, raising the marginal productivity return to each additional unit of international expansion. It is important to note that cDAI (country-level) is analytically distinct from firm-level digital adoption (DAI) and from firm-level technological capability (TCI), which the companion primary studies (P3–P8) treat as separate constructs with distinct measurement bases and theoretical roles. In the present meta-analytic study, only cDAI is operationalized as a study-level moderator; DAI and TCI remain within-study variables in the primary-study designs and are not separately extractable at meta-analytic resolution from the k = 278 corpus. The resource-bundling prediction for P6 therefore concerns whether a richer national digital environment raises the aggregate I→P effect across studies — a between-study moderation claim at the country level, not a within-study claim about firm-level capability bundles.</w:t>
       </w:r>
     </w:p>
     <w:p>
@@ -1366,7 +1401,7 @@
         <w:pStyle w:val="BodyText"/>
       </w:pPr>
       <w:r>
-        <w:t xml:space="preserve">CIMT predicts between-regime heterogeneity in I→P effect sizes, with Advanced-regime studies expected to show the largest effects because all three CIMT mechanisms operate simultaneously at the institutional frontier. Prior meta-analyses have not adequately tested this institutional gradient because they lacked a fine-grained taxonomy that disaggregates the spectrum from Advanced Innovation economies to Frontier and SIDS contexts at sufficient resolution. Marano et al. (2016) used a six-category global classification that did not separate the Advanced/Upper-Middle/Emerging/Frontier spectrum examined here. The ICRV 5-regime taxonomy — anchored in World Bank World Governance Indicators (Rule of Law dimension, 2023 vintage) and applied to the full k = 280 global study corpus — provides the first classification capable of testing the CIMT between-regime prediction meta-analytically across economies ranging from Singapore (WGI +1.84) to Pakistan (WGI −0.55) and Iran (WGI −0.74).</w:t>
+        <w:t xml:space="preserve">CIMT predicts between-regime heterogeneity in I→P effect sizes, with Advanced-regime studies expected to show the largest effects because all three CIMT mechanisms operate simultaneously at the institutional frontier. Prior meta-analyses have not adequately tested this institutional gradient because they lacked a fine-grained taxonomy that disaggregates the spectrum from Advanced Innovation economies to Frontier and SIDS contexts at sufficient resolution. Marano et al. (2016) used a six-category global classification that did not separate the Advanced/Upper-Middle/Emerging/Frontier spectrum examined here. The ICRV 5-regime taxonomy — anchored in World Bank World Governance Indicators (Rule of Law dimension, 2023 vintage) and applied to the full k = 278 global study corpus — provides the first classification capable of testing the CIMT between-regime prediction meta-analytically across economies ranging from Singapore (WGI +1.84) to Pakistan (WGI −0.55) and Iran (WGI −0.74).</w:t>
       </w:r>
     </w:p>
     <w:p>
@@ -1565,7 +1600,7 @@
         <w:pStyle w:val="FirstParagraph"/>
       </w:pPr>
       <w:r>
-        <w:t xml:space="preserve">The choice of 2009 as the primary inflection point is grounded in three empirical anchors: (1) the global proliferation of smartphones and mobile internet (2007–2009) transformed cross-border communication costs; (2) the rapid growth of B2B e-commerce platforms in China and Southeast Asia (Alibaba B2B international: 2008–2010; Lazada: 2011; Tokopedia: 2009) created new digital trade infrastructure specifically suited to emerging Asia-Pacific exporters; (3) the 2009 global financial crisis accelerated digital adoption among SMEs as a cost-reduction strategy. These three concurrent developments make 2009 a defensible global inflection point for digital adoption in trade-oriented economies rather than an arbitrary choice; the Asia-Pacific region — home to roughly half of the k = 280 corpus — was a primary site of this diffusion.</w:t>
+        <w:t xml:space="preserve">The choice of 2009 as the primary inflection point is grounded in three empirical anchors: (1) the global proliferation of smartphones and mobile internet (2007–2009) transformed cross-border communication costs; (2) the rapid growth of B2B e-commerce platforms in China and Southeast Asia (Alibaba B2B international: 2008–2010; Lazada: 2011; Tokopedia: 2009) created new digital trade infrastructure specifically suited to emerging Asia-Pacific exporters; (3) the 2009 global financial crisis accelerated digital adoption among SMEs as a cost-reduction strategy. These three concurrent developments make 2009 a defensible global inflection point for digital adoption in trade-oriented economies rather than an arbitrary choice; the Asia-Pacific region — home to roughly half of the k = 278 corpus — was a primary site of this diffusion.</w:t>
       </w:r>
     </w:p>
     <w:p>
@@ -1972,7 +2007,7 @@
         <w:t xml:space="preserve"> </w:t>
       </w:r>
       <w:r>
-        <w:t xml:space="preserve">Solid arrows represent the primary meta-analytic effect (baseline I→P pooled effect, k = 280 studies, K = 330 effects, r̄ = 0.075, 95% CI [0.062, 0.089]). Dashed arrows represent hypothesised moderating relationships. Three study-level constructs were tested as moderators: (1) ICRV Regime (H1) — hypothesised between-regime Q_M statistically significant; H1 confirmed (Q_M = 9.81, p = .044); directional Exploratory Propositions E1a (Advanced largest) and E1b (Frontier smallest) not confirmed (the omnibus effect is driven by a sparse Frontier cell, K = 4). (2) cDAI — Country Digital Adoption Index (H3) — hypothesised positive amplification [High &gt; Low]; actual Q_M = 0.19 (p = .911), H3 not supported. (3) DPL Phase (H2) — hypothesised Follow &gt; Precede; actual Q_M = 0.80 (p = .671), H2 not supported. The three-level model nests K = 330 effects within k = 280 studies; the within-study level dominates the variance (σ²_(2) = 0.00937, I²_(2) = 56.6%) relative to the between-study level (σ²_(3) = 0.00147, I²_(3) = 8.9%); total I² = 65.5%. Publication bias (H4 partial): Begg's τ = −0.116 (p = .002) and trim-and-fill (k₀ = 58 imputed, adjusted r = 0.040) indicate asymmetry, while Egger's regression is marginal (b = 0.414, p = .069); fail-safe N = 81,035. Abbreviations: ICRV = Innovation–Capability–Resource–Vulnerability; cDAI = country-level Digital Adoption Index; DPL = Digital Paradox Lifecycle; MARA = Meta-Analytic Regression Analysis. Target journal:</w:t>
+        <w:t xml:space="preserve">Solid arrows represent the primary meta-analytic effect (baseline I→P pooled effect, k = 278 studies, K = 328 effects, r̄ = 0.076, 95% CI [0.063, 0.089]). Dashed arrows represent hypothesised moderating relationships. Three study-level constructs were tested as moderators: (1) ICRV Regime (H1) — hypothesised between-regime Q_M statistically significant; H1 not supported (Q_M = 9.46, p = .051, marginal); directional Exploratory Propositions E1a/E1b not supported (any departure is driven by a sparse Frontier cell, K = 4). (2) cDAI — Country Digital Adoption Index (H3) — hypothesised positive amplification [High &gt; Low]; actual Q_M = 0.23 (p = .893), H3 not supported. (3) DPL Phase (H2) — hypothesised Follow &gt; Precede; actual Q_M = 0.47 (p = .789), H2 not supported. The three-level model nests K = 328 effects within k = 278 studies; the within-study level dominates the variance (σ²_(2) = 0.00888, I²_(2) = 57.1%) relative to the between-study level (σ²_(3) = 0.00137, I²_(3) = 8.8%); total I² = 65.9%. Publication bias (H4 partial): Begg's τ = −0.119 (p = .001) and trim-and-fill (k₀ = 58 imputed, adjusted r = 0.041) indicate asymmetry, while Egger's regression is marginal (b = 0.434, p = .059); fail-safe N = 81,712. Abbreviations: ICRV = Innovation–Capability–Resource–Vulnerability; cDAI = country-level Digital Adoption Index; DPL = Digital Paradox Lifecycle; MARA = Meta-Analytic Regression Analysis. Target journal:</w:t>
       </w:r>
       <w:r>
         <w:t xml:space="preserve"> </w:t>
@@ -3536,7 +3571,7 @@
         <w:t xml:space="preserve"> </w:t>
       </w:r>
       <w:r>
-        <w:t xml:space="preserve">= 280 coded studies;</w:t>
+        <w:t xml:space="preserve">= 278 coded studies;</w:t>
       </w:r>
       <w:r>
         <w:t xml:space="preserve"> </w:t>
@@ -3552,7 +3587,7 @@
         <w:t xml:space="preserve"> </w:t>
       </w:r>
       <w:r>
-        <w:t xml:space="preserve">= 330 effect sizes;</w:t>
+        <w:t xml:space="preserve">= 328 effect sizes;</w:t>
       </w:r>
       <w:r>
         <w:t xml:space="preserve"> </w:t>
@@ -6313,7 +6348,7 @@
         <w:t xml:space="preserve"> </w:t>
       </w:r>
       <w:r>
-        <w:t xml:space="preserve">= 280 studies (coded),</w:t>
+        <w:t xml:space="preserve">= 278 studies (coded),</w:t>
       </w:r>
       <w:r>
         <w:t xml:space="preserve"> </w:t>
@@ -6329,7 +6364,7 @@
         <w:t xml:space="preserve"> </w:t>
       </w:r>
       <w:r>
-        <w:t xml:space="preserve">= 330 effect sizes (current analytic database,</w:t>
+        <w:t xml:space="preserve">= 328 effect sizes (current analytic database,</w:t>
       </w:r>
       <w:r>
         <w:t xml:space="preserve"> </w:t>
@@ -6940,7 +6975,7 @@
           <w:iCs/>
           <w:i/>
         </w:rPr>
-        <w:t xml:space="preserve">(K = 330 effect sizes, k = 280 coded studies)</w:t>
+        <w:t xml:space="preserve">(K = 328 effect sizes, k = 278 coded studies)</w:t>
       </w:r>
     </w:p>
     <w:tbl>
@@ -7037,19 +7072,19 @@
               <w:jc w:val="left"/>
             </w:pPr>
             <w:r>
-              <w:t xml:space="preserve">158</w:t>
-            </w:r>
-          </w:p>
-        </w:tc>
-        <w:tc>
-          <w:tcPr/>
-          <w:p>
-            <w:pPr>
-              <w:pStyle w:val="Compact"/>
-              <w:jc w:val="left"/>
-            </w:pPr>
-            <w:r>
-              <w:t xml:space="preserve">126</w:t>
+              <w:t xml:space="preserve">157</w:t>
+            </w:r>
+          </w:p>
+        </w:tc>
+        <w:tc>
+          <w:tcPr/>
+          <w:p>
+            <w:pPr>
+              <w:pStyle w:val="Compact"/>
+              <w:jc w:val="left"/>
+            </w:pPr>
+            <w:r>
+              <w:t xml:space="preserve">125</w:t>
             </w:r>
           </w:p>
         </w:tc>
@@ -7189,19 +7224,19 @@
               <w:jc w:val="left"/>
             </w:pPr>
             <w:r>
-              <w:t xml:space="preserve">41</w:t>
-            </w:r>
-          </w:p>
-        </w:tc>
-        <w:tc>
-          <w:tcPr/>
-          <w:p>
-            <w:pPr>
-              <w:pStyle w:val="Compact"/>
-              <w:jc w:val="left"/>
-            </w:pPr>
-            <w:r>
-              <w:t xml:space="preserve">39</w:t>
+              <w:t xml:space="preserve">40</w:t>
+            </w:r>
+          </w:p>
+        </w:tc>
+        <w:tc>
+          <w:tcPr/>
+          <w:p>
+            <w:pPr>
+              <w:pStyle w:val="Compact"/>
+              <w:jc w:val="left"/>
+            </w:pPr>
+            <w:r>
+              <w:t xml:space="preserve">38</w:t>
             </w:r>
           </w:p>
         </w:tc>
@@ -7281,7 +7316,7 @@
                 <w:bCs/>
                 <w:b/>
               </w:rPr>
-              <w:t xml:space="preserve">330</w:t>
+              <w:t xml:space="preserve">328</w:t>
             </w:r>
           </w:p>
         </w:tc>
@@ -7297,7 +7332,7 @@
                 <w:bCs/>
                 <w:b/>
               </w:rPr>
-              <w:t xml:space="preserve">280</w:t>
+              <w:t xml:space="preserve">278</w:t>
             </w:r>
           </w:p>
         </w:tc>
@@ -7323,19 +7358,19 @@
               <w:jc w:val="left"/>
             </w:pPr>
             <w:r>
-              <w:t xml:space="preserve">52</w:t>
-            </w:r>
-          </w:p>
-        </w:tc>
-        <w:tc>
-          <w:tcPr/>
-          <w:p>
-            <w:pPr>
-              <w:pStyle w:val="Compact"/>
-              <w:jc w:val="left"/>
-            </w:pPr>
-            <w:r>
-              <w:t xml:space="preserve">47</w:t>
+              <w:t xml:space="preserve">51</w:t>
+            </w:r>
+          </w:p>
+        </w:tc>
+        <w:tc>
+          <w:tcPr/>
+          <w:p>
+            <w:pPr>
+              <w:pStyle w:val="Compact"/>
+              <w:jc w:val="left"/>
+            </w:pPr>
+            <w:r>
+              <w:t xml:space="preserve">46</w:t>
             </w:r>
           </w:p>
         </w:tc>
@@ -7361,19 +7396,19 @@
               <w:jc w:val="left"/>
             </w:pPr>
             <w:r>
-              <w:t xml:space="preserve">82</w:t>
-            </w:r>
-          </w:p>
-        </w:tc>
-        <w:tc>
-          <w:tcPr/>
-          <w:p>
-            <w:pPr>
-              <w:pStyle w:val="Compact"/>
-              <w:jc w:val="left"/>
-            </w:pPr>
-            <w:r>
-              <w:t xml:space="preserve">70</w:t>
+              <w:t xml:space="preserve">81</w:t>
+            </w:r>
+          </w:p>
+        </w:tc>
+        <w:tc>
+          <w:tcPr/>
+          <w:p>
+            <w:pPr>
+              <w:pStyle w:val="Compact"/>
+              <w:jc w:val="left"/>
+            </w:pPr>
+            <w:r>
+              <w:t xml:space="preserve">69</w:t>
             </w:r>
           </w:p>
         </w:tc>
@@ -7551,19 +7586,19 @@
               <w:jc w:val="left"/>
             </w:pPr>
             <w:r>
-              <w:t xml:space="preserve">98</w:t>
-            </w:r>
-          </w:p>
-        </w:tc>
-        <w:tc>
-          <w:tcPr/>
-          <w:p>
-            <w:pPr>
-              <w:pStyle w:val="Compact"/>
-              <w:jc w:val="left"/>
-            </w:pPr>
-            <w:r>
-              <w:t xml:space="preserve">85</w:t>
+              <w:t xml:space="preserve">96</w:t>
+            </w:r>
+          </w:p>
+        </w:tc>
+        <w:tc>
+          <w:tcPr/>
+          <w:p>
+            <w:pPr>
+              <w:pStyle w:val="Compact"/>
+              <w:jc w:val="left"/>
+            </w:pPr>
+            <w:r>
+              <w:t xml:space="preserve">83</w:t>
             </w:r>
           </w:p>
         </w:tc>
@@ -7779,19 +7814,19 @@
               <w:jc w:val="left"/>
             </w:pPr>
             <w:r>
-              <w:t xml:space="preserve">261</w:t>
-            </w:r>
-          </w:p>
-        </w:tc>
-        <w:tc>
-          <w:tcPr/>
-          <w:p>
-            <w:pPr>
-              <w:pStyle w:val="Compact"/>
-              <w:jc w:val="left"/>
-            </w:pPr>
-            <w:r>
-              <w:t xml:space="preserve">216</w:t>
+              <w:t xml:space="preserve">259</w:t>
+            </w:r>
+          </w:p>
+        </w:tc>
+        <w:tc>
+          <w:tcPr/>
+          <w:p>
+            <w:pPr>
+              <w:pStyle w:val="Compact"/>
+              <w:jc w:val="left"/>
+            </w:pPr>
+            <w:r>
+              <w:t xml:space="preserve">214</w:t>
             </w:r>
           </w:p>
         </w:tc>
@@ -7944,19 +7979,19 @@
               <w:jc w:val="left"/>
             </w:pPr>
             <w:r>
-              <w:t xml:space="preserve">273</w:t>
-            </w:r>
-          </w:p>
-        </w:tc>
-        <w:tc>
-          <w:tcPr/>
-          <w:p>
-            <w:pPr>
-              <w:pStyle w:val="Compact"/>
-              <w:jc w:val="left"/>
-            </w:pPr>
-            <w:r>
-              <w:t xml:space="preserve">223</w:t>
+              <w:t xml:space="preserve">271</w:t>
+            </w:r>
+          </w:p>
+        </w:tc>
+        <w:tc>
+          <w:tcPr/>
+          <w:p>
+            <w:pPr>
+              <w:pStyle w:val="Compact"/>
+              <w:jc w:val="left"/>
+            </w:pPr>
+            <w:r>
+              <w:t xml:space="preserve">221</w:t>
             </w:r>
           </w:p>
         </w:tc>
@@ -8047,7 +8082,7 @@
         <w:t xml:space="preserve">p6/data/p6_study_database_v2.csv</w:t>
       </w:r>
       <w:r>
-        <w:t xml:space="preserve">, K = 330 rows, k = 280 unique study IDs). Subgroup</w:t>
+        <w:t xml:space="preserve">, K = 328 rows, k = 278 unique study IDs). Subgroup</w:t>
       </w:r>
       <w:r>
         <w:t xml:space="preserve"> </w:t>
@@ -8398,7 +8433,7 @@
         <w:t xml:space="preserve"> </w:t>
       </w:r>
       <w:r>
-        <w:t xml:space="preserve">(REML, k = 280 studies, K = 330 effects):</w:t>
+        <w:t xml:space="preserve">(REML, k = 278 studies, K = 328 effects):</w:t>
       </w:r>
     </w:p>
     <w:tbl>
@@ -8462,7 +8497,7 @@
               <w:jc w:val="left"/>
             </w:pPr>
             <w:r>
-              <w:t xml:space="preserve">0.00937</w:t>
+              <w:t xml:space="preserve">0.00888</w:t>
             </w:r>
           </w:p>
         </w:tc>
@@ -8488,7 +8523,7 @@
               <w:jc w:val="left"/>
             </w:pPr>
             <w:r>
-              <w:t xml:space="preserve">0.00147</w:t>
+              <w:t xml:space="preserve">0.00137</w:t>
             </w:r>
           </w:p>
         </w:tc>
@@ -8521,7 +8556,7 @@
               <w:jc w:val="left"/>
             </w:pPr>
             <w:r>
-              <w:t xml:space="preserve">56.6%</w:t>
+              <w:t xml:space="preserve">57.1%</w:t>
             </w:r>
           </w:p>
         </w:tc>
@@ -8554,7 +8589,7 @@
               <w:jc w:val="left"/>
             </w:pPr>
             <w:r>
-              <w:t xml:space="preserve">8.9%</w:t>
+              <w:t xml:space="preserve">8.8%</w:t>
             </w:r>
           </w:p>
         </w:tc>
@@ -8587,7 +8622,7 @@
               <w:jc w:val="left"/>
             </w:pPr>
             <w:r>
-              <w:t xml:space="preserve">65.5%</w:t>
+              <w:t xml:space="preserve">65.9%</w:t>
             </w:r>
           </w:p>
         </w:tc>
@@ -8626,7 +8661,7 @@
               <w:jc w:val="left"/>
             </w:pPr>
             <w:r>
-              <w:t xml:space="preserve">0.075 (95% CI [0.062, 0.089]),</w:t>
+              <w:t xml:space="preserve">0.076 (95% CI [0.063, 0.089]),</w:t>
             </w:r>
             <w:r>
               <w:t xml:space="preserve"> </w:t>
@@ -8675,7 +8710,7 @@
               <w:jc w:val="left"/>
             </w:pPr>
             <w:r>
-              <w:t xml:space="preserve">2,869.47 (</w:t>
+              <w:t xml:space="preserve">2,831.77 (</w:t>
             </w:r>
             <w:r>
               <w:rPr>
@@ -8688,7 +8723,7 @@
               <w:t xml:space="preserve"> </w:t>
             </w:r>
             <w:r>
-              <w:t xml:space="preserve">= 329,</w:t>
+              <w:t xml:space="preserve">= 327,</w:t>
             </w:r>
             <w:r>
               <w:t xml:space="preserve"> </w:t>
@@ -8728,7 +8763,7 @@
         <w:t xml:space="preserve"> </w:t>
       </w:r>
       <w:r>
-        <w:t xml:space="preserve">= 0.075) is consistent with the ICBEF 2025 single-level baseline (</w:t>
+        <w:t xml:space="preserve">= 0.076) is consistent with the ICBEF 2025 single-level baseline (</w:t>
       </w:r>
       <w:r>
         <w:rPr>
@@ -8754,7 +8789,7 @@
         <w:t xml:space="preserve">I</w:t>
       </w:r>
       <w:r>
-        <w:t xml:space="preserve">²_(2) = 56.6%) is roughly six times the between-study contribution (Level 3,</w:t>
+        <w:t xml:space="preserve">²_(2) = 57.1%) is roughly six times the between-study contribution (Level 3,</w:t>
       </w:r>
       <w:r>
         <w:t xml:space="preserve"> </w:t>
@@ -8767,7 +8802,7 @@
         <w:t xml:space="preserve">I</w:t>
       </w:r>
       <w:r>
-        <w:t xml:space="preserve">²_(3) = 8.9%). Substantively, this indicates that most unexplained heterogeneity arises from analytic choices</w:t>
+        <w:t xml:space="preserve">²_(3) = 8.8%). Substantively, this indicates that most unexplained heterogeneity arises from analytic choices</w:t>
       </w:r>
       <w:r>
         <w:t xml:space="preserve"> </w:t>
@@ -8796,7 +8831,7 @@
         <w:t xml:space="preserve">I</w:t>
       </w:r>
       <w:r>
-        <w:t xml:space="preserve">² = 65.5%, well above the sampling-error floor, motivates the moderator analyses; however, as §§4.3–4.5 show, the coded country- and time-level moderators leave the bulk of this within-study heterogeneity unresolved.</w:t>
+        <w:t xml:space="preserve">² = 65.9%, well above the sampling-error floor, motivates the moderator analyses; however, as §§4.3–4.5 show, the coded country- and time-level moderators leave the bulk of this within-study heterogeneity unresolved.</w:t>
       </w:r>
     </w:p>
     <w:bookmarkEnd w:id="45"/>
@@ -8821,7 +8856,7 @@
         <w:t xml:space="preserve">Q</w:t>
       </w:r>
       <w:r>
-        <w:t xml:space="preserve">_M(ICRV) = 9.81 (</w:t>
+        <w:t xml:space="preserve">_M(ICRV) = 9.46 (</w:t>
       </w:r>
       <w:r>
         <w:rPr>
@@ -8850,7 +8885,7 @@
         <w:t xml:space="preserve"> </w:t>
       </w:r>
       <w:r>
-        <w:t xml:space="preserve">= .044). H1</w:t>
+        <w:t xml:space="preserve">= .051). H1 is</w:t>
       </w:r>
       <w:r>
         <w:t xml:space="preserve"> </w:t>
@@ -8860,13 +8895,13 @@
           <w:bCs/>
           <w:b/>
         </w:rPr>
-        <w:t xml:space="preserve">confirmed</w:t>
-      </w:r>
-      <w:r>
-        <w:t xml:space="preserve"> </w:t>
-      </w:r>
-      <w:r>
-        <w:t xml:space="preserve">— the omnibus between-regime moderation test is statistically significant, establishing that the I→P effect varies across coded institutional regimes. Exploratory Propositions E1a (Advanced largest) and E1b (Frontier smallest) are</w:t>
+        <w:t xml:space="preserve">not supported</w:t>
+      </w:r>
+      <w:r>
+        <w:t xml:space="preserve"> </w:t>
+      </w:r>
+      <w:r>
+        <w:t xml:space="preserve">— the omnibus between-regime moderation test falls just short of the conventional threshold, and the small departure that exists is generated by a sparse, high-effect Frontier cell rather than by a monotone advanced-to-emerging gradient. Exploratory Propositions E1a (Advanced largest) and E1b (Frontier smallest) are correspondingly</w:t>
       </w:r>
       <w:r>
         <w:t xml:space="preserve"> </w:t>
@@ -8882,20 +8917,7 @@
         <w:t xml:space="preserve"> </w:t>
       </w:r>
       <w:r>
-        <w:t xml:space="preserve">confirmed: the significant</w:t>
-      </w:r>
-      <w:r>
-        <w:t xml:space="preserve"> </w:t>
-      </w:r>
-      <w:r>
-        <w:rPr>
-          <w:iCs/>
-          <w:i/>
-        </w:rPr>
-        <w:t xml:space="preserve">Q</w:t>
-      </w:r>
-      <w:r>
-        <w:t xml:space="preserve">_M is driven by a small, high-effect Frontier cell rather than by a monotone advanced-to-emerging gradient; see below.</w:t>
+        <w:t xml:space="preserve">supported; see below.</w:t>
       </w:r>
     </w:p>
     <w:p>
@@ -8917,7 +8939,7 @@
           <w:iCs/>
           <w:i/>
         </w:rPr>
-        <w:t xml:space="preserve">(actual MARA output, k = 280 / K = 330; subgroup pooled means, no-intercept specification)</w:t>
+        <w:t xml:space="preserve">(actual MARA output, k = 278 / K = 328; subgroup pooled means, no-intercept specification)</w:t>
       </w:r>
     </w:p>
     <w:tbl>
@@ -9038,31 +9060,31 @@
               <w:jc w:val="left"/>
             </w:pPr>
             <w:r>
-              <w:t xml:space="preserve">158</w:t>
-            </w:r>
-          </w:p>
-        </w:tc>
-        <w:tc>
-          <w:tcPr/>
-          <w:p>
-            <w:pPr>
-              <w:pStyle w:val="Compact"/>
-              <w:jc w:val="left"/>
-            </w:pPr>
-            <w:r>
-              <w:t xml:space="preserve">0.080</w:t>
-            </w:r>
-          </w:p>
-        </w:tc>
-        <w:tc>
-          <w:tcPr/>
-          <w:p>
-            <w:pPr>
-              <w:pStyle w:val="Compact"/>
-              <w:jc w:val="left"/>
-            </w:pPr>
-            <w:r>
-              <w:t xml:space="preserve">[0.060, 0.099]</w:t>
+              <w:t xml:space="preserve">157</w:t>
+            </w:r>
+          </w:p>
+        </w:tc>
+        <w:tc>
+          <w:tcPr/>
+          <w:p>
+            <w:pPr>
+              <w:pStyle w:val="Compact"/>
+              <w:jc w:val="left"/>
+            </w:pPr>
+            <w:r>
+              <w:t xml:space="preserve">0.079</w:t>
+            </w:r>
+          </w:p>
+        </w:tc>
+        <w:tc>
+          <w:tcPr/>
+          <w:p>
+            <w:pPr>
+              <w:pStyle w:val="Compact"/>
+              <w:jc w:val="left"/>
+            </w:pPr>
+            <w:r>
+              <w:t xml:space="preserve">[0.060, 0.098]</w:t>
             </w:r>
           </w:p>
         </w:tc>
@@ -9174,7 +9196,7 @@
               <w:jc w:val="left"/>
             </w:pPr>
             <w:r>
-              <w:t xml:space="preserve">0.074</w:t>
+              <w:t xml:space="preserve">0.073</w:t>
             </w:r>
           </w:p>
         </w:tc>
@@ -9286,43 +9308,43 @@
               <w:jc w:val="left"/>
             </w:pPr>
             <w:r>
-              <w:t xml:space="preserve">41</w:t>
-            </w:r>
-          </w:p>
-        </w:tc>
-        <w:tc>
-          <w:tcPr/>
-          <w:p>
-            <w:pPr>
-              <w:pStyle w:val="Compact"/>
-              <w:jc w:val="left"/>
-            </w:pPr>
-            <w:r>
-              <w:t xml:space="preserve">0.057</w:t>
-            </w:r>
-          </w:p>
-        </w:tc>
-        <w:tc>
-          <w:tcPr/>
-          <w:p>
-            <w:pPr>
-              <w:pStyle w:val="Compact"/>
-              <w:jc w:val="left"/>
-            </w:pPr>
-            <w:r>
-              <w:t xml:space="preserve">[0.020, 0.093]</w:t>
-            </w:r>
-          </w:p>
-        </w:tc>
-        <w:tc>
-          <w:tcPr/>
-          <w:p>
-            <w:pPr>
-              <w:pStyle w:val="Compact"/>
-              <w:jc w:val="left"/>
-            </w:pPr>
-            <w:r>
-              <w:t xml:space="preserve">.002</w:t>
+              <w:t xml:space="preserve">40</w:t>
+            </w:r>
+          </w:p>
+        </w:tc>
+        <w:tc>
+          <w:tcPr/>
+          <w:p>
+            <w:pPr>
+              <w:pStyle w:val="Compact"/>
+              <w:jc w:val="left"/>
+            </w:pPr>
+            <w:r>
+              <w:t xml:space="preserve">0.064</w:t>
+            </w:r>
+          </w:p>
+        </w:tc>
+        <w:tc>
+          <w:tcPr/>
+          <w:p>
+            <w:pPr>
+              <w:pStyle w:val="Compact"/>
+              <w:jc w:val="left"/>
+            </w:pPr>
+            <w:r>
+              <w:t xml:space="preserve">[0.028, 0.100]</w:t>
+            </w:r>
+          </w:p>
+        </w:tc>
+        <w:tc>
+          <w:tcPr/>
+          <w:p>
+            <w:pPr>
+              <w:pStyle w:val="Compact"/>
+              <w:jc w:val="left"/>
+            </w:pPr>
+            <w:r>
+              <w:t xml:space="preserve">&lt; .001</w:t>
             </w:r>
           </w:p>
         </w:tc>
@@ -9427,7 +9449,7 @@
         <w:t xml:space="preserve"> </w:t>
       </w:r>
       <w:r>
-        <w:t xml:space="preserve">= 0.080,</w:t>
+        <w:t xml:space="preserve">= 0.079,</w:t>
       </w:r>
       <w:r>
         <w:t xml:space="preserve"> </w:t>
@@ -9443,7 +9465,7 @@
         <w:t xml:space="preserve"> </w:t>
       </w:r>
       <w:r>
-        <w:t xml:space="preserve">= 158), Emerging (</w:t>
+        <w:t xml:space="preserve">= 157), Emerging (</w:t>
       </w:r>
       <w:r>
         <w:rPr>
@@ -9456,7 +9478,7 @@
         <w:t xml:space="preserve"> </w:t>
       </w:r>
       <w:r>
-        <w:t xml:space="preserve">= 0.074,</w:t>
+        <w:t xml:space="preserve">= 0.073,</w:t>
       </w:r>
       <w:r>
         <w:t xml:space="preserve"> </w:t>
@@ -9517,7 +9539,7 @@
         <w:t xml:space="preserve"> </w:t>
       </w:r>
       <w:r>
-        <w:t xml:space="preserve">support for E1a's predicted advanced-over-emerging ordering. The cross-regime/multi-country pooled studies show the lowest effect (MX,</w:t>
+        <w:t xml:space="preserve">support for E1a's predicted advanced-over-emerging ordering. The cross-regime/multi-country pooled studies sit at the low end (MX,</w:t>
       </w:r>
       <w:r>
         <w:t xml:space="preserve"> </w:t>
@@ -9533,7 +9555,7 @@
         <w:t xml:space="preserve"> </w:t>
       </w:r>
       <w:r>
-        <w:t xml:space="preserve">= 0.057,</w:t>
+        <w:t xml:space="preserve">= 0.064,</w:t>
       </w:r>
       <w:r>
         <w:t xml:space="preserve"> </w:t>
@@ -9549,7 +9571,7 @@
         <w:t xml:space="preserve"> </w:t>
       </w:r>
       <w:r>
-        <w:t xml:space="preserve">= 41), consistent with attenuation when heterogeneous national samples are aggregated within a single primary study. The omnibus significance is attributable almost entirely to the Frontier/LDC cell (FR,</w:t>
+        <w:t xml:space="preserve">= 40), consistent with attenuation when heterogeneous national samples are aggregated within a single primary study. The omnibus significance is attributable almost entirely to the Frontier/LDC cell (FR,</w:t>
       </w:r>
       <w:r>
         <w:t xml:space="preserve"> </w:t>
@@ -9581,7 +9603,7 @@
         <w:t xml:space="preserve"> </w:t>
       </w:r>
       <w:r>
-        <w:t xml:space="preserve">= 4 effects and is therefore statistically fragile and contrary to E1b's predicted Frontier floor. H1 (between-regime heterogeneity) is supported, but the substantive pattern is a small-sample Frontier spike rather than an institutional-quality gradient, and the regime-specific propositions require larger</w:t>
+        <w:t xml:space="preserve">= 4 effects and is therefore statistically fragile and contrary to E1b's predicted Frontier floor. H1 (between-regime heterogeneity) is not supported at the .05 threshold, and the only non-trivial departure is a small-sample Frontier spike rather than an institutional-quality gradient, and the regime-specific propositions require larger</w:t>
       </w:r>
       <w:r>
         <w:t xml:space="preserve"> </w:t>
@@ -9622,7 +9644,7 @@
         <w:t xml:space="preserve">Q</w:t>
       </w:r>
       <w:r>
-        <w:t xml:space="preserve">_M(cDAI) = 0.19 (</w:t>
+        <w:t xml:space="preserve">_M(cDAI) = 0.23 (</w:t>
       </w:r>
       <w:r>
         <w:rPr>
@@ -9651,7 +9673,7 @@
         <w:t xml:space="preserve"> </w:t>
       </w:r>
       <w:r>
-        <w:t xml:space="preserve">= .911). H3</w:t>
+        <w:t xml:space="preserve">= .893). H3</w:t>
       </w:r>
       <w:r>
         <w:t xml:space="preserve"> </w:t>
@@ -9686,7 +9708,7 @@
           <w:iCs/>
           <w:i/>
         </w:rPr>
-        <w:t xml:space="preserve">(actual MARA output; K = 309 cDAI-coded effects)</w:t>
+        <w:t xml:space="preserve">(actual MARA output; K = 307 cDAI-coded effects)</w:t>
       </w:r>
     </w:p>
     <w:tbl>
@@ -9863,31 +9885,31 @@
               <w:jc w:val="left"/>
             </w:pPr>
             <w:r>
-              <w:t xml:space="preserve">82</w:t>
-            </w:r>
-          </w:p>
-        </w:tc>
-        <w:tc>
-          <w:tcPr/>
-          <w:p>
-            <w:pPr>
-              <w:pStyle w:val="Compact"/>
-              <w:jc w:val="left"/>
-            </w:pPr>
-            <w:r>
-              <w:t xml:space="preserve">0.072</w:t>
-            </w:r>
-          </w:p>
-        </w:tc>
-        <w:tc>
-          <w:tcPr/>
-          <w:p>
-            <w:pPr>
-              <w:pStyle w:val="Compact"/>
-              <w:jc w:val="left"/>
-            </w:pPr>
-            <w:r>
-              <w:t xml:space="preserve">[0.045, 0.099]</w:t>
+              <w:t xml:space="preserve">81</w:t>
+            </w:r>
+          </w:p>
+        </w:tc>
+        <w:tc>
+          <w:tcPr/>
+          <w:p>
+            <w:pPr>
+              <w:pStyle w:val="Compact"/>
+              <w:jc w:val="left"/>
+            </w:pPr>
+            <w:r>
+              <w:t xml:space="preserve">0.071</w:t>
+            </w:r>
+          </w:p>
+        </w:tc>
+        <w:tc>
+          <w:tcPr/>
+          <w:p>
+            <w:pPr>
+              <w:pStyle w:val="Compact"/>
+              <w:jc w:val="left"/>
+            </w:pPr>
+            <w:r>
+              <w:t xml:space="preserve">[0.044, 0.097]</w:t>
             </w:r>
           </w:p>
         </w:tc>
@@ -9925,31 +9947,31 @@
               <w:jc w:val="left"/>
             </w:pPr>
             <w:r>
-              <w:t xml:space="preserve">52</w:t>
-            </w:r>
-          </w:p>
-        </w:tc>
-        <w:tc>
-          <w:tcPr/>
-          <w:p>
-            <w:pPr>
-              <w:pStyle w:val="Compact"/>
-              <w:jc w:val="left"/>
-            </w:pPr>
-            <w:r>
-              <w:t xml:space="preserve">0.082</w:t>
-            </w:r>
-          </w:p>
-        </w:tc>
-        <w:tc>
-          <w:tcPr/>
-          <w:p>
-            <w:pPr>
-              <w:pStyle w:val="Compact"/>
-              <w:jc w:val="left"/>
-            </w:pPr>
-            <w:r>
-              <w:t xml:space="preserve">[0.048, 0.115]</w:t>
+              <w:t xml:space="preserve">51</w:t>
+            </w:r>
+          </w:p>
+        </w:tc>
+        <w:tc>
+          <w:tcPr/>
+          <w:p>
+            <w:pPr>
+              <w:pStyle w:val="Compact"/>
+              <w:jc w:val="left"/>
+            </w:pPr>
+            <w:r>
+              <w:t xml:space="preserve">0.080</w:t>
+            </w:r>
+          </w:p>
+        </w:tc>
+        <w:tc>
+          <w:tcPr/>
+          <w:p>
+            <w:pPr>
+              <w:pStyle w:val="Compact"/>
+              <w:jc w:val="left"/>
+            </w:pPr>
+            <w:r>
+              <w:t xml:space="preserve">[0.047, 0.113]</w:t>
             </w:r>
           </w:p>
         </w:tc>
@@ -9995,7 +10017,7 @@
         <w:t xml:space="preserve">Q</w:t>
       </w:r>
       <w:r>
-        <w:t xml:space="preserve">_M = 0.19,</w:t>
+        <w:t xml:space="preserve">_M = 0.23,</w:t>
       </w:r>
       <w:r>
         <w:t xml:space="preserve"> </w:t>
@@ -10011,7 +10033,7 @@
         <w:t xml:space="preserve"> </w:t>
       </w:r>
       <w:r>
-        <w:t xml:space="preserve">= .911). The ordering (Low ≈ Medium ≈ High, range 0.072–0.082) shows no positive gradient, and the contrasts are far from significance. H3 is not supported: country-level digital adoption (cDAI, measured via the World Bank Digital Adoption Index / ITU Digital Development Index) does not amplify the pooled I→P effect in this sample. Because the main moderation is null, the cDAI × DPL interaction central to the Contextual Digital-Capability Mechanism is not estimated. The 21 multi-country effects without an attributable country index are excluded list-wise from this test (cDAI-coded</w:t>
+        <w:t xml:space="preserve">= .893). The ordering (Low ≈ Medium ≈ High, range 0.071–0.080) shows no positive gradient, and the contrasts are far from significance. H3 is not supported: country-level digital adoption (cDAI, measured via the World Bank Digital Adoption Index / ITU Digital Development Index) does not amplify the pooled I→P effect in this sample. Because the main moderation is null, the cDAI × DPL interaction central to the Contextual Digital-Capability Mechanism is not estimated. The 21 multi-country effects without an attributable country index are excluded list-wise from this test (cDAI-coded</w:t>
       </w:r>
       <w:r>
         <w:t xml:space="preserve"> </w:t>
@@ -10027,7 +10049,7 @@
         <w:t xml:space="preserve"> </w:t>
       </w:r>
       <w:r>
-        <w:t xml:space="preserve">= 309); finer resolution across the cDAI spectrum is required before the amplifier hypothesis can be properly tested.</w:t>
+        <w:t xml:space="preserve">= 307); finer resolution across the cDAI spectrum is required before the amplifier hypothesis can be properly tested.</w:t>
       </w:r>
     </w:p>
     <w:bookmarkEnd w:id="50"/>
@@ -10052,7 +10074,7 @@
         <w:t xml:space="preserve">Q</w:t>
       </w:r>
       <w:r>
-        <w:t xml:space="preserve">_M(DPL) = 0.80 (</w:t>
+        <w:t xml:space="preserve">_M(DPL) = 0.47 (</w:t>
       </w:r>
       <w:r>
         <w:rPr>
@@ -10081,7 +10103,7 @@
         <w:t xml:space="preserve"> </w:t>
       </w:r>
       <w:r>
-        <w:t xml:space="preserve">= .671). H2</w:t>
+        <w:t xml:space="preserve">= .789). H2</w:t>
       </w:r>
       <w:r>
         <w:t xml:space="preserve"> </w:t>
@@ -10268,19 +10290,19 @@
               <w:jc w:val="left"/>
             </w:pPr>
             <w:r>
-              <w:t xml:space="preserve">0.083</w:t>
-            </w:r>
-          </w:p>
-        </w:tc>
-        <w:tc>
-          <w:tcPr/>
-          <w:p>
-            <w:pPr>
-              <w:pStyle w:val="Compact"/>
-              <w:jc w:val="left"/>
-            </w:pPr>
-            <w:r>
-              <w:t xml:space="preserve">[0.057, 0.108]</w:t>
+              <w:t xml:space="preserve">0.082</w:t>
+            </w:r>
+          </w:p>
+        </w:tc>
+        <w:tc>
+          <w:tcPr/>
+          <w:p>
+            <w:pPr>
+              <w:pStyle w:val="Compact"/>
+              <w:jc w:val="left"/>
+            </w:pPr>
+            <w:r>
+              <w:t xml:space="preserve">[0.058, 0.107]</w:t>
             </w:r>
           </w:p>
         </w:tc>
@@ -10342,19 +10364,19 @@
               <w:jc w:val="left"/>
             </w:pPr>
             <w:r>
-              <w:t xml:space="preserve">0.068</w:t>
-            </w:r>
-          </w:p>
-        </w:tc>
-        <w:tc>
-          <w:tcPr/>
-          <w:p>
-            <w:pPr>
-              <w:pStyle w:val="Compact"/>
-              <w:jc w:val="left"/>
-            </w:pPr>
-            <w:r>
-              <w:t xml:space="preserve">[0.047, 0.089]</w:t>
+              <w:t xml:space="preserve">0.071</w:t>
+            </w:r>
+          </w:p>
+        </w:tc>
+        <w:tc>
+          <w:tcPr/>
+          <w:p>
+            <w:pPr>
+              <w:pStyle w:val="Compact"/>
+              <w:jc w:val="left"/>
+            </w:pPr>
+            <w:r>
+              <w:t xml:space="preserve">[0.051, 0.092]</w:t>
             </w:r>
           </w:p>
         </w:tc>
@@ -10404,31 +10426,31 @@
               <w:jc w:val="left"/>
             </w:pPr>
             <w:r>
-              <w:t xml:space="preserve">98</w:t>
-            </w:r>
-          </w:p>
-        </w:tc>
-        <w:tc>
-          <w:tcPr/>
-          <w:p>
-            <w:pPr>
-              <w:pStyle w:val="Compact"/>
-              <w:jc w:val="left"/>
-            </w:pPr>
-            <w:r>
-              <w:t xml:space="preserve">0.078</w:t>
-            </w:r>
-          </w:p>
-        </w:tc>
-        <w:tc>
-          <w:tcPr/>
-          <w:p>
-            <w:pPr>
-              <w:pStyle w:val="Compact"/>
-              <w:jc w:val="left"/>
-            </w:pPr>
-            <w:r>
-              <w:t xml:space="preserve">[0.054, 0.102]</w:t>
+              <w:t xml:space="preserve">96</w:t>
+            </w:r>
+          </w:p>
+        </w:tc>
+        <w:tc>
+          <w:tcPr/>
+          <w:p>
+            <w:pPr>
+              <w:pStyle w:val="Compact"/>
+              <w:jc w:val="left"/>
+            </w:pPr>
+            <w:r>
+              <w:t xml:space="preserve">0.077</w:t>
+            </w:r>
+          </w:p>
+        </w:tc>
+        <w:tc>
+          <w:tcPr/>
+          <w:p>
+            <w:pPr>
+              <w:pStyle w:val="Compact"/>
+              <w:jc w:val="left"/>
+            </w:pPr>
+            <w:r>
+              <w:t xml:space="preserve">[0.053, 0.100]</w:t>
             </w:r>
           </w:p>
         </w:tc>
@@ -10461,7 +10483,7 @@
         <w:t xml:space="preserve">Q</w:t>
       </w:r>
       <w:r>
-        <w:t xml:space="preserve">_M = 0.80,</w:t>
+        <w:t xml:space="preserve">_M = 0.47,</w:t>
       </w:r>
       <w:r>
         <w:t xml:space="preserve"> </w:t>
@@ -10477,7 +10499,7 @@
         <w:t xml:space="preserve"> </w:t>
       </w:r>
       <w:r>
-        <w:t xml:space="preserve">= .671); the observed range (0.068–0.083) is trivial relative to the confidence intervals. The ordering (PRE &gt; FOL &gt; SPN) is non-monotone and opposite to H2's predicted FOL &gt; SPN &gt; PRE escalation, but the between-phase differences are negligible and should not be interpreted substantively. The null DPL result may reflect insufficient power to detect small temporal trends, confounding between DPL phase and ICRV composition (pre-2009 studies concentrated in advanced economies), or that the Digital Paradox Lifecycle inflection does not manifest at meta-analytic resolution. H2 is not supported.</w:t>
+        <w:t xml:space="preserve">= .789); the observed range (0.071–0.082) is trivial relative to the confidence intervals. The ordering (PRE &gt; FOL &gt; SPN) is non-monotone and opposite to H2's predicted FOL &gt; SPN &gt; PRE escalation, but the between-phase differences are negligible and should not be interpreted substantively. The null DPL result may reflect insufficient power to detect small temporal trends, confounding between DPL phase and ICRV composition (pre-2009 studies concentrated in advanced economies), or that the Digital Paradox Lifecycle inflection does not manifest at meta-analytic resolution. H2 is not supported.</w:t>
       </w:r>
     </w:p>
     <w:p>
@@ -10607,7 +10629,7 @@
         <w:t xml:space="preserve"> </w:t>
       </w:r>
       <w:r>
-        <w:t xml:space="preserve">= 0.414 (</w:t>
+        <w:t xml:space="preserve">= 0.434 (</w:t>
       </w:r>
       <w:r>
         <w:rPr>
@@ -10620,7 +10642,7 @@
         <w:t xml:space="preserve"> </w:t>
       </w:r>
       <w:r>
-        <w:t xml:space="preserve">= 0.228,</w:t>
+        <w:t xml:space="preserve">= 0.230,</w:t>
       </w:r>
       <w:r>
         <w:t xml:space="preserve"> </w:t>
@@ -10636,7 +10658,7 @@
         <w:t xml:space="preserve"> </w:t>
       </w:r>
       <w:r>
-        <w:t xml:space="preserve">= .069) — marginal and</w:t>
+        <w:t xml:space="preserve">= .059) — marginal and</w:t>
       </w:r>
       <w:r>
         <w:t xml:space="preserve"> </w:t>
@@ -10670,7 +10692,7 @@
         <w:t xml:space="preserve"> </w:t>
       </w:r>
       <w:r>
-        <w:t xml:space="preserve">(Kendall's τ): τ = −0.116,</w:t>
+        <w:t xml:space="preserve">(Kendall's τ): τ = −0.119,</w:t>
       </w:r>
       <w:r>
         <w:t xml:space="preserve"> </w:t>
@@ -10686,7 +10708,7 @@
         <w:t xml:space="preserve"> </w:t>
       </w:r>
       <w:r>
-        <w:t xml:space="preserve">= .002 — significant funnel asymmetry; studies with larger standard errors (smaller</w:t>
+        <w:t xml:space="preserve">= .001 — significant funnel asymmetry; studies with larger standard errors (smaller</w:t>
       </w:r>
       <w:r>
         <w:t xml:space="preserve"> </w:t>
@@ -10743,7 +10765,7 @@
         <w:t xml:space="preserve"> </w:t>
       </w:r>
       <w:r>
-        <w:t xml:space="preserve">= 0.040 (95% CI [0.029, 0.051]) — a conservative lower bound. The effect remains positive and significant but is roughly halved relative to the raw estimate (0.075 → 0.040).</w:t>
+        <w:t xml:space="preserve">= 0.041 (95% CI [0.030, 0.052]) — a conservative lower bound. The effect remains positive and significant but is roughly halved relative to the raw estimate (0.076 → 0.041).</w:t>
       </w:r>
     </w:p>
     <w:p>
@@ -10793,7 +10815,7 @@
         <w:t xml:space="preserve"> </w:t>
       </w:r>
       <w:r>
-        <w:t xml:space="preserve">= 81,035, far exceeding the criterion of 5</w:t>
+        <w:t xml:space="preserve">= 81,712, far exceeding the criterion of 5</w:t>
       </w:r>
       <w:r>
         <w:rPr>
@@ -10827,7 +10849,7 @@
         <w:t xml:space="preserve"> </w:t>
       </w:r>
       <w:r>
-        <w:t xml:space="preserve">= .069). Read together with the substantial unexplained heterogeneity (</w:t>
+        <w:t xml:space="preserve">= .059). Read together with the substantial unexplained heterogeneity (</w:t>
       </w:r>
       <w:r>
         <w:rPr>
@@ -10837,7 +10859,7 @@
         <w:t xml:space="preserve">I</w:t>
       </w:r>
       <w:r>
-        <w:t xml:space="preserve">² = 65.5%) and the largely null moderator tests (§§4.3–4.5), the evidence suggests the published average I→P effect is</w:t>
+        <w:t xml:space="preserve">² = 65.9%) and the largely null moderator tests (§§4.3–4.5), the evidence suggests the published average I→P effect is</w:t>
       </w:r>
       <w:r>
         <w:t xml:space="preserve"> </w:t>
@@ -10866,7 +10888,7 @@
         <w:t xml:space="preserve"> </w:t>
       </w:r>
       <w:r>
-        <w:t xml:space="preserve">≈ 0.040) is best read as a conservative lower bound on a small but genuinely positive population effect.</w:t>
+        <w:t xml:space="preserve">≈ 0.041) is best read as a conservative lower bound on a small but genuinely positive population effect.</w:t>
       </w:r>
     </w:p>
     <w:p>
@@ -10957,7 +10979,7 @@
         <w:t xml:space="preserve"> </w:t>
       </w:r>
       <w:r>
-        <w:t xml:space="preserve">= 0.040.</w:t>
+        <w:t xml:space="preserve">= 0.041.</w:t>
       </w:r>
     </w:p>
     <w:bookmarkEnd w:id="58"/>
@@ -11074,31 +11096,31 @@
               <w:jc w:val="left"/>
             </w:pPr>
             <w:r>
-              <w:t xml:space="preserve">330</w:t>
-            </w:r>
-          </w:p>
-        </w:tc>
-        <w:tc>
-          <w:tcPr/>
-          <w:p>
-            <w:pPr>
-              <w:pStyle w:val="Compact"/>
-              <w:jc w:val="left"/>
-            </w:pPr>
-            <w:r>
-              <w:t xml:space="preserve">0.075</w:t>
-            </w:r>
-          </w:p>
-        </w:tc>
-        <w:tc>
-          <w:tcPr/>
-          <w:p>
-            <w:pPr>
-              <w:pStyle w:val="Compact"/>
-              <w:jc w:val="left"/>
-            </w:pPr>
-            <w:r>
-              <w:t xml:space="preserve">[0.062, 0.089]</w:t>
+              <w:t xml:space="preserve">328</w:t>
+            </w:r>
+          </w:p>
+        </w:tc>
+        <w:tc>
+          <w:tcPr/>
+          <w:p>
+            <w:pPr>
+              <w:pStyle w:val="Compact"/>
+              <w:jc w:val="left"/>
+            </w:pPr>
+            <w:r>
+              <w:t xml:space="preserve">0.076</w:t>
+            </w:r>
+          </w:p>
+        </w:tc>
+        <w:tc>
+          <w:tcPr/>
+          <w:p>
+            <w:pPr>
+              <w:pStyle w:val="Compact"/>
+              <w:jc w:val="left"/>
+            </w:pPr>
+            <w:r>
+              <w:t xml:space="preserve">[0.063, 0.089]</w:t>
             </w:r>
           </w:p>
         </w:tc>
@@ -11152,31 +11174,31 @@
               <w:jc w:val="left"/>
             </w:pPr>
             <w:r>
-              <w:t xml:space="preserve">273</w:t>
-            </w:r>
-          </w:p>
-        </w:tc>
-        <w:tc>
-          <w:tcPr/>
-          <w:p>
-            <w:pPr>
-              <w:pStyle w:val="Compact"/>
-              <w:jc w:val="left"/>
-            </w:pPr>
-            <w:r>
-              <w:t xml:space="preserve">0.077</w:t>
-            </w:r>
-          </w:p>
-        </w:tc>
-        <w:tc>
-          <w:tcPr/>
-          <w:p>
-            <w:pPr>
-              <w:pStyle w:val="Compact"/>
-              <w:jc w:val="left"/>
-            </w:pPr>
-            <w:r>
-              <w:t xml:space="preserve">[0.061, 0.094]</w:t>
+              <w:t xml:space="preserve">271</w:t>
+            </w:r>
+          </w:p>
+        </w:tc>
+        <w:tc>
+          <w:tcPr/>
+          <w:p>
+            <w:pPr>
+              <w:pStyle w:val="Compact"/>
+              <w:jc w:val="left"/>
+            </w:pPr>
+            <w:r>
+              <w:t xml:space="preserve">0.078</w:t>
+            </w:r>
+          </w:p>
+        </w:tc>
+        <w:tc>
+          <w:tcPr/>
+          <w:p>
+            <w:pPr>
+              <w:pStyle w:val="Compact"/>
+              <w:jc w:val="left"/>
+            </w:pPr>
+            <w:r>
+              <w:t xml:space="preserve">[0.062, 0.094]</w:t>
             </w:r>
           </w:p>
         </w:tc>
@@ -11218,7 +11240,7 @@
               <w:t xml:space="preserve"> </w:t>
             </w:r>
             <w:r>
-              <w:t xml:space="preserve">&lt; 30</w:t>
+              <w:t xml:space="preserve">&lt; 30 (a-priori)</w:t>
             </w:r>
           </w:p>
         </w:tc>
@@ -11242,31 +11264,31 @@
               <w:jc w:val="left"/>
             </w:pPr>
             <w:r>
-              <w:t xml:space="preserve">0.075</w:t>
-            </w:r>
-          </w:p>
-        </w:tc>
-        <w:tc>
-          <w:tcPr/>
-          <w:p>
-            <w:pPr>
-              <w:pStyle w:val="Compact"/>
-              <w:jc w:val="left"/>
-            </w:pPr>
-            <w:r>
-              <w:t xml:space="preserve">[0.062, 0.088]</w:t>
-            </w:r>
-          </w:p>
-        </w:tc>
-        <w:tc>
-          <w:tcPr/>
-          <w:p>
-            <w:pPr>
-              <w:pStyle w:val="Compact"/>
-              <w:jc w:val="left"/>
-            </w:pPr>
-            <w:r>
-              <w:t xml:space="preserve">Consistent</w:t>
+              <w:t xml:space="preserve">0.076</w:t>
+            </w:r>
+          </w:p>
+        </w:tc>
+        <w:tc>
+          <w:tcPr/>
+          <w:p>
+            <w:pPr>
+              <w:pStyle w:val="Compact"/>
+              <w:jc w:val="left"/>
+            </w:pPr>
+            <w:r>
+              <w:t xml:space="preserve">[0.063, 0.089]</w:t>
+            </w:r>
+          </w:p>
+        </w:tc>
+        <w:tc>
+          <w:tcPr/>
+          <w:p>
+            <w:pPr>
+              <w:pStyle w:val="Compact"/>
+              <w:jc w:val="left"/>
+            </w:pPr>
+            <w:r>
+              <w:t xml:space="preserve">Applied in main</w:t>
             </w:r>
           </w:p>
         </w:tc>
@@ -11292,31 +11314,31 @@
               <w:jc w:val="left"/>
             </w:pPr>
             <w:r>
-              <w:t xml:space="preserve">261</w:t>
-            </w:r>
-          </w:p>
-        </w:tc>
-        <w:tc>
-          <w:tcPr/>
-          <w:p>
-            <w:pPr>
-              <w:pStyle w:val="Compact"/>
-              <w:jc w:val="left"/>
-            </w:pPr>
-            <w:r>
-              <w:t xml:space="preserve">0.072</w:t>
-            </w:r>
-          </w:p>
-        </w:tc>
-        <w:tc>
-          <w:tcPr/>
-          <w:p>
-            <w:pPr>
-              <w:pStyle w:val="Compact"/>
-              <w:jc w:val="left"/>
-            </w:pPr>
-            <w:r>
-              <w:t xml:space="preserve">[0.056, 0.088]</w:t>
+              <w:t xml:space="preserve">259</w:t>
+            </w:r>
+          </w:p>
+        </w:tc>
+        <w:tc>
+          <w:tcPr/>
+          <w:p>
+            <w:pPr>
+              <w:pStyle w:val="Compact"/>
+              <w:jc w:val="left"/>
+            </w:pPr>
+            <w:r>
+              <w:t xml:space="preserve">0.073</w:t>
+            </w:r>
+          </w:p>
+        </w:tc>
+        <w:tc>
+          <w:tcPr/>
+          <w:p>
+            <w:pPr>
+              <w:pStyle w:val="Compact"/>
+              <w:jc w:val="left"/>
+            </w:pPr>
+            <w:r>
+              <w:t xml:space="preserve">[0.058, 0.088]</w:t>
             </w:r>
           </w:p>
         </w:tc>
@@ -11354,7 +11376,7 @@
               <w:jc w:val="left"/>
             </w:pPr>
             <w:r>
-              <w:t xml:space="preserve">141</w:t>
+              <w:t xml:space="preserve">140</w:t>
             </w:r>
           </w:p>
         </w:tc>
@@ -11416,7 +11438,7 @@
               <w:jc w:val="left"/>
             </w:pPr>
             <w:r>
-              <w:t xml:space="preserve">330</w:t>
+              <w:t xml:space="preserve">328</w:t>
             </w:r>
           </w:p>
         </w:tc>
@@ -11440,7 +11462,7 @@
               <w:jc w:val="left"/>
             </w:pPr>
             <w:r>
-              <w:t xml:space="preserve">[0.063, 0.086]</w:t>
+              <w:t xml:space="preserve">[0.064, 0.086]</w:t>
             </w:r>
           </w:p>
         </w:tc>
@@ -11491,19 +11513,19 @@
               <w:jc w:val="left"/>
             </w:pPr>
             <w:r>
-              <w:t xml:space="preserve">330</w:t>
-            </w:r>
-          </w:p>
-        </w:tc>
-        <w:tc>
-          <w:tcPr/>
-          <w:p>
-            <w:pPr>
-              <w:pStyle w:val="Compact"/>
-              <w:jc w:val="left"/>
-            </w:pPr>
-            <w:r>
-              <w:t xml:space="preserve">[0.072, 0.076]</w:t>
+              <w:t xml:space="preserve">328</w:t>
+            </w:r>
+          </w:p>
+        </w:tc>
+        <w:tc>
+          <w:tcPr/>
+          <w:p>
+            <w:pPr>
+              <w:pStyle w:val="Compact"/>
+              <w:jc w:val="left"/>
+            </w:pPr>
+            <w:r>
+              <w:t xml:space="preserve">[0.073, 0.076]</w:t>
             </w:r>
           </w:p>
         </w:tc>
@@ -11554,7 +11576,7 @@
         <w:t xml:space="preserve"> </w:t>
       </w:r>
       <w:r>
-        <w:t xml:space="preserve">= 0.075 is robust across all sensitivity checks. The leave-one-out range [0.072, 0.076] confirms that no single study drives the result (0 of 330 iterations change the sign or significance). The DL two-level estimator returns an identical point estimate (0.075), confirming that three-level nesting adds precision without biasing the pooled effect. The FSTS-only restriction (</w:t>
+        <w:t xml:space="preserve">= 0.076 is robust across all sensitivity checks. The leave-one-out range [0.073, 0.076] confirms that no single study drives the result (0 of 328 iterations change the sign or significance). The DL two-level estimator returns a near-identical point estimate (0.075), confirming that three-level nesting adds precision without biasing the pooled effect. The FSTS-only restriction (</w:t>
       </w:r>
       <w:r>
         <w:rPr>
@@ -11583,7 +11605,7 @@
         <w:t xml:space="preserve"> </w:t>
       </w:r>
       <w:r>
-        <w:t xml:space="preserve">= 141) is the most conservative measurement check and remains positive and significant, indicating that DOI operationalization heterogeneity modestly inflates the pooled effect when broader DOI measures are pooled in. The accounting-performance subset (</w:t>
+        <w:t xml:space="preserve">= 140) is the most conservative measurement check and remains positive and significant, indicating that DOI operationalization heterogeneity modestly inflates the pooled effect when broader DOI measures are pooled in. The accounting-performance subset (</w:t>
       </w:r>
       <w:r>
         <w:rPr>
@@ -11596,7 +11618,7 @@
         <w:t xml:space="preserve"> </w:t>
       </w:r>
       <w:r>
-        <w:t xml:space="preserve">= 0.072,</w:t>
+        <w:t xml:space="preserve">= 0.073,</w:t>
       </w:r>
       <w:r>
         <w:t xml:space="preserve"> </w:t>
@@ -11612,7 +11634,7 @@
         <w:t xml:space="preserve"> </w:t>
       </w:r>
       <w:r>
-        <w:t xml:space="preserve">= 261), which dominates the corpus, closely tracks the overall estimate.</w:t>
+        <w:t xml:space="preserve">= 259), which dominates the corpus, closely tracks the overall estimate.</w:t>
       </w:r>
     </w:p>
     <w:p>
@@ -11741,7 +11763,7 @@
         <w:t xml:space="preserve"> </w:t>
       </w:r>
       <w:r>
-        <w:t xml:space="preserve">= 0.075,</w:t>
+        <w:t xml:space="preserve">= 0.076,</w:t>
       </w:r>
       <w:r>
         <w:t xml:space="preserve"> </w:t>
@@ -11757,7 +11779,7 @@
         <w:t xml:space="preserve"> </w:t>
       </w:r>
       <w:r>
-        <w:t xml:space="preserve">= 280) is consistent with country-level evidence from across the global study corpus, including the Asia-Pacific primary studies underlying the ICBEF 2025 baseline ([Authors], 2024). The pooled effect is positive and significant, confirming that export-intensive firms tend to outperform domestically focused peers even after adjusting for firm size, age, and industry.</w:t>
+        <w:t xml:space="preserve">= 278) is consistent with country-level evidence from across the global study corpus, including the Asia-Pacific primary studies underlying the ICBEF 2025 baseline ([Authors], 2024). The pooled effect is positive and significant, confirming that export-intensive firms tend to outperform domestically focused peers even after adjusting for firm size, age, and industry.</w:t>
       </w:r>
     </w:p>
     <w:p>
@@ -12162,62 +12184,7 @@
         <w:t xml:space="preserve"> </w:t>
       </w:r>
       <w:r>
-        <w:t xml:space="preserve">H1 is confirmed — the ICRV between-regime omnibus test (</w:t>
-      </w:r>
-      <w:r>
-        <w:rPr>
-          <w:iCs/>
-          <w:i/>
-        </w:rPr>
-        <w:t xml:space="preserve">Q</w:t>
-      </w:r>
-      <w:r>
-        <w:t xml:space="preserve">_M = 9.81,</w:t>
-      </w:r>
-      <w:r>
-        <w:t xml:space="preserve"> </w:t>
-      </w:r>
-      <w:r>
-        <w:rPr>
-          <w:iCs/>
-          <w:i/>
-        </w:rPr>
-        <w:t xml:space="preserve">p</w:t>
-      </w:r>
-      <w:r>
-        <w:t xml:space="preserve"> </w:t>
-      </w:r>
-      <w:r>
-        <w:t xml:space="preserve">= .044) is statistically significant, establishing that I→P effect sizes differ across coded regimes. Diagnostically, however, that significance is generated almost entirely by the sparse, high-effect Frontier cell (</w:t>
-      </w:r>
-      <w:r>
-        <w:rPr>
-          <w:iCs/>
-          <w:i/>
-        </w:rPr>
-        <w:t xml:space="preserve">r̄</w:t>
-      </w:r>
-      <w:r>
-        <w:t xml:space="preserve"> </w:t>
-      </w:r>
-      <w:r>
-        <w:t xml:space="preserve">= 0.249,</w:t>
-      </w:r>
-      <w:r>
-        <w:t xml:space="preserve"> </w:t>
-      </w:r>
-      <w:r>
-        <w:rPr>
-          <w:iCs/>
-          <w:i/>
-        </w:rPr>
-        <w:t xml:space="preserve">K</w:t>
-      </w:r>
-      <w:r>
-        <w:t xml:space="preserve"> </w:t>
-      </w:r>
-      <w:r>
-        <w:t xml:space="preserve">= 4); the three well-populated single-country regimes are flat (Advanced 0.080, Emerging 0.074, Upper-middle 0.065) and the cross-regime pooled studies sit lowest (MX 0.057). The directional propositions E1a (Advanced largest) and E1b (Frontier smallest) are therefore</w:t>
+        <w:t xml:space="preserve">H1 is</w:t>
       </w:r>
       <w:r>
         <w:t xml:space="preserve"> </w:t>
@@ -12233,6 +12200,77 @@
         <w:t xml:space="preserve"> </w:t>
       </w:r>
       <w:r>
+        <w:t xml:space="preserve">supported — the ICRV between-regime omnibus test is marginal (</w:t>
+      </w:r>
+      <w:r>
+        <w:rPr>
+          <w:iCs/>
+          <w:i/>
+        </w:rPr>
+        <w:t xml:space="preserve">Q</w:t>
+      </w:r>
+      <w:r>
+        <w:t xml:space="preserve">_M = 9.46,</w:t>
+      </w:r>
+      <w:r>
+        <w:t xml:space="preserve"> </w:t>
+      </w:r>
+      <w:r>
+        <w:rPr>
+          <w:iCs/>
+          <w:i/>
+        </w:rPr>
+        <w:t xml:space="preserve">p</w:t>
+      </w:r>
+      <w:r>
+        <w:t xml:space="preserve"> </w:t>
+      </w:r>
+      <w:r>
+        <w:t xml:space="preserve">= .051) and does not clear the conventional threshold. The only non-trivial departure comes from the sparse, high-effect Frontier cell (</w:t>
+      </w:r>
+      <w:r>
+        <w:rPr>
+          <w:iCs/>
+          <w:i/>
+        </w:rPr>
+        <w:t xml:space="preserve">r̄</w:t>
+      </w:r>
+      <w:r>
+        <w:t xml:space="preserve"> </w:t>
+      </w:r>
+      <w:r>
+        <w:t xml:space="preserve">= 0.249,</w:t>
+      </w:r>
+      <w:r>
+        <w:t xml:space="preserve"> </w:t>
+      </w:r>
+      <w:r>
+        <w:rPr>
+          <w:iCs/>
+          <w:i/>
+        </w:rPr>
+        <w:t xml:space="preserve">K</w:t>
+      </w:r>
+      <w:r>
+        <w:t xml:space="preserve"> </w:t>
+      </w:r>
+      <w:r>
+        <w:t xml:space="preserve">= 4); the three well-populated single-country regimes are flat (Advanced 0.079, Emerging 0.073, Upper-middle 0.065) and the cross-regime pooled studies sit at the low end (MX 0.064). The directional propositions E1a (Advanced largest) and E1b (Frontier smallest) are therefore</w:t>
+      </w:r>
+      <w:r>
+        <w:t xml:space="preserve"> </w:t>
+      </w:r>
+      <w:r>
+        <w:rPr>
+          <w:bCs/>
+          <w:b/>
+        </w:rPr>
+        <w:t xml:space="preserve">not</w:t>
+      </w:r>
+      <w:r>
+        <w:t xml:space="preserve"> </w:t>
+      </w:r>
+      <w:r>
         <w:t xml:space="preserve">supported: the data show neither a monotone institutional gradient nor a Frontier floor. This bounds, rather than confirms, CIMT's institutional-gradient prediction and indicates that any genuine regime effect is too small to detect against the dominant within-study heterogeneity.</w:t>
       </w:r>
     </w:p>
@@ -12277,7 +12315,7 @@
         <w:t xml:space="preserve"> </w:t>
       </w:r>
       <w:r>
-        <w:t xml:space="preserve">= 280 studies (</w:t>
+        <w:t xml:space="preserve">= 278 studies (</w:t>
       </w:r>
       <w:r>
         <w:rPr>
@@ -12290,7 +12328,7 @@
         <w:t xml:space="preserve"> </w:t>
       </w:r>
       <w:r>
-        <w:t xml:space="preserve">= 330 effects) is among the most comprehensive quantitative syntheses of I→P evidence to apply three-level modeling, extending the ICBEF 2025 Asia-Pacific baseline (</w:t>
+        <w:t xml:space="preserve">= 328 effects) is among the most comprehensive quantitative syntheses of I→P evidence to apply three-level modeling, extending the ICBEF 2025 Asia-Pacific baseline (</w:t>
       </w:r>
       <w:r>
         <w:rPr>
@@ -12303,7 +12341,7 @@
         <w:t xml:space="preserve"> </w:t>
       </w:r>
       <w:r>
-        <w:t xml:space="preserve">= 113) by 167 studies with a globally inclusive ICRV-coded corpus. Three-level modeling correctly partitions within-study and between-study variance, and the baseline</w:t>
+        <w:t xml:space="preserve">= 113) by 165 studies with a globally inclusive ICRV-coded corpus. Three-level modeling correctly partitions within-study and between-study variance, and the baseline</w:t>
       </w:r>
       <w:r>
         <w:t xml:space="preserve"> </w:t>
@@ -12319,7 +12357,7 @@
         <w:t xml:space="preserve"> </w:t>
       </w:r>
       <w:r>
-        <w:t xml:space="preserve">= 0.075 replicates prior estimates while remaining robust across six sensitivity checks. A novel descriptive contribution follows from the decomposition: the unexplained heterogeneity is concentrated</w:t>
+        <w:t xml:space="preserve">= 0.076 replicates prior estimates while remaining robust across six sensitivity checks. A novel descriptive contribution follows from the decomposition: the unexplained heterogeneity is concentrated</w:t>
       </w:r>
       <w:r>
         <w:t xml:space="preserve"> </w:t>
@@ -12348,7 +12386,7 @@
         <w:t xml:space="preserve">I</w:t>
       </w:r>
       <w:r>
-        <w:t xml:space="preserve">² = 56.6%) rather than between them (Level 3,</w:t>
+        <w:t xml:space="preserve">² = 57.1%) rather than between them (Level 3,</w:t>
       </w:r>
       <w:r>
         <w:t xml:space="preserve"> </w:t>
@@ -12361,7 +12399,7 @@
         <w:t xml:space="preserve">I</w:t>
       </w:r>
       <w:r>
-        <w:t xml:space="preserve">² = 8.9%), reframing where the I→P "context" problem actually resides.</w:t>
+        <w:t xml:space="preserve">² = 8.8%), reframing where the I→P "context" problem actually resides.</w:t>
       </w:r>
     </w:p>
     <w:p>
@@ -12379,7 +12417,7 @@
         <w:t xml:space="preserve"> </w:t>
       </w:r>
       <w:r>
-        <w:t xml:space="preserve">This paper is the first to formally test ICRV institutional regime, national digital adoption (cDAI), and Digital Paradox Lifecycle phase as moderators in a three-level MARA. H1 (between-regime Q_M test) is confirmed (</w:t>
+        <w:t xml:space="preserve">This paper is the first to formally test ICRV institutional regime, national digital adoption (cDAI), and Digital Paradox Lifecycle phase as moderators in a three-level MARA. None of the three moderators is confirmed: the ICRV omnibus is marginal (</w:t>
       </w:r>
       <w:r>
         <w:rPr>
@@ -12389,7 +12427,7 @@
         <w:t xml:space="preserve">Q</w:t>
       </w:r>
       <w:r>
-        <w:t xml:space="preserve">_M = 9.81,</w:t>
+        <w:t xml:space="preserve">_M = 9.46,</w:t>
       </w:r>
       <w:r>
         <w:t xml:space="preserve"> </w:t>
@@ -12405,7 +12443,7 @@
         <w:t xml:space="preserve"> </w:t>
       </w:r>
       <w:r>
-        <w:t xml:space="preserve">= .044), but diagnostically the effect is driven by a sparse Frontier cell rather than an institutional gradient; the directional propositions (E1a/E1b) and the cDAI and DPL hypotheses (H2, H3) are not confirmed under rigorous between-group testing. These results set theoretically informative bounds: even with three well-populated single-country regimes (Advanced</w:t>
+        <w:t xml:space="preserve">= .051) and driven by a sparse Frontier cell rather than an institutional gradient, while cDAI and DPL are clearly null. These results set theoretically informative bounds: even with three well-populated single-country regimes (Advanced</w:t>
       </w:r>
       <w:r>
         <w:t xml:space="preserve"> </w:t>
@@ -12421,7 +12459,7 @@
         <w:t xml:space="preserve"> </w:t>
       </w:r>
       <w:r>
-        <w:t xml:space="preserve">= 158, Emerging</w:t>
+        <w:t xml:space="preserve">= 157, Emerging</w:t>
       </w:r>
       <w:r>
         <w:t xml:space="preserve"> </w:t>
@@ -12471,7 +12509,7 @@
         <w:t xml:space="preserve"> </w:t>
       </w:r>
       <w:r>
-        <w:t xml:space="preserve">The bias diagnostics diverge: Begg's rank test (τ = −0.116,</w:t>
+        <w:t xml:space="preserve">The bias diagnostics diverge: Begg's rank test (τ = −0.119,</w:t>
       </w:r>
       <w:r>
         <w:t xml:space="preserve"> </w:t>
@@ -12487,7 +12525,7 @@
         <w:t xml:space="preserve"> </w:t>
       </w:r>
       <w:r>
-        <w:t xml:space="preserve">= .002) and trim-and-fill (</w:t>
+        <w:t xml:space="preserve">= .001) and trim-and-fill (</w:t>
       </w:r>
       <w:r>
         <w:rPr>
@@ -12513,7 +12551,7 @@
         <w:t xml:space="preserve"> </w:t>
       </w:r>
       <w:r>
-        <w:t xml:space="preserve">= 0.040) indicate left-side asymmetry, whereas Egger's precision-weighted regression is only marginal (</w:t>
+        <w:t xml:space="preserve">= 0.041) indicate left-side asymmetry, whereas Egger's precision-weighted regression is only marginal (</w:t>
       </w:r>
       <w:r>
         <w:rPr>
@@ -12526,7 +12564,7 @@
         <w:t xml:space="preserve"> </w:t>
       </w:r>
       <w:r>
-        <w:t xml:space="preserve">= .069) and the fail-safe</w:t>
+        <w:t xml:space="preserve">= .059) and the fail-safe</w:t>
       </w:r>
       <w:r>
         <w:t xml:space="preserve"> </w:t>
@@ -12542,7 +12580,7 @@
         <w:t xml:space="preserve"> </w:t>
       </w:r>
       <w:r>
-        <w:t xml:space="preserve">(81,035) is very large. Read together, the evidence points to a</w:t>
+        <w:t xml:space="preserve">(81,712) is very large. Read together, the evidence points to a</w:t>
       </w:r>
       <w:r>
         <w:t xml:space="preserve"> </w:t>
@@ -12574,7 +12612,7 @@
         <w:t xml:space="preserve"> </w:t>
       </w:r>
       <w:r>
-        <w:t xml:space="preserve">≈ 0.040 is best treated as a conservative lower bound on a small but genuine positive effect, not as the point estimate. This tempered reading is itself a contribution, correcting the stronger "bias-dominated" narrative that a single significant test might otherwise license.</w:t>
+        <w:t xml:space="preserve">≈ 0.041 is best treated as a conservative lower bound on a small but genuine positive effect, not as the point estimate. This tempered reading is itself a contribution, correcting the stronger "bias-dominated" narrative that a single significant test might otherwise license.</w:t>
       </w:r>
     </w:p>
     <w:bookmarkEnd w:id="65"/>
@@ -12623,7 +12661,7 @@
         <w:t xml:space="preserve"> </w:t>
       </w:r>
       <w:r>
-        <w:t xml:space="preserve">= 0.075) at face value, the average performance return to internationalization is small; the trim-and-fill lower bound (</w:t>
+        <w:t xml:space="preserve">= 0.076) at face value, the average performance return to internationalization is small; the trim-and-fill lower bound (</w:t>
       </w:r>
       <w:r>
         <w:rPr>
@@ -12636,7 +12674,7 @@
         <w:t xml:space="preserve"> </w:t>
       </w:r>
       <w:r>
-        <w:t xml:space="preserve">≈ 0.040) is more prudent for planning. Firms that expect large gains from export intensification alone are likely to be disappointed. Internationalization strategy should be driven by firm-specific competitive advantages and market-specific learning, not by the assumption that "internationalization improves performance" unconditionally.</w:t>
+        <w:t xml:space="preserve">≈ 0.041) is more prudent for planning. Firms that expect large gains from export intensification alone are likely to be disappointed. Internationalization strategy should be driven by firm-specific competitive advantages and market-specific learning, not by the assumption that "internationalization improves performance" unconditionally.</w:t>
       </w:r>
     </w:p>
     <w:p>
@@ -12667,7 +12705,7 @@
         <w:t xml:space="preserve">k</w:t>
       </w:r>
       <w:r>
-        <w:t xml:space="preserve">₀ = 58 studies, but only marginal Egger) is a call for pre-registered studies with explicit null-hypothesis reporting. More consequential is the variance structure: with 56.6% of heterogeneity arising</w:t>
+        <w:t xml:space="preserve">₀ = 58 studies, but only marginal Egger) is a call for pre-registered studies with explicit null-hypothesis reporting. More consequential is the variance structure: with 57.1% of heterogeneity arising</w:t>
       </w:r>
       <w:r>
         <w:t xml:space="preserve"> </w:t>
@@ -12717,7 +12755,7 @@
         <w:t xml:space="preserve"> </w:t>
       </w:r>
       <w:r>
-        <w:t xml:space="preserve">= 0.080, Emerging 0.074, Upper-middle 0.065; differences non-significant) does not justify treating institutional quality as the primary determinant of export-led productivity. Export-promotion programmes should target firm-level capabilities (technological, managerial) at least as much as institutional reform, given that the institution–performance gradient is not confirmed at current sample sizes.</w:t>
+        <w:t xml:space="preserve">= 0.079, Emerging 0.073, Upper-middle 0.065; differences non-significant) does not justify treating institutional quality as the primary determinant of export-led productivity. Export-promotion programmes should target firm-level capabilities (technological, managerial) at least as much as institutional reform, given that the institution–performance gradient is not confirmed at current sample sizes.</w:t>
       </w:r>
     </w:p>
     <w:bookmarkEnd w:id="66"/>
@@ -12873,7 +12911,7 @@
         <w:t xml:space="preserve"> </w:t>
       </w:r>
       <w:r>
-        <w:t xml:space="preserve">= 280 studies (</w:t>
+        <w:t xml:space="preserve">= 278 studies (</w:t>
       </w:r>
       <w:r>
         <w:rPr>
@@ -12886,7 +12924,7 @@
         <w:t xml:space="preserve"> </w:t>
       </w:r>
       <w:r>
-        <w:t xml:space="preserve">= 330 effects) and introducing three novel moderators for formal meta-analytic testing: ICRV institutional regime, country-level digital adoption (cDAI), and Digital Paradox Lifecycle (DPL) phase. The three-level pooled effect (</w:t>
+        <w:t xml:space="preserve">= 328 effects) and introducing three novel moderators for formal meta-analytic testing: ICRV institutional regime, country-level digital adoption (cDAI), and Digital Paradox Lifecycle (DPL) phase. The three-level pooled effect (</w:t>
       </w:r>
       <w:r>
         <w:rPr>
@@ -12899,7 +12937,7 @@
         <w:t xml:space="preserve"> </w:t>
       </w:r>
       <w:r>
-        <w:t xml:space="preserve">= 0.075, 95% CI [0.062, 0.089],</w:t>
+        <w:t xml:space="preserve">= 0.076, 95% CI [0.062, 0.089],</w:t>
       </w:r>
       <w:r>
         <w:t xml:space="preserve"> </w:t>
@@ -12912,7 +12950,7 @@
         <w:t xml:space="preserve">I</w:t>
       </w:r>
       <w:r>
-        <w:t xml:space="preserve">²_total = 65.5%) confirms a small but consistent positive I→P relationship globally, robust across six sensitivity checks.</w:t>
+        <w:t xml:space="preserve">²_total = 65.9%) confirms a small but consistent positive I→P relationship globally, robust across six sensitivity checks.</w:t>
       </w:r>
     </w:p>
     <w:p>
@@ -12920,224 +12958,49 @@
         <w:pStyle w:val="BodyText"/>
       </w:pPr>
       <w:r>
-        <w:t xml:space="preserve">H1 (ICRV between-regime Q_M test) is confirmed (</w:t>
-      </w:r>
-      <w:r>
-        <w:rPr>
-          <w:iCs/>
-          <w:i/>
-        </w:rPr>
-        <w:t xml:space="preserve">Q</w:t>
-      </w:r>
-      <w:r>
-        <w:t xml:space="preserve">_M = 9.81,</w:t>
-      </w:r>
-      <w:r>
-        <w:t xml:space="preserve"> </w:t>
-      </w:r>
-      <w:r>
-        <w:rPr>
-          <w:iCs/>
-          <w:i/>
-        </w:rPr>
-        <w:t xml:space="preserve">p</w:t>
-      </w:r>
-      <w:r>
-        <w:t xml:space="preserve"> </w:t>
-      </w:r>
-      <w:r>
-        <w:t xml:space="preserve">= .044), establishing that I→P effect sizes differ across coded regimes; diagnostically, however, the omnibus effect is generated by a sparse Frontier cell (</w:t>
-      </w:r>
-      <w:r>
-        <w:rPr>
-          <w:iCs/>
-          <w:i/>
-        </w:rPr>
-        <w:t xml:space="preserve">K</w:t>
-      </w:r>
-      <w:r>
-        <w:t xml:space="preserve"> </w:t>
-      </w:r>
-      <w:r>
-        <w:t xml:space="preserve">= 4) rather than a monotone gradient. Across the three well-populated single-country regimes the effect is flat (Advanced 0.080, Emerging 0.074, Upper-middle 0.065), so the directional propositions E1a/E1b are not supported, and the cDAI (H3:</w:t>
-      </w:r>
-      <w:r>
-        <w:t xml:space="preserve"> </w:t>
-      </w:r>
-      <w:r>
-        <w:rPr>
-          <w:iCs/>
-          <w:i/>
-        </w:rPr>
-        <w:t xml:space="preserve">Q</w:t>
-      </w:r>
-      <w:r>
-        <w:t xml:space="preserve">_M = 0.19,</w:t>
-      </w:r>
-      <w:r>
-        <w:t xml:space="preserve"> </w:t>
-      </w:r>
-      <w:r>
-        <w:rPr>
-          <w:iCs/>
-          <w:i/>
-        </w:rPr>
-        <w:t xml:space="preserve">p</w:t>
-      </w:r>
-      <w:r>
-        <w:t xml:space="preserve"> </w:t>
-      </w:r>
-      <w:r>
-        <w:t xml:space="preserve">= .911) and DPL phase (H2:</w:t>
-      </w:r>
-      <w:r>
-        <w:t xml:space="preserve"> </w:t>
-      </w:r>
-      <w:r>
-        <w:rPr>
-          <w:iCs/>
-          <w:i/>
-        </w:rPr>
-        <w:t xml:space="preserve">Q</w:t>
-      </w:r>
-      <w:r>
-        <w:t xml:space="preserve">_M = 0.80,</w:t>
-      </w:r>
-      <w:r>
-        <w:t xml:space="preserve"> </w:t>
-      </w:r>
-      <w:r>
-        <w:rPr>
-          <w:iCs/>
-          <w:i/>
-        </w:rPr>
-        <w:t xml:space="preserve">p</w:t>
-      </w:r>
-      <w:r>
-        <w:t xml:space="preserve"> </w:t>
-      </w:r>
-      <w:r>
-        <w:t xml:space="preserve">= .671) moderators do not explain between-study heterogeneity. The CIMT institutional gradient (E1a/E1b), digital-infrastructure amplification (H3), and DPL temporal moderation (H2) remain theoretically motivated but empirically unconfirmed — null results that should inform future pre-registered replications.</w:t>
-      </w:r>
-    </w:p>
-    <w:p>
-      <w:pPr>
-        <w:pStyle w:val="BodyText"/>
-      </w:pPr>
-      <w:r>
-        <w:t xml:space="preserve">A second substantive finding concerns the structure and inflation of the effect. Publication-bias diagnostics are mixed — Begg's test (τ = −0.116,</w:t>
-      </w:r>
-      <w:r>
-        <w:t xml:space="preserve"> </w:t>
-      </w:r>
-      <w:r>
-        <w:rPr>
-          <w:iCs/>
-          <w:i/>
-        </w:rPr>
-        <w:t xml:space="preserve">p</w:t>
-      </w:r>
-      <w:r>
-        <w:t xml:space="preserve"> </w:t>
-      </w:r>
-      <w:r>
-        <w:t xml:space="preserve">= .002) and trim-and-fill (</w:t>
-      </w:r>
-      <w:r>
-        <w:rPr>
-          <w:iCs/>
-          <w:i/>
-        </w:rPr>
-        <w:t xml:space="preserve">k</w:t>
-      </w:r>
-      <w:r>
-        <w:t xml:space="preserve">₀ = 58 imputed; adjusted</w:t>
-      </w:r>
-      <w:r>
-        <w:t xml:space="preserve"> </w:t>
-      </w:r>
-      <w:r>
-        <w:rPr>
-          <w:iCs/>
-          <w:i/>
-        </w:rPr>
-        <w:t xml:space="preserve">r̄</w:t>
-      </w:r>
-      <w:r>
-        <w:t xml:space="preserve"> </w:t>
-      </w:r>
-      <w:r>
-        <w:t xml:space="preserve">= 0.040, 95% CI [0.029, 0.051]) indicate modest left-side asymmetry, while Egger's regression is only marginal (</w:t>
-      </w:r>
-      <w:r>
-        <w:rPr>
-          <w:iCs/>
-          <w:i/>
-        </w:rPr>
-        <w:t xml:space="preserve">p</w:t>
-      </w:r>
-      <w:r>
-        <w:t xml:space="preserve"> </w:t>
-      </w:r>
-      <w:r>
-        <w:t xml:space="preserve">= .069) — so the trim-and-fill estimate (</w:t>
-      </w:r>
-      <w:r>
-        <w:rPr>
-          <w:iCs/>
-          <w:i/>
-        </w:rPr>
-        <w:t xml:space="preserve">r̄</w:t>
-      </w:r>
-      <w:r>
-        <w:t xml:space="preserve"> </w:t>
-      </w:r>
-      <w:r>
-        <w:t xml:space="preserve">≈ 0.040) is best read as a conservative lower bound rather than evidence of a bias-dominated literature. Critically, the heterogeneity puzzle (</w:t>
-      </w:r>
-      <w:r>
-        <w:rPr>
-          <w:iCs/>
-          <w:i/>
-        </w:rPr>
-        <w:t xml:space="preserve">I</w:t>
-      </w:r>
-      <w:r>
-        <w:t xml:space="preserve">² = 65.5%) is concentrated</w:t>
-      </w:r>
-      <w:r>
-        <w:t xml:space="preserve"> </w:t>
-      </w:r>
-      <w:r>
-        <w:rPr>
-          <w:iCs/>
-          <w:i/>
-        </w:rPr>
-        <w:t xml:space="preserve">within</w:t>
-      </w:r>
-      <w:r>
-        <w:t xml:space="preserve"> </w:t>
-      </w:r>
-      <w:r>
-        <w:t xml:space="preserve">studies (Level 2, 56.6%) far more than between them (Level 3, 8.9%): unexplained variance in I→P arises chiefly from analytic choices inside primary studies rather than from cross-country institutional differences — which is precisely why study-level country and time moderators leave it unresolved.</w:t>
-      </w:r>
-    </w:p>
-    <w:p>
-      <w:pPr>
-        <w:pStyle w:val="BodyText"/>
-      </w:pPr>
+        <w:t xml:space="preserve">H1 (ICRV between-regime Q_M test) is</w:t>
+      </w:r>
+      <w:r>
+        <w:t xml:space="preserve"> </w:t>
+      </w:r>
       <w:r>
         <w:rPr>
           <w:bCs/>
           <w:b/>
         </w:rPr>
-        <w:t xml:space="preserve">Limitations.</w:t>
-      </w:r>
-      <w:r>
-        <w:t xml:space="preserve"> </w:t>
-      </w:r>
-      <w:r>
-        <w:t xml:space="preserve">Five inferential constraints bound these conclusions. First, the moderator hypotheses are not confirmed; for cDAI and DPL this reflects genuine null between-group differences, while for ICRV the only non-flat cell (Frontier) is too sparse (</w:t>
+        <w:t xml:space="preserve">not</w:t>
+      </w:r>
+      <w:r>
+        <w:t xml:space="preserve"> </w:t>
+      </w:r>
+      <w:r>
+        <w:t xml:space="preserve">supported — the omnibus is marginal (</w:t>
+      </w:r>
+      <w:r>
+        <w:rPr>
+          <w:iCs/>
+          <w:i/>
+        </w:rPr>
+        <w:t xml:space="preserve">Q</w:t>
+      </w:r>
+      <w:r>
+        <w:t xml:space="preserve">_M = 9.46,</w:t>
+      </w:r>
+      <w:r>
+        <w:t xml:space="preserve"> </w:t>
+      </w:r>
+      <w:r>
+        <w:rPr>
+          <w:iCs/>
+          <w:i/>
+        </w:rPr>
+        <w:t xml:space="preserve">p</w:t>
+      </w:r>
+      <w:r>
+        <w:t xml:space="preserve"> </w:t>
+      </w:r>
+      <w:r>
+        <w:t xml:space="preserve">= .051) and does not clear the .05 threshold; any departure is generated by a sparse Frontier cell (</w:t>
       </w:r>
       <w:r>
         <w:rPr>
@@ -13150,20 +13013,99 @@
         <w:t xml:space="preserve"> </w:t>
       </w:r>
       <w:r>
-        <w:t xml:space="preserve">= 4) for reliable inference. A formal search targeting Frontier and SIDS contexts is required before the ICRV result can be interpreted as definitive. Second, the Frontier-group anomaly (</w:t>
-      </w:r>
-      <w:r>
-        <w:rPr>
-          <w:iCs/>
-          <w:i/>
-        </w:rPr>
-        <w:t xml:space="preserve">K</w:t>
-      </w:r>
-      <w:r>
-        <w:t xml:space="preserve"> </w:t>
-      </w:r>
-      <w:r>
-        <w:t xml:space="preserve">= 4,</w:t>
+        <w:t xml:space="preserve">= 4) rather than a monotone gradient. Across the three well-populated single-country regimes the effect is flat (Advanced 0.079, Emerging 0.073, Upper-middle 0.065), so the directional propositions E1a/E1b are not supported, and the cDAI (H3:</w:t>
+      </w:r>
+      <w:r>
+        <w:t xml:space="preserve"> </w:t>
+      </w:r>
+      <w:r>
+        <w:rPr>
+          <w:iCs/>
+          <w:i/>
+        </w:rPr>
+        <w:t xml:space="preserve">Q</w:t>
+      </w:r>
+      <w:r>
+        <w:t xml:space="preserve">_M = 0.23,</w:t>
+      </w:r>
+      <w:r>
+        <w:t xml:space="preserve"> </w:t>
+      </w:r>
+      <w:r>
+        <w:rPr>
+          <w:iCs/>
+          <w:i/>
+        </w:rPr>
+        <w:t xml:space="preserve">p</w:t>
+      </w:r>
+      <w:r>
+        <w:t xml:space="preserve"> </w:t>
+      </w:r>
+      <w:r>
+        <w:t xml:space="preserve">= .893) and DPL phase (H2:</w:t>
+      </w:r>
+      <w:r>
+        <w:t xml:space="preserve"> </w:t>
+      </w:r>
+      <w:r>
+        <w:rPr>
+          <w:iCs/>
+          <w:i/>
+        </w:rPr>
+        <w:t xml:space="preserve">Q</w:t>
+      </w:r>
+      <w:r>
+        <w:t xml:space="preserve">_M = 0.47,</w:t>
+      </w:r>
+      <w:r>
+        <w:t xml:space="preserve"> </w:t>
+      </w:r>
+      <w:r>
+        <w:rPr>
+          <w:iCs/>
+          <w:i/>
+        </w:rPr>
+        <w:t xml:space="preserve">p</w:t>
+      </w:r>
+      <w:r>
+        <w:t xml:space="preserve"> </w:t>
+      </w:r>
+      <w:r>
+        <w:t xml:space="preserve">= .789) moderators do not explain between-study heterogeneity. The CIMT institutional gradient (E1a/E1b), digital-infrastructure amplification (H3), and DPL temporal moderation (H2) remain theoretically motivated but empirically unconfirmed — null results that should inform future pre-registered replications.</w:t>
+      </w:r>
+    </w:p>
+    <w:p>
+      <w:pPr>
+        <w:pStyle w:val="BodyText"/>
+      </w:pPr>
+      <w:r>
+        <w:t xml:space="preserve">A second substantive finding concerns the structure and inflation of the effect. Publication-bias diagnostics are mixed — Begg's test (τ = −0.119,</w:t>
+      </w:r>
+      <w:r>
+        <w:t xml:space="preserve"> </w:t>
+      </w:r>
+      <w:r>
+        <w:rPr>
+          <w:iCs/>
+          <w:i/>
+        </w:rPr>
+        <w:t xml:space="preserve">p</w:t>
+      </w:r>
+      <w:r>
+        <w:t xml:space="preserve"> </w:t>
+      </w:r>
+      <w:r>
+        <w:t xml:space="preserve">= .001) and trim-and-fill (</w:t>
+      </w:r>
+      <w:r>
+        <w:rPr>
+          <w:iCs/>
+          <w:i/>
+        </w:rPr>
+        <w:t xml:space="preserve">k</w:t>
+      </w:r>
+      <w:r>
+        <w:t xml:space="preserve">₀ = 58 imputed; adjusted</w:t>
       </w:r>
       <w:r>
         <w:t xml:space="preserve"> </w:t>
@@ -13179,20 +13121,59 @@
         <w:t xml:space="preserve"> </w:t>
       </w:r>
       <w:r>
-        <w:t xml:space="preserve">= 0.249, including one outlier Pouresmaeili et al. 2018) yields an unreliable estimate; future work should search for additional Frontier-regime studies. Third, cDAI is measured at the study level using country-year World Bank Digital Adoption Index scores (primary) or ITU Digital Development Index (secondary), not direct replication of the WBES firm-level indicators used in the companion primary studies; any systematic error in the country-year DAI assignment — for instance, from vintage mismatch between the study's data period and the DAI score's reference year — may attenuate the moderation coefficient. Fourth, the systematic search was restricted to English-language publications; non-English studies (Chinese, Japanese, Korean, Southeast Asian) are underrepresented, potentially biasing regime distribution toward Advanced economies. Fifth, inter-coder reliability was assessed on a 20% double-coded subsample (</w:t>
-      </w:r>
-      <w:r>
-        <w:rPr>
-          <w:iCs/>
-          <w:i/>
-        </w:rPr>
-        <w:t xml:space="preserve">k</w:t>
-      </w:r>
-      <w:r>
-        <w:t xml:space="preserve"> </w:t>
-      </w:r>
-      <w:r>
-        <w:t xml:space="preserve">= 47 studies); single-coder extraction for the remaining 80% cannot be validated without full dual-coding.</w:t>
+        <w:t xml:space="preserve">= 0.041, 95% CI [0.030, 0.052]) indicate modest left-side asymmetry, while Egger's regression is only marginal (</w:t>
+      </w:r>
+      <w:r>
+        <w:rPr>
+          <w:iCs/>
+          <w:i/>
+        </w:rPr>
+        <w:t xml:space="preserve">p</w:t>
+      </w:r>
+      <w:r>
+        <w:t xml:space="preserve"> </w:t>
+      </w:r>
+      <w:r>
+        <w:t xml:space="preserve">= .059) — so the trim-and-fill estimate (</w:t>
+      </w:r>
+      <w:r>
+        <w:rPr>
+          <w:iCs/>
+          <w:i/>
+        </w:rPr>
+        <w:t xml:space="preserve">r̄</w:t>
+      </w:r>
+      <w:r>
+        <w:t xml:space="preserve"> </w:t>
+      </w:r>
+      <w:r>
+        <w:t xml:space="preserve">≈ 0.041) is best read as a conservative lower bound rather than evidence of a bias-dominated literature. Critically, the heterogeneity puzzle (</w:t>
+      </w:r>
+      <w:r>
+        <w:rPr>
+          <w:iCs/>
+          <w:i/>
+        </w:rPr>
+        <w:t xml:space="preserve">I</w:t>
+      </w:r>
+      <w:r>
+        <w:t xml:space="preserve">² = 65.9%) is concentrated</w:t>
+      </w:r>
+      <w:r>
+        <w:t xml:space="preserve"> </w:t>
+      </w:r>
+      <w:r>
+        <w:rPr>
+          <w:iCs/>
+          <w:i/>
+        </w:rPr>
+        <w:t xml:space="preserve">within</w:t>
+      </w:r>
+      <w:r>
+        <w:t xml:space="preserve"> </w:t>
+      </w:r>
+      <w:r>
+        <w:t xml:space="preserve">studies (Level 2, 57.1%) far more than between them (Level 3, 8.8%): unexplained variance in I→P arises chiefly from analytic choices inside primary studies rather than from cross-country institutional differences — which is precisely why study-level country and time moderators leave it unresolved.</w:t>
       </w:r>
     </w:p>
     <w:p>
@@ -13204,16 +13185,13 @@
           <w:bCs/>
           <w:b/>
         </w:rPr>
-        <w:t xml:space="preserve">Future research.</w:t>
-      </w:r>
-      <w:r>
-        <w:t xml:space="preserve"> </w:t>
-      </w:r>
-      <w:r>
-        <w:t xml:space="preserve">Three directions follow directly from the findings. First, a formal search targeting Frontier and SIDS economy I→P studies (targeted search strings, Appendix B) would expand the Frontier cell from</w:t>
-      </w:r>
-      <w:r>
-        <w:t xml:space="preserve"> </w:t>
+        <w:t xml:space="preserve">Limitations.</w:t>
+      </w:r>
+      <w:r>
+        <w:t xml:space="preserve"> </w:t>
+      </w:r>
+      <w:r>
+        <w:t xml:space="preserve">Five inferential constraints bound these conclusions. First, the moderator hypotheses are not confirmed; for cDAI and DPL this reflects genuine null between-group differences, while for ICRV the only non-flat cell (Frontier) is too sparse (</w:t>
       </w:r>
       <w:r>
         <w:rPr>
@@ -13226,23 +13204,99 @@
         <w:t xml:space="preserve"> </w:t>
       </w:r>
       <w:r>
-        <w:t xml:space="preserve">= 4 to potentially 20–40 effects, enabling a meaningful test of the only regime that currently deviates. Second — and most important given the variance decomposition — future syntheses should code and test</w:t>
-      </w:r>
-      <w:r>
-        <w:t xml:space="preserve"> </w:t>
-      </w:r>
+        <w:t xml:space="preserve">= 4) for reliable inference. A formal search targeting Frontier and SIDS contexts is required before the ICRV result can be interpreted as definitive. Second, the Frontier-group anomaly (</w:t>
+      </w:r>
+      <w:r>
+        <w:rPr>
+          <w:iCs/>
+          <w:i/>
+        </w:rPr>
+        <w:t xml:space="preserve">K</w:t>
+      </w:r>
+      <w:r>
+        <w:t xml:space="preserve"> </w:t>
+      </w:r>
+      <w:r>
+        <w:t xml:space="preserve">= 4,</w:t>
+      </w:r>
+      <w:r>
+        <w:t xml:space="preserve"> </w:t>
+      </w:r>
+      <w:r>
+        <w:rPr>
+          <w:iCs/>
+          <w:i/>
+        </w:rPr>
+        <w:t xml:space="preserve">r̄</w:t>
+      </w:r>
+      <w:r>
+        <w:t xml:space="preserve"> </w:t>
+      </w:r>
+      <w:r>
+        <w:t xml:space="preserve">= 0.249, including one outlier Pouresmaeili et al. 2018) yields an unreliable estimate; future work should search for additional Frontier-regime studies. Third, cDAI is measured at the study level using country-year World Bank Digital Adoption Index scores (primary) or ITU Digital Development Index (secondary), not direct replication of the WBES firm-level indicators used in the companion primary studies; any systematic error in the country-year DAI assignment — for instance, from vintage mismatch between the study's data period and the DAI score's reference year — may attenuate the moderation coefficient. Fourth, the systematic search was restricted to English-language publications; non-English studies (Chinese, Japanese, Korean, Southeast Asian) are underrepresented, potentially biasing regime distribution toward Advanced economies. Fifth, inter-coder reliability was assessed on a 20% double-coded subsample (</w:t>
+      </w:r>
+      <w:r>
+        <w:rPr>
+          <w:iCs/>
+          <w:i/>
+        </w:rPr>
+        <w:t xml:space="preserve">k</w:t>
+      </w:r>
+      <w:r>
+        <w:t xml:space="preserve"> </w:t>
+      </w:r>
+      <w:r>
+        <w:t xml:space="preserve">= 47 studies); single-coder extraction for the remaining 80% cannot be validated without full dual-coding.</w:t>
+      </w:r>
+    </w:p>
+    <w:p>
+      <w:pPr>
+        <w:pStyle w:val="BodyText"/>
+      </w:pPr>
       <w:r>
         <w:rPr>
           <w:bCs/>
           <w:b/>
         </w:rPr>
+        <w:t xml:space="preserve">Future research.</w:t>
+      </w:r>
+      <w:r>
+        <w:t xml:space="preserve"> </w:t>
+      </w:r>
+      <w:r>
+        <w:t xml:space="preserve">Three directions follow directly from the findings. First, a formal search targeting Frontier and SIDS economy I→P studies (targeted search strings, Appendix B) would expand the Frontier cell from</w:t>
+      </w:r>
+      <w:r>
+        <w:t xml:space="preserve"> </w:t>
+      </w:r>
+      <w:r>
+        <w:rPr>
+          <w:iCs/>
+          <w:i/>
+        </w:rPr>
+        <w:t xml:space="preserve">K</w:t>
+      </w:r>
+      <w:r>
+        <w:t xml:space="preserve"> </w:t>
+      </w:r>
+      <w:r>
+        <w:t xml:space="preserve">= 4 to potentially 20–40 effects, enabling a meaningful test of the only regime that currently deviates. Second — and most important given the variance decomposition — future syntheses should code and test</w:t>
+      </w:r>
+      <w:r>
+        <w:t xml:space="preserve"> </w:t>
+      </w:r>
+      <w:r>
+        <w:rPr>
+          <w:bCs/>
+          <w:b/>
+        </w:rPr>
         <w:t xml:space="preserve">within-study</w:t>
       </w:r>
       <w:r>
         <w:t xml:space="preserve"> </w:t>
       </w:r>
       <w:r>
-        <w:t xml:space="preserve">analytic moderators (DOI operationalization, performance metric, estimator family, sample window), since 56.6% of heterogeneity is within-study and country-level moderators are structurally unable to resolve it. Third, the mixed publication-bias signal (</w:t>
+        <w:t xml:space="preserve">analytic moderators (DOI operationalization, performance metric, estimator family, sample window), since 57.1% of heterogeneity is within-study and country-level moderators are structurally unable to resolve it. Third, the mixed publication-bias signal (</w:t>
       </w:r>
       <w:r>
         <w:rPr>
@@ -13268,7 +13322,7 @@
         <w:t xml:space="preserve"> </w:t>
       </w:r>
       <w:r>
-        <w:t xml:space="preserve">= 0.040; Begg significant but Egger marginal) motivates a dedicated bias audit — surveying I→P researchers about unpublished null results and meta-analysing grey literature and dissertations — to bound the population effect more precisely than trim-and-fill alone.</w:t>
+        <w:t xml:space="preserve">= 0.041; Begg significant but Egger marginal) motivates a dedicated bias audit — surveying I→P researchers about unpublished null results and meta-analysing grey literature and dissertations — to bound the population effect more precisely than trim-and-fill alone.</w:t>
       </w:r>
     </w:p>
     <w:p>
@@ -15540,7 +15594,7 @@
         <w:rPr>
           <w:rStyle w:val="VerbatimChar"/>
         </w:rPr>
-        <w:t xml:space="preserve">Studies included in meta-analysis:   k = 280 (prior DB: k = 238; updated 24/05/2026)</w:t>
+        <w:t xml:space="preserve">Studies included in meta-analysis:   k = 278 (prior DB: k = 238; updated 24/05/2026)</w:t>
       </w:r>
       <w:r>
         <w:br/>
@@ -15549,7 +15603,7 @@
         <w:rPr>
           <w:rStyle w:val="VerbatimChar"/>
         </w:rPr>
-        <w:t xml:space="preserve">Effect sizes coded:                  K = 330 (prior DB: K = 288; updated 24/05/2026)</w:t>
+        <w:t xml:space="preserve">Effect sizes coded:                  K = 328 (prior DB: K = 288; updated 24/05/2026)</w:t>
       </w:r>
       <w:r>
         <w:br/>
@@ -15561,7 +15615,7 @@
         <w:rPr>
           <w:rStyle w:val="VerbatimChar"/>
         </w:rPr>
-        <w:t xml:space="preserve">Note: k=280 / K=330 reflects the current analytic database (p6_study_database_v2.csv).</w:t>
+        <w:t xml:space="preserve">Note: k=278 / K=328 reflects the current analytic database (p6_study_database_v2.csv).</w:t>
       </w:r>
       <w:r>
         <w:br/>
@@ -16005,7 +16059,7 @@
               <w:jc w:val="left"/>
             </w:pPr>
             <w:r>
-              <w:t xml:space="preserve">Three-level REML (3-level, k=280)</w:t>
+              <w:t xml:space="preserve">Three-level REML (3-level, k=278)</w:t>
             </w:r>
           </w:p>
         </w:tc>
@@ -16053,7 +16107,7 @@
               <w:jc w:val="left"/>
             </w:pPr>
             <w:r>
-              <w:t xml:space="preserve">0.075</w:t>
+              <w:t xml:space="preserve">0.076</w:t>
             </w:r>
           </w:p>
         </w:tc>
@@ -16091,7 +16145,7 @@
               <w:jc w:val="left"/>
             </w:pPr>
             <w:r>
-              <w:t xml:space="preserve">[0.062, 0.089]</w:t>
+              <w:t xml:space="preserve">[0.063, 0.089]</w:t>
             </w:r>
           </w:p>
         </w:tc>
@@ -16136,7 +16190,7 @@
               <w:jc w:val="left"/>
             </w:pPr>
             <w:r>
-              <w:t xml:space="preserve">65.5%</w:t>
+              <w:t xml:space="preserve">65.9%</w:t>
             </w:r>
           </w:p>
         </w:tc>
@@ -16181,7 +16235,7 @@
               <w:jc w:val="left"/>
             </w:pPr>
             <w:r>
-              <w:t xml:space="preserve">56.6%</w:t>
+              <w:t xml:space="preserve">57.1%</w:t>
             </w:r>
           </w:p>
         </w:tc>
@@ -16226,7 +16280,7 @@
               <w:jc w:val="left"/>
             </w:pPr>
             <w:r>
-              <w:t xml:space="preserve">8.9%</w:t>
+              <w:t xml:space="preserve">8.8%</w:t>
             </w:r>
           </w:p>
         </w:tc>
@@ -16274,7 +16328,7 @@
               <w:jc w:val="left"/>
             </w:pPr>
             <w:r>
-              <w:t xml:space="preserve">280</w:t>
+              <w:t xml:space="preserve">278</w:t>
             </w:r>
           </w:p>
         </w:tc>
@@ -16322,7 +16376,7 @@
               <w:jc w:val="left"/>
             </w:pPr>
             <w:r>
-              <w:t xml:space="preserve">330</w:t>
+              <w:t xml:space="preserve">328</w:t>
             </w:r>
           </w:p>
         </w:tc>
@@ -16360,7 +16414,7 @@
               <w:jc w:val="left"/>
             </w:pPr>
             <w:r>
-              <w:t xml:space="preserve">0.00937</w:t>
+              <w:t xml:space="preserve">0.00888</w:t>
             </w:r>
           </w:p>
         </w:tc>
@@ -16398,7 +16452,7 @@
               <w:jc w:val="left"/>
             </w:pPr>
             <w:r>
-              <w:t xml:space="preserve">0.00147</w:t>
+              <w:t xml:space="preserve">0.00137</w:t>
             </w:r>
           </w:p>
         </w:tc>
@@ -16457,7 +16511,7 @@
         <w:t xml:space="preserve"> </w:t>
       </w:r>
       <w:r>
-        <w:t xml:space="preserve">Lower total I² in the three-level model (65.5% vs. 87.92%) reflects the expanded</w:t>
+        <w:t xml:space="preserve">Lower total I² in the three-level model (65.9% vs. 87.92%) reflects the expanded</w:t>
       </w:r>
       <w:r>
         <w:t xml:space="preserve"> </w:t>
@@ -16473,7 +16527,7 @@
         <w:t xml:space="preserve"> </w:t>
       </w:r>
       <w:r>
-        <w:t xml:space="preserve">= 280 sample and the three-level structure that partitions variance across levels correctly. The decomposition shows that within-study variance (I²_(2) = 56.6%) dominates between-study variance (I²_(3) = 8.9%). The narrower 95% CI reflects the precision gain from 280 vs. 113 studies. The three-level model is theoretically preferred as it accounts for multiple effect sizes nested within studies.</w:t>
+        <w:t xml:space="preserve">= 278 sample and the three-level structure that partitions variance across levels correctly. The decomposition shows that within-study variance (I²_(2) = 57.1%) dominates between-study variance (I²_(3) = 8.8%). The narrower 95% CI reflects the precision gain from 278 vs. 113 studies. The three-level model is theoretically preferred as it accounts for multiple effect sizes nested within studies.</w:t>
       </w:r>
     </w:p>
     <w:p>

</xml_diff>

<commit_message>
docs(p6): reframe H1/ICRV as marginally significant at 10% (p=.051), not 'not supported'
p=.051 is significant at the 10% level (just short of 5%). Recast H1
across EN + VI manuscripts and rebuilt DOCX: 'marginally supported
(significant at alpha=.10, not .05)', still driven by the sparse Frontier
cell so E1a/E1b (monotone gradient) remain unsupported.
</commit_message>
<xml_diff>
--- a/p6/submission/ibr_package/01_manuscript_blinded.docx
+++ b/p6/submission/ibr_package/01_manuscript_blinded.docx
@@ -200,7 +200,7 @@
         <w:t xml:space="preserve"> </w:t>
       </w:r>
       <w:r>
-        <w:t xml:space="preserve">= 113). The three hypothesized moderators show limited support: ICRV regime differences fall just short of significance (</w:t>
+        <w:t xml:space="preserve">= 113). The three hypothesized moderators show limited support: ICRV regime differences are marginally significant (</w:t>
       </w:r>
       <w:r>
         <w:rPr>
@@ -242,7 +242,7 @@
         <w:t xml:space="preserve"> </w:t>
       </w:r>
       <w:r>
-        <w:t xml:space="preserve">= .051) and, where present, are driven by a small, high-effect Frontier cell (</w:t>
+        <w:t xml:space="preserve">= .051 — significant at the 10% but not the 5% level) and are driven by a small, high-effect Frontier cell (</w:t>
       </w:r>
       <w:r>
         <w:rPr>
@@ -413,10 +413,7 @@
         <w:t xml:space="preserve"> </w:t>
       </w:r>
       <w:r>
-        <w:t xml:space="preserve">= 278 studies from economies worldwide, and the first to formally test ICRV, cDAI, and DPL phase as moderators. None of the three hypothesised moderators is confirmed (ICRV</w:t>
-      </w:r>
-      <w:r>
-        <w:t xml:space="preserve"> </w:t>
+        <w:t xml:space="preserve">= 278 studies from economies worldwide, and the first to formally test ICRV, cDAI, and DPL phase as moderators. Of the three hypothesised moderators only ICRV is marginally significant (</w:t>
       </w:r>
       <w:r>
         <w:rPr>
@@ -442,7 +439,7 @@
         <w:t xml:space="preserve"> </w:t>
       </w:r>
       <w:r>
-        <w:t xml:space="preserve">= .051, marginal; cDAI and DPL clearly null), and the directional gradient (E1a/E1b) is not supported — a pattern that, combined with the dominance of within-study heterogeneity and modest publication bias, reframes the heterogeneity puzzle: unexplained variance in I→P arises chiefly from analytic choices</w:t>
+        <w:t xml:space="preserve">= .051; significant at α = .10, not α = .05), while cDAI and DPL are clearly null; the directional gradient (E1a/E1b) is not supported — a pattern that, combined with the dominance of within-study heterogeneity and modest publication bias, reframes the heterogeneity puzzle: unexplained variance in I→P arises chiefly from analytic choices</w:t>
       </w:r>
       <w:r>
         <w:t xml:space="preserve"> </w:t>
@@ -847,7 +844,7 @@
         <w:t xml:space="preserve"> </w:t>
       </w:r>
       <w:r>
-        <w:t xml:space="preserve">= 113), confirming a small but consistent positive I→P relationship globally. H1 (between-regime Q_M test) is</w:t>
+        <w:t xml:space="preserve">= 113), confirming a small but consistent positive I→P relationship globally. H1 (between-regime Q_M test) receives</w:t>
       </w:r>
       <w:r>
         <w:t xml:space="preserve"> </w:t>
@@ -857,13 +854,13 @@
           <w:bCs/>
           <w:b/>
         </w:rPr>
-        <w:t xml:space="preserve">not</w:t>
-      </w:r>
-      <w:r>
-        <w:t xml:space="preserve"> </w:t>
-      </w:r>
-      <w:r>
-        <w:t xml:space="preserve">confirmed — the omnibus is marginal (</w:t>
+        <w:t xml:space="preserve">marginal</w:t>
+      </w:r>
+      <w:r>
+        <w:t xml:space="preserve"> </w:t>
+      </w:r>
+      <w:r>
+        <w:t xml:space="preserve">support — the omnibus is significant at the 10% level (</w:t>
       </w:r>
       <w:r>
         <w:rPr>
@@ -889,7 +886,7 @@
         <w:t xml:space="preserve"> </w:t>
       </w:r>
       <w:r>
-        <w:t xml:space="preserve">= .051) and, where non-trivial, is driven by a small, high-effect Frontier cell (</w:t>
+        <w:t xml:space="preserve">= .051) but not at the conventional 5% threshold, and is driven by a small, high-effect Frontier cell (</w:t>
       </w:r>
       <w:r>
         <w:rPr>
@@ -902,7 +899,7 @@
         <w:t xml:space="preserve"> </w:t>
       </w:r>
       <w:r>
-        <w:t xml:space="preserve">= 4) rather than a monotone institutional gradient; the directional Exploratory Propositions E1a/E1b are likewise unsupported. cDAI (</w:t>
+        <w:t xml:space="preserve">= 4) rather than a monotone institutional gradient; the directional Exploratory Propositions E1a/E1b are not supported. cDAI (</w:t>
       </w:r>
       <w:r>
         <w:rPr>
@@ -2007,7 +2004,7 @@
         <w:t xml:space="preserve"> </w:t>
       </w:r>
       <w:r>
-        <w:t xml:space="preserve">Solid arrows represent the primary meta-analytic effect (baseline I→P pooled effect, k = 278 studies, K = 328 effects, r̄ = 0.076, 95% CI [0.063, 0.089]). Dashed arrows represent hypothesised moderating relationships. Three study-level constructs were tested as moderators: (1) ICRV Regime (H1) — hypothesised between-regime Q_M statistically significant; H1 not supported (Q_M = 9.46, p = .051, marginal); directional Exploratory Propositions E1a/E1b not supported (any departure is driven by a sparse Frontier cell, K = 4). (2) cDAI — Country Digital Adoption Index (H3) — hypothesised positive amplification [High &gt; Low]; actual Q_M = 0.23 (p = .893), H3 not supported. (3) DPL Phase (H2) — hypothesised Follow &gt; Precede; actual Q_M = 0.47 (p = .789), H2 not supported. The three-level model nests K = 328 effects within k = 278 studies; the within-study level dominates the variance (σ²_(2) = 0.00888, I²_(2) = 57.1%) relative to the between-study level (σ²_(3) = 0.00137, I²_(3) = 8.8%); total I² = 65.9%. Publication bias (H4 partial): Begg's τ = −0.119 (p = .001) and trim-and-fill (k₀ = 58 imputed, adjusted r = 0.041) indicate asymmetry, while Egger's regression is marginal (b = 0.434, p = .059); fail-safe N = 81,712. Abbreviations: ICRV = Innovation–Capability–Resource–Vulnerability; cDAI = country-level Digital Adoption Index; DPL = Digital Paradox Lifecycle; MARA = Meta-Analytic Regression Analysis. Target journal:</w:t>
+        <w:t xml:space="preserve">Solid arrows represent the primary meta-analytic effect (baseline I→P pooled effect, k = 278 studies, K = 328 effects, r̄ = 0.076, 95% CI [0.063, 0.089]). Dashed arrows represent hypothesised moderating relationships. Three study-level constructs were tested as moderators: (1) ICRV Regime (H1) — hypothesised between-regime Q_M statistically significant; H1 marginally supported (Q_M = 9.46, p = .051; significant at the 10% but not 5% level); directional Exploratory Propositions E1a/E1b not supported (any departure is driven by a sparse Frontier cell, K = 4). (2) cDAI — Country Digital Adoption Index (H3) — hypothesised positive amplification [High &gt; Low]; actual Q_M = 0.23 (p = .893), H3 not supported. (3) DPL Phase (H2) — hypothesised Follow &gt; Precede; actual Q_M = 0.47 (p = .789), H2 not supported. The three-level model nests K = 328 effects within k = 278 studies; the within-study level dominates the variance (σ²_(2) = 0.00888, I²_(2) = 57.1%) relative to the between-study level (σ²_(3) = 0.00137, I²_(3) = 8.8%); total I² = 65.9%. Publication bias (H4 partial): Begg's τ = −0.119 (p = .001) and trim-and-fill (k₀ = 58 imputed, adjusted r = 0.041) indicate asymmetry, while Egger's regression is marginal (b = 0.434, p = .059); fail-safe N = 81,712. Abbreviations: ICRV = Innovation–Capability–Resource–Vulnerability; cDAI = country-level Digital Adoption Index; DPL = Digital Paradox Lifecycle; MARA = Meta-Analytic Regression Analysis. Target journal:</w:t>
       </w:r>
       <w:r>
         <w:t xml:space="preserve"> </w:t>
@@ -8895,13 +8892,13 @@
           <w:bCs/>
           <w:b/>
         </w:rPr>
-        <w:t xml:space="preserve">not supported</w:t>
-      </w:r>
-      <w:r>
-        <w:t xml:space="preserve"> </w:t>
-      </w:r>
-      <w:r>
-        <w:t xml:space="preserve">— the omnibus between-regime moderation test falls just short of the conventional threshold, and the small departure that exists is generated by a sparse, high-effect Frontier cell rather than by a monotone advanced-to-emerging gradient. Exploratory Propositions E1a (Advanced largest) and E1b (Frontier smallest) are correspondingly</w:t>
+        <w:t xml:space="preserve">marginally supported</w:t>
+      </w:r>
+      <w:r>
+        <w:t xml:space="preserve"> </w:t>
+      </w:r>
+      <w:r>
+        <w:t xml:space="preserve">— the omnibus between-regime moderation test is significant at the 10% level but not at the conventional 5% threshold, and the departure it captures is generated by a sparse, high-effect Frontier cell rather than by a monotone advanced-to-emerging gradient. Exploratory Propositions E1a (Advanced largest) and E1b (Frontier smallest) are therefore</w:t>
       </w:r>
       <w:r>
         <w:t xml:space="preserve"> </w:t>
@@ -9603,7 +9600,7 @@
         <w:t xml:space="preserve"> </w:t>
       </w:r>
       <w:r>
-        <w:t xml:space="preserve">= 4 effects and is therefore statistically fragile and contrary to E1b's predicted Frontier floor. H1 (between-regime heterogeneity) is not supported at the .05 threshold, and the only non-trivial departure is a small-sample Frontier spike rather than an institutional-quality gradient, and the regime-specific propositions require larger</w:t>
+        <w:t xml:space="preserve">= 4 effects and is therefore statistically fragile and contrary to E1b's predicted Frontier floor. H1 (between-regime heterogeneity) is marginally supported (significant at the 10% but not the 5% level), and the only non-trivial departure is a small-sample Frontier spike rather than an institutional-quality gradient, and the regime-specific propositions require larger</w:t>
       </w:r>
       <w:r>
         <w:t xml:space="preserve"> </w:t>
@@ -12194,13 +12191,13 @@
           <w:bCs/>
           <w:b/>
         </w:rPr>
-        <w:t xml:space="preserve">not</w:t>
-      </w:r>
-      <w:r>
-        <w:t xml:space="preserve"> </w:t>
-      </w:r>
-      <w:r>
-        <w:t xml:space="preserve">supported — the ICRV between-regime omnibus test is marginal (</w:t>
+        <w:t xml:space="preserve">marginally</w:t>
+      </w:r>
+      <w:r>
+        <w:t xml:space="preserve"> </w:t>
+      </w:r>
+      <w:r>
+        <w:t xml:space="preserve">supported — the ICRV between-regime omnibus test is significant at the 10% level (</w:t>
       </w:r>
       <w:r>
         <w:rPr>
@@ -12226,7 +12223,7 @@
         <w:t xml:space="preserve"> </w:t>
       </w:r>
       <w:r>
-        <w:t xml:space="preserve">= .051) and does not clear the conventional threshold. The only non-trivial departure comes from the sparse, high-effect Frontier cell (</w:t>
+        <w:t xml:space="preserve">= .051) but does not clear the conventional 5% threshold. The only non-trivial departure comes from the sparse, high-effect Frontier cell (</w:t>
       </w:r>
       <w:r>
         <w:rPr>
@@ -12417,7 +12414,7 @@
         <w:t xml:space="preserve"> </w:t>
       </w:r>
       <w:r>
-        <w:t xml:space="preserve">This paper is the first to formally test ICRV institutional regime, national digital adoption (cDAI), and Digital Paradox Lifecycle phase as moderators in a three-level MARA. None of the three moderators is confirmed: the ICRV omnibus is marginal (</w:t>
+        <w:t xml:space="preserve">This paper is the first to formally test ICRV institutional regime, national digital adoption (cDAI), and Digital Paradox Lifecycle phase as moderators in a three-level MARA. Only ICRV reaches marginal significance (</w:t>
       </w:r>
       <w:r>
         <w:rPr>
@@ -12443,7 +12440,7 @@
         <w:t xml:space="preserve"> </w:t>
       </w:r>
       <w:r>
-        <w:t xml:space="preserve">= .051) and driven by a sparse Frontier cell rather than an institutional gradient, while cDAI and DPL are clearly null. These results set theoretically informative bounds: even with three well-populated single-country regimes (Advanced</w:t>
+        <w:t xml:space="preserve">= .051; significant at α = .10, not α = .05), and even then it is driven by a sparse Frontier cell rather than an institutional gradient, while cDAI and DPL are clearly null. These results set theoretically informative bounds: even with three well-populated single-country regimes (Advanced</w:t>
       </w:r>
       <w:r>
         <w:t xml:space="preserve"> </w:t>
@@ -12968,13 +12965,13 @@
           <w:bCs/>
           <w:b/>
         </w:rPr>
-        <w:t xml:space="preserve">not</w:t>
-      </w:r>
-      <w:r>
-        <w:t xml:space="preserve"> </w:t>
-      </w:r>
-      <w:r>
-        <w:t xml:space="preserve">supported — the omnibus is marginal (</w:t>
+        <w:t xml:space="preserve">marginally</w:t>
+      </w:r>
+      <w:r>
+        <w:t xml:space="preserve"> </w:t>
+      </w:r>
+      <w:r>
+        <w:t xml:space="preserve">supported — the omnibus is significant at the 10% level (</w:t>
       </w:r>
       <w:r>
         <w:rPr>
@@ -13000,7 +12997,7 @@
         <w:t xml:space="preserve"> </w:t>
       </w:r>
       <w:r>
-        <w:t xml:space="preserve">= .051) and does not clear the .05 threshold; any departure is generated by a sparse Frontier cell (</w:t>
+        <w:t xml:space="preserve">= .051) but not at the conventional 5%; the departure it captures is generated by a sparse Frontier cell (</w:t>
       </w:r>
       <w:r>
         <w:rPr>

</xml_diff>

<commit_message>
docs(p6): add 'Theoretical positioning' framing to Discussion (EN+VI)
Open §5.2 with a positioning paragraph: P6 reframes the I->P agenda from
hunting country-level contingencies to disciplining within-study
measurement/specification, since heterogeneity is within-study (57.1%)
and the country/time moderators (ICRV marginal, cDAI/DPL null) do not
explain it. Rebuilt blinded DOCX.
</commit_message>
<xml_diff>
--- a/p6/submission/ibr_package/01_manuscript_blinded.docx
+++ b/p6/submission/ibr_package/01_manuscript_blinded.docx
@@ -12284,6 +12284,120 @@
     <w:p>
       <w:pPr>
         <w:pStyle w:val="FirstParagraph"/>
+      </w:pPr>
+      <w:r>
+        <w:rPr>
+          <w:bCs/>
+          <w:b/>
+        </w:rPr>
+        <w:t xml:space="preserve">Theoretical positioning.</w:t>
+      </w:r>
+      <w:r>
+        <w:t xml:space="preserve"> </w:t>
+      </w:r>
+      <w:r>
+        <w:t xml:space="preserve">The cumulative pattern of results repositions the central question of the I→P literature. For four decades, six prior meta-analyses, and the dominant contextual-contingency research programme, the field has treated persistent heterogeneity in the internationalization–performance link as a problem to be solved by locating the</w:t>
+      </w:r>
+      <w:r>
+        <w:t xml:space="preserve"> </w:t>
+      </w:r>
+      <w:r>
+        <w:rPr>
+          <w:iCs/>
+          <w:i/>
+        </w:rPr>
+        <w:t xml:space="preserve">right country-level contingency</w:t>
+      </w:r>
+      <w:r>
+        <w:t xml:space="preserve"> </w:t>
+      </w:r>
+      <w:r>
+        <w:t xml:space="preserve">— home-country institutions, cultural and institutional distance, regional configuration, and most recently digital infrastructure. P6 inverts this premise. The three-level decomposition shows that the bulk of unexplained variance is lodged</w:t>
+      </w:r>
+      <w:r>
+        <w:t xml:space="preserve"> </w:t>
+      </w:r>
+      <w:r>
+        <w:rPr>
+          <w:iCs/>
+          <w:i/>
+        </w:rPr>
+        <w:t xml:space="preserve">within</w:t>
+      </w:r>
+      <w:r>
+        <w:t xml:space="preserve"> </w:t>
+      </w:r>
+      <w:r>
+        <w:t xml:space="preserve">primary studies (Level 2 = 57.1%) rather than</w:t>
+      </w:r>
+      <w:r>
+        <w:t xml:space="preserve"> </w:t>
+      </w:r>
+      <w:r>
+        <w:rPr>
+          <w:iCs/>
+          <w:i/>
+        </w:rPr>
+        <w:t xml:space="preserve">between</w:t>
+      </w:r>
+      <w:r>
+        <w:t xml:space="preserve"> </w:t>
+      </w:r>
+      <w:r>
+        <w:t xml:space="preserve">them (Level 3 = 8.8%), and the three theoretically motivated country/time moderators (ICRV, cDAI, DPL) collectively fail to account for it — ICRV only marginally (significant at the 10% but not the 5% level, and driven by a four-effect Frontier cell), cDAI and DPL not at all. The implication is structural rather than incremental: continuing to append country-level moderators is unlikely to resolve a heterogeneity that originates in how primary studies</w:t>
+      </w:r>
+      <w:r>
+        <w:t xml:space="preserve"> </w:t>
+      </w:r>
+      <w:r>
+        <w:rPr>
+          <w:iCs/>
+          <w:i/>
+        </w:rPr>
+        <w:t xml:space="preserve">operationalize</w:t>
+      </w:r>
+      <w:r>
+        <w:t xml:space="preserve"> </w:t>
+      </w:r>
+      <w:r>
+        <w:t xml:space="preserve">internationalization and performance,</w:t>
+      </w:r>
+      <w:r>
+        <w:t xml:space="preserve"> </w:t>
+      </w:r>
+      <w:r>
+        <w:rPr>
+          <w:iCs/>
+          <w:i/>
+        </w:rPr>
+        <w:t xml:space="preserve">specify</w:t>
+      </w:r>
+      <w:r>
+        <w:t xml:space="preserve"> </w:t>
+      </w:r>
+      <w:r>
+        <w:t xml:space="preserve">functional form, and</w:t>
+      </w:r>
+      <w:r>
+        <w:t xml:space="preserve"> </w:t>
+      </w:r>
+      <w:r>
+        <w:rPr>
+          <w:iCs/>
+          <w:i/>
+        </w:rPr>
+        <w:t xml:space="preserve">bound</w:t>
+      </w:r>
+      <w:r>
+        <w:t xml:space="preserve"> </w:t>
+      </w:r>
+      <w:r>
+        <w:t xml:space="preserve">their samples. The productive frontier for I→P theory is therefore less about "where" internationalization pays off and more about disciplining the measurement and modelling choices through which the effect is estimated — a shift from a context-contingency agenda to a measurement-and-specification agenda.</w:t>
+      </w:r>
+    </w:p>
+    <w:p>
+      <w:pPr>
+        <w:pStyle w:val="BodyText"/>
       </w:pPr>
       <w:r>
         <w:rPr>

</xml_diff>